<commit_message>
Proje tasarımında değişiklikler yapıldı. Tasarım katmanlarında Controller sınıflarından bahsedildi. İlk sprintte implement edilecek classların class diagramları yüklendi.
</commit_message>
<xml_diff>
--- a/docs/Design Document.docx
+++ b/docs/Design Document.docx
@@ -1,6 +1,6 @@
 
 <file path=word/document.xml><?xml version="1.0" encoding="utf-8"?>
-<w:document xmlns:wpc="http://schemas.microsoft.com/office/word/2010/wordprocessingCanvas" xmlns:cx="http://schemas.microsoft.com/office/drawing/2014/chartex" xmlns:cx1="http://schemas.microsoft.com/office/drawing/2015/9/8/chartex" xmlns:cx2="http://schemas.microsoft.com/office/drawing/2015/10/21/chartex" xmlns:cx3="http://schemas.microsoft.com/office/drawing/2016/5/9/chartex" xmlns:cx4="http://schemas.microsoft.com/office/drawing/2016/5/10/chartex" xmlns:cx5="http://schemas.microsoft.com/office/drawing/2016/5/11/chartex" xmlns:cx6="http://schemas.microsoft.com/office/drawing/2016/5/12/chartex" xmlns:cx7="http://schemas.microsoft.com/office/drawing/2016/5/13/chartex" xmlns:cx8="http://schemas.microsoft.com/office/drawing/2016/5/14/chartex" xmlns:mc="http://schemas.openxmlformats.org/markup-compatibility/2006" xmlns:aink="http://schemas.microsoft.com/office/drawing/2016/ink" xmlns:am3d="http://schemas.microsoft.com/office/drawing/2017/model3d" xmlns:o="urn:schemas-microsoft-com:office:office" xmlns:oel="http://schemas.microsoft.com/office/2019/extlst" xmlns:r="http://schemas.openxmlformats.org/officeDocument/2006/relationships" xmlns:m="http://schemas.openxmlformats.org/officeDocument/2006/math" xmlns:v="urn:schemas-microsoft-com:vml" xmlns:wp14="http://schemas.microsoft.com/office/word/2010/wordprocessingDrawing" xmlns:wp="http://schemas.openxmlformats.org/drawingml/2006/wordprocessingDrawing" xmlns:w10="urn:schemas-microsoft-com:office:word" xmlns:w="http://schemas.openxmlformats.org/wordprocessingml/2006/main" xmlns:w14="http://schemas.microsoft.com/office/word/2010/wordml" xmlns:w15="http://schemas.microsoft.com/office/word/2012/wordml" xmlns:w16cex="http://schemas.microsoft.com/office/word/2018/wordml/cex" xmlns:w16cid="http://schemas.microsoft.com/office/word/2016/wordml/cid" xmlns:w16="http://schemas.microsoft.com/office/word/2018/wordml" xmlns:w16du="http://schemas.microsoft.com/office/word/2023/wordml/word16du" xmlns:w16sdtdh="http://schemas.microsoft.com/office/word/2020/wordml/sdtdatahash" xmlns:w16sdtfl="http://schemas.microsoft.com/office/word/2024/wordml/sdtformatlock" xmlns:w16se="http://schemas.microsoft.com/office/word/2015/wordml/symex" xmlns:wpg="http://schemas.microsoft.com/office/word/2010/wordprocessingGroup" xmlns:wpi="http://schemas.microsoft.com/office/word/2010/wordprocessingInk" xmlns:wne="http://schemas.microsoft.com/office/word/2006/wordml" xmlns:wps="http://schemas.microsoft.com/office/word/2010/wordprocessingShape" mc:Ignorable="w14 w15 w16se w16cid w16 w16cex w16sdtdh w16sdtfl w16du wp14">
+<w:document xmlns:wpc="http://schemas.microsoft.com/office/word/2010/wordprocessingCanvas" xmlns:cx="http://schemas.microsoft.com/office/drawing/2014/chartex" xmlns:cx1="http://schemas.microsoft.com/office/drawing/2015/9/8/chartex" xmlns:cx2="http://schemas.microsoft.com/office/drawing/2015/10/21/chartex" xmlns:cx3="http://schemas.microsoft.com/office/drawing/2016/5/9/chartex" xmlns:cx4="http://schemas.microsoft.com/office/drawing/2016/5/10/chartex" xmlns:cx5="http://schemas.microsoft.com/office/drawing/2016/5/11/chartex" xmlns:cx6="http://schemas.microsoft.com/office/drawing/2016/5/12/chartex" xmlns:cx7="http://schemas.microsoft.com/office/drawing/2016/5/13/chartex" xmlns:cx8="http://schemas.microsoft.com/office/drawing/2016/5/14/chartex" xmlns:mc="http://schemas.openxmlformats.org/markup-compatibility/2006" xmlns:aink="http://schemas.microsoft.com/office/drawing/2016/ink" xmlns:am3d="http://schemas.microsoft.com/office/drawing/2017/model3d" xmlns:o="urn:schemas-microsoft-com:office:office" xmlns:oel="http://schemas.microsoft.com/office/2019/extlst" xmlns:r="http://schemas.openxmlformats.org/officeDocument/2006/relationships" xmlns:m="http://schemas.openxmlformats.org/officeDocument/2006/math" xmlns:v="urn:schemas-microsoft-com:vml" xmlns:wp14="http://schemas.microsoft.com/office/word/2010/wordprocessingDrawing" xmlns:wp="http://schemas.openxmlformats.org/drawingml/2006/wordprocessingDrawing" xmlns:w10="urn:schemas-microsoft-com:office:word" xmlns:w="http://schemas.openxmlformats.org/wordprocessingml/2006/main" xmlns:w14="http://schemas.microsoft.com/office/word/2010/wordml" xmlns:w15="http://schemas.microsoft.com/office/word/2012/wordml" xmlns:w16cex="http://schemas.microsoft.com/office/word/2018/wordml/cex" xmlns:w16cid="http://schemas.microsoft.com/office/word/2016/wordml/cid" xmlns:w16="http://schemas.microsoft.com/office/word/2018/wordml" xmlns:w16sdtdh="http://schemas.microsoft.com/office/word/2020/wordml/sdtdatahash" xmlns:w16se="http://schemas.microsoft.com/office/word/2015/wordml/symex" xmlns:wpg="http://schemas.microsoft.com/office/word/2010/wordprocessingGroup" xmlns:wpi="http://schemas.microsoft.com/office/word/2010/wordprocessingInk" xmlns:wne="http://schemas.microsoft.com/office/word/2006/wordml" xmlns:wps="http://schemas.microsoft.com/office/word/2010/wordprocessingShape" mc:Ignorable="w14 w15 w16se w16cid w16 w16cex w16sdtdh wp14">
   <w:body>
     <w:p>
       <w:pPr>
@@ -40,67 +40,27 @@
     </w:p>
     <w:p>
       <w:r>
-        <w:t xml:space="preserve">2. ÜST SEVİYE BİLEŞEN YAPISI (COMPONENT </w:t>
-      </w:r>
-      <w:proofErr w:type="gramStart"/>
-      <w:r>
-        <w:t>DIAGRAM).....................</w:t>
-      </w:r>
-      <w:proofErr w:type="gramEnd"/>
-      <w:r>
-        <w:t>2</w:t>
-      </w:r>
-    </w:p>
-    <w:p>
-      <w:r>
-        <w:t xml:space="preserve">3. BİLEŞENLER ARASI ARAYÜZLER VE PARAMETRELER (CLASS </w:t>
-      </w:r>
-      <w:proofErr w:type="gramStart"/>
-      <w:r>
-        <w:t>DIAGRAM).........</w:t>
-      </w:r>
-      <w:proofErr w:type="gramEnd"/>
-      <w:r>
-        <w:t>3</w:t>
-      </w:r>
-    </w:p>
-    <w:p>
-      <w:r>
-        <w:t xml:space="preserve">4. FONKSİYONLARIN ÇALIŞMA AKIŞI (SEQUENCE </w:t>
-      </w:r>
-      <w:proofErr w:type="gramStart"/>
-      <w:r>
-        <w:t>DIAGRAM)...................</w:t>
-      </w:r>
-      <w:proofErr w:type="gramEnd"/>
-      <w:r>
-        <w:t>4</w:t>
-      </w:r>
-    </w:p>
-    <w:p>
-      <w:r>
-        <w:t xml:space="preserve">5. SİSTEMİN DAĞITIMI (DEPLOYMENT </w:t>
-      </w:r>
-      <w:proofErr w:type="gramStart"/>
-      <w:r>
-        <w:t>DIAGRAM)............................</w:t>
-      </w:r>
-      <w:proofErr w:type="gramEnd"/>
-      <w:r>
-        <w:t>5</w:t>
-      </w:r>
-    </w:p>
-    <w:p>
-      <w:r>
-        <w:t xml:space="preserve">6. GÖREV MATRİSİ (TASK </w:t>
-      </w:r>
-      <w:proofErr w:type="gramStart"/>
-      <w:r>
-        <w:t>MATRIX).......................................</w:t>
-      </w:r>
-      <w:proofErr w:type="gramEnd"/>
-      <w:r>
-        <w:t>6</w:t>
+        <w:t>2. ÜST SEVİYE BİLEŞEN YAPISI (COMPONENT DIAGRAM).....................2</w:t>
+      </w:r>
+    </w:p>
+    <w:p>
+      <w:r>
+        <w:t>3. BİLEŞENLER ARASI ARAYÜZLER VE PARAMETRELER (CLASS DIAGRAM).........3</w:t>
+      </w:r>
+    </w:p>
+    <w:p>
+      <w:r>
+        <w:t>4. FONKSİYONLARIN ÇALIŞMA AKIŞI (SEQUENCE DIAGRAM)...................4</w:t>
+      </w:r>
+    </w:p>
+    <w:p>
+      <w:r>
+        <w:t>5. SİSTEMİN DAĞITIMI (DEPLOYMENT DIAGRAM)............................5</w:t>
+      </w:r>
+    </w:p>
+    <w:p>
+      <w:r>
+        <w:t>6. GÖREV MATRİSİ (TASK MATRIX).......................................6</w:t>
       </w:r>
     </w:p>
     <w:p/>
@@ -125,21 +85,8 @@
       <w:pPr>
         <w:ind w:firstLine="708"/>
       </w:pPr>
-      <w:proofErr w:type="spellStart"/>
-      <w:r>
-        <w:t>LibRA</w:t>
-      </w:r>
-      <w:proofErr w:type="spellEnd"/>
-      <w:r>
-        <w:t xml:space="preserve"> projesinde Katmanlı Mimari (</w:t>
-      </w:r>
-      <w:proofErr w:type="spellStart"/>
-      <w:r>
-        <w:t>Layered</w:t>
-      </w:r>
-      <w:proofErr w:type="spellEnd"/>
-      <w:r>
-        <w:t xml:space="preserve"> Architecture) tercih edilmiştir. Bu mimari, sistemin sürdürülebilirliğini artırmak, kodun yeniden kullanılabilirliğini sağlamak ve farklı sorumlulukları birbirinden net bir şekilde ayırmak amacıyla kullanılmıştır.</w:t>
+      <w:r>
+        <w:t>LibRA projesinde Katmanlı Mimari (Layered Architecture) tercih edilmiştir. Bu mimari, sistemin sürdürülebilirliğini artırmak, kodun yeniden kullanılabilirliğini sağlamak ve farklı sorumlulukları birbirinden net bir şekilde ayırmak amacıyla kullanılmıştır.</w:t>
       </w:r>
     </w:p>
     <w:p/>
@@ -152,15 +99,10 @@
         </w:numPr>
       </w:pPr>
       <w:r>
-        <w:t xml:space="preserve">Sunum Katmanı (Presentation </w:t>
-      </w:r>
-      <w:proofErr w:type="spellStart"/>
-      <w:r>
-        <w:t>Layer</w:t>
-      </w:r>
-      <w:proofErr w:type="spellEnd"/>
-      <w:r>
-        <w:t>): Kullanıcı etkileşimini yöneten katmandır. Web arayüzü (HTML/CSS/JS) bu katmanda yer alır.</w:t>
+        <w:t>Sunum Katmanı (Presentation Layer): Kullanıcı etkileşimini yöneten katmandır. Web arayüzü (HTML/CSS/JS) bu katmanda yer alır.</w:t>
+      </w:r>
+      <w:r>
+        <w:t xml:space="preserve"> Bu dosyalar kullanıcı arayüzünü oluşturur ve API’a istek gönderir. Java Sprin Boot ve JPA ile hazırlanmış Controller sınıfları da bu katmanda yer alır. Arayüzden gelen istekleri karşılar ve ilgili Service katmanına yönlendirir.</w:t>
       </w:r>
     </w:p>
     <w:p/>
@@ -173,31 +115,16 @@
         </w:numPr>
       </w:pPr>
       <w:r>
-        <w:t xml:space="preserve">Uygulama/Servis Katmanı (Service </w:t>
-      </w:r>
-      <w:proofErr w:type="spellStart"/>
-      <w:r>
-        <w:t>Layer</w:t>
-      </w:r>
-      <w:proofErr w:type="spellEnd"/>
-      <w:r>
-        <w:t>): Sistemin iş mantığının (</w:t>
-      </w:r>
-      <w:proofErr w:type="spellStart"/>
-      <w:r>
-        <w:t>business</w:t>
-      </w:r>
-      <w:proofErr w:type="spellEnd"/>
-      <w:r>
-        <w:t xml:space="preserve"> </w:t>
-      </w:r>
-      <w:proofErr w:type="spellStart"/>
-      <w:r>
-        <w:t>logic</w:t>
-      </w:r>
-      <w:proofErr w:type="spellEnd"/>
-      <w:r>
-        <w:t>) yürütüldüğü katmandır. Ödünç alma kuralları, ceza hesaplama algoritmaları ve kullanıcı yetkilendirme süreçleri burada işlenir.</w:t>
+        <w:t>Uygulama/Servis Katmanı (Service Layer): Sistemin iş mantığının (business logic) yürütüldüğü katmandır. Ödünç alma kuralları, ceza hesaplama algoritmaları ve kullanıcı yetkilendirme süreçleri burada işlenir.</w:t>
+      </w:r>
+      <w:r>
+        <w:t xml:space="preserve"> Java Service </w:t>
+      </w:r>
+      <w:r>
+        <w:t>sınıflarından</w:t>
+      </w:r>
+      <w:r>
+        <w:t xml:space="preserve"> oluşur.</w:t>
       </w:r>
     </w:p>
     <w:p/>
@@ -210,39 +137,22 @@
         </w:numPr>
       </w:pPr>
       <w:r>
-        <w:t xml:space="preserve">Veri Erişim Katmanı (Data Access / </w:t>
-      </w:r>
-      <w:proofErr w:type="spellStart"/>
-      <w:r>
-        <w:t>Repository</w:t>
-      </w:r>
-      <w:proofErr w:type="spellEnd"/>
-      <w:r>
-        <w:t xml:space="preserve"> </w:t>
-      </w:r>
-      <w:proofErr w:type="spellStart"/>
-      <w:r>
-        <w:t>Layer</w:t>
-      </w:r>
-      <w:proofErr w:type="spellEnd"/>
-      <w:r>
-        <w:t xml:space="preserve">): İş mantığı ile </w:t>
-      </w:r>
-      <w:proofErr w:type="spellStart"/>
-      <w:r>
-        <w:t>veritabanı</w:t>
-      </w:r>
-      <w:proofErr w:type="spellEnd"/>
-      <w:r>
-        <w:t xml:space="preserve"> arasındaki köprüdür. MySQL </w:t>
-      </w:r>
-      <w:proofErr w:type="spellStart"/>
-      <w:r>
-        <w:t>veritabanına</w:t>
-      </w:r>
-      <w:proofErr w:type="spellEnd"/>
-      <w:r>
-        <w:t xml:space="preserve"> yönelik sorguların yürütüldüğü katmandır.</w:t>
+        <w:t xml:space="preserve">Veri Erişim Katmanı </w:t>
+      </w:r>
+      <w:r>
+        <w:t>(</w:t>
+      </w:r>
+      <w:r>
+        <w:t>Repository Layer): İş mantığı ile veritabanı arasındaki köprüdür. MySQL veritabanına yönelik sorguların yürütüldüğü katmandır.</w:t>
+      </w:r>
+      <w:r>
+        <w:t xml:space="preserve"> JPA kullanarak veri tabanına SQL sorguları gönermekten sorumludur. Repository </w:t>
+      </w:r>
+      <w:r>
+        <w:t>interface’lerinden</w:t>
+      </w:r>
+      <w:r>
+        <w:t xml:space="preserve"> oluşur.</w:t>
       </w:r>
     </w:p>
     <w:p/>
@@ -258,9 +168,23 @@
         <w:t>Veri Katmanı (Database): Verilerin fiziksel olarak saklandığı MySQL sunucusudur.</w:t>
       </w:r>
     </w:p>
-    <w:p/>
-    <w:p/>
-    <w:p/>
+    <w:p>
+      <w:pPr>
+        <w:pStyle w:val="ListeParagraf"/>
+      </w:pPr>
+    </w:p>
+    <w:p>
+      <w:pPr>
+        <w:pStyle w:val="ListeParagraf"/>
+        <w:numPr>
+          <w:ilvl w:val="0"/>
+          <w:numId w:val="2"/>
+        </w:numPr>
+      </w:pPr>
+      <w:r>
+        <w:t>Entity Katmanı: Veri tabanındaki tabloları Java sınıflarının tanımasını sağlayan Entity sınıfları, Book.java User.java gibi dosyalardan oluşur.</w:t>
+      </w:r>
+    </w:p>
     <w:p/>
     <w:p>
       <w:r>
@@ -314,8 +238,6 @@
     <w:p/>
     <w:p/>
     <w:p/>
-    <w:p/>
-    <w:p/>
     <w:p>
       <w:r>
         <w:lastRenderedPageBreak/>
@@ -327,15 +249,7 @@
         <w:ind w:firstLine="708"/>
       </w:pPr>
       <w:r>
-        <w:t>Sistem, modüler bir yapıda tasarlanmış olup bileşenler birbirleriyle API/</w:t>
-      </w:r>
-      <w:proofErr w:type="spellStart"/>
-      <w:r>
-        <w:t>Interface</w:t>
-      </w:r>
-      <w:proofErr w:type="spellEnd"/>
-      <w:r>
-        <w:t xml:space="preserve"> düzeyinde haberleşir.</w:t>
+        <w:t>Sistem, modüler bir yapıda tasarlanmış olup bileşenler birbirleriyle API/Interface düzeyinde haberleşir.</w:t>
       </w:r>
     </w:p>
     <w:p/>
@@ -351,62 +265,44 @@
     </w:p>
     <w:p>
       <w:r>
-        <w:t xml:space="preserve">- </w:t>
-      </w:r>
-      <w:proofErr w:type="spellStart"/>
-      <w:r>
-        <w:t>Auth</w:t>
-      </w:r>
-      <w:proofErr w:type="spellEnd"/>
-      <w:r>
-        <w:t xml:space="preserve"> </w:t>
-      </w:r>
-      <w:proofErr w:type="spellStart"/>
-      <w:r>
-        <w:t>Module</w:t>
-      </w:r>
-      <w:proofErr w:type="spellEnd"/>
-      <w:r>
-        <w:t>: Kullanıcı kayıt, giriş ve yetkilendirme (Admin/User) işlemlerinden sorumludur.</w:t>
-      </w:r>
-    </w:p>
-    <w:p>
-      <w:r>
-        <w:t xml:space="preserve">- </w:t>
-      </w:r>
-      <w:proofErr w:type="spellStart"/>
-      <w:r>
-        <w:t>Search</w:t>
-      </w:r>
-      <w:proofErr w:type="spellEnd"/>
-      <w:r>
-        <w:t xml:space="preserve"> Engine: MySQL </w:t>
-      </w:r>
-      <w:proofErr w:type="spellStart"/>
-      <w:r>
-        <w:t>veritabanı</w:t>
-      </w:r>
-      <w:proofErr w:type="spellEnd"/>
-      <w:r>
-        <w:t xml:space="preserve"> üzerinde kompleks arama ve filtreleme işlemlerini yönetir.</w:t>
-      </w:r>
-    </w:p>
-    <w:p>
-      <w:r>
-        <w:t>- Library Management: Kitap envanterini, ödünç alma ve iade süreçlerini yöneten ana modüldür.</w:t>
-      </w:r>
-    </w:p>
-    <w:p>
-      <w:r>
-        <w:t xml:space="preserve">- </w:t>
-      </w:r>
-      <w:proofErr w:type="spellStart"/>
-      <w:r>
-        <w:t>Penalty</w:t>
-      </w:r>
-      <w:proofErr w:type="spellEnd"/>
-      <w:r>
-        <w:t xml:space="preserve"> Service: Geciken iadeler için sistem tarihine göre otomatik ceza hesaplaması yapar.</w:t>
+        <w:t>- REST API:</w:t>
+      </w:r>
+      <w:r>
+        <w:t xml:space="preserve"> UI ile backend modülleri arasındaki yönlendirmeyi sağlayan arayüz</w:t>
+      </w:r>
+      <w:r>
+        <w:t>.</w:t>
+      </w:r>
+    </w:p>
+    <w:p>
+      <w:r>
+        <w:t>- Auth Module: Kullanıcı kayıt, giriş ve yetkilendirme (Admin/User) işlemlerinden sorumludur.</w:t>
+      </w:r>
+    </w:p>
+    <w:p>
+      <w:r>
+        <w:t>- Search Engine</w:t>
+      </w:r>
+      <w:r>
+        <w:t xml:space="preserve"> (Book Service)</w:t>
+      </w:r>
+      <w:r>
+        <w:t>: MySQL veritabanı üzerinde kompleks arama ve filtreleme işlemlerini yönetir.</w:t>
+      </w:r>
+    </w:p>
+    <w:p>
+      <w:r>
+        <w:t>- Library Management: Kitap envanterini, yöneten ana modüldür.</w:t>
+      </w:r>
+    </w:p>
+    <w:p>
+      <w:r>
+        <w:t>- Borrowing Service: Kitap ödünç alma ve iade işlemlerinin kontrolünü sağlar.</w:t>
+      </w:r>
+    </w:p>
+    <w:p>
+      <w:r>
+        <w:t>- Penalty Service: Geciken iadeler için sistem tarihine göre otomatik ceza hesaplaması yapar.</w:t>
       </w:r>
     </w:p>
     <w:p/>
@@ -465,113 +361,63 @@
                 <w:b/>
                 <w:bCs/>
               </w:rPr>
-              <w:t>Arayüz (</w:t>
-            </w:r>
-            <w:proofErr w:type="spellStart"/>
+              <w:t>Arayüz (Interface/Method)</w:t>
+            </w:r>
+          </w:p>
+        </w:tc>
+        <w:tc>
+          <w:tcPr>
+            <w:tcW w:w="0" w:type="auto"/>
+            <w:tcBorders>
+              <w:top w:val="single" w:sz="6" w:space="0" w:color="auto"/>
+              <w:left w:val="single" w:sz="6" w:space="0" w:color="auto"/>
+              <w:bottom w:val="single" w:sz="6" w:space="0" w:color="auto"/>
+              <w:right w:val="single" w:sz="6" w:space="0" w:color="auto"/>
+            </w:tcBorders>
+            <w:tcMar>
+              <w:top w:w="240" w:type="dxa"/>
+              <w:left w:w="0" w:type="dxa"/>
+              <w:bottom w:w="240" w:type="dxa"/>
+              <w:right w:w="180" w:type="dxa"/>
+            </w:tcMar>
+            <w:vAlign w:val="center"/>
+            <w:hideMark/>
+          </w:tcPr>
+          <w:p>
             <w:r>
               <w:rPr>
                 <w:b/>
                 <w:bCs/>
               </w:rPr>
-              <w:t>Interface</w:t>
-            </w:r>
-            <w:proofErr w:type="spellEnd"/>
+              <w:t>Input Parametreleri</w:t>
+            </w:r>
+          </w:p>
+        </w:tc>
+        <w:tc>
+          <w:tcPr>
+            <w:tcW w:w="0" w:type="auto"/>
+            <w:tcBorders>
+              <w:top w:val="single" w:sz="6" w:space="0" w:color="auto"/>
+              <w:left w:val="single" w:sz="6" w:space="0" w:color="auto"/>
+              <w:bottom w:val="single" w:sz="6" w:space="0" w:color="auto"/>
+              <w:right w:val="single" w:sz="6" w:space="0" w:color="auto"/>
+            </w:tcBorders>
+            <w:tcMar>
+              <w:top w:w="240" w:type="dxa"/>
+              <w:left w:w="0" w:type="dxa"/>
+              <w:bottom w:w="240" w:type="dxa"/>
+              <w:right w:w="0" w:type="dxa"/>
+            </w:tcMar>
+            <w:vAlign w:val="center"/>
+            <w:hideMark/>
+          </w:tcPr>
+          <w:p>
             <w:r>
               <w:rPr>
                 <w:b/>
                 <w:bCs/>
               </w:rPr>
-              <w:t>/</w:t>
-            </w:r>
-            <w:proofErr w:type="spellStart"/>
-            <w:r>
-              <w:rPr>
-                <w:b/>
-                <w:bCs/>
-              </w:rPr>
-              <w:t>Method</w:t>
-            </w:r>
-            <w:proofErr w:type="spellEnd"/>
-            <w:r>
-              <w:rPr>
-                <w:b/>
-                <w:bCs/>
-              </w:rPr>
-              <w:t>)</w:t>
-            </w:r>
-          </w:p>
-        </w:tc>
-        <w:tc>
-          <w:tcPr>
-            <w:tcW w:w="0" w:type="auto"/>
-            <w:tcBorders>
-              <w:top w:val="single" w:sz="6" w:space="0" w:color="auto"/>
-              <w:left w:val="single" w:sz="6" w:space="0" w:color="auto"/>
-              <w:bottom w:val="single" w:sz="6" w:space="0" w:color="auto"/>
-              <w:right w:val="single" w:sz="6" w:space="0" w:color="auto"/>
-            </w:tcBorders>
-            <w:tcMar>
-              <w:top w:w="240" w:type="dxa"/>
-              <w:left w:w="0" w:type="dxa"/>
-              <w:bottom w:w="240" w:type="dxa"/>
-              <w:right w:w="180" w:type="dxa"/>
-            </w:tcMar>
-            <w:vAlign w:val="center"/>
-            <w:hideMark/>
-          </w:tcPr>
-          <w:p>
-            <w:proofErr w:type="spellStart"/>
-            <w:r>
-              <w:rPr>
-                <w:b/>
-                <w:bCs/>
-              </w:rPr>
-              <w:t>Input</w:t>
-            </w:r>
-            <w:proofErr w:type="spellEnd"/>
-            <w:r>
-              <w:rPr>
-                <w:b/>
-                <w:bCs/>
-              </w:rPr>
-              <w:t xml:space="preserve"> Parametreleri</w:t>
-            </w:r>
-          </w:p>
-        </w:tc>
-        <w:tc>
-          <w:tcPr>
-            <w:tcW w:w="0" w:type="auto"/>
-            <w:tcBorders>
-              <w:top w:val="single" w:sz="6" w:space="0" w:color="auto"/>
-              <w:left w:val="single" w:sz="6" w:space="0" w:color="auto"/>
-              <w:bottom w:val="single" w:sz="6" w:space="0" w:color="auto"/>
-              <w:right w:val="single" w:sz="6" w:space="0" w:color="auto"/>
-            </w:tcBorders>
-            <w:tcMar>
-              <w:top w:w="240" w:type="dxa"/>
-              <w:left w:w="0" w:type="dxa"/>
-              <w:bottom w:w="240" w:type="dxa"/>
-              <w:right w:w="0" w:type="dxa"/>
-            </w:tcMar>
-            <w:vAlign w:val="center"/>
-            <w:hideMark/>
-          </w:tcPr>
-          <w:p>
-            <w:proofErr w:type="spellStart"/>
-            <w:r>
-              <w:rPr>
-                <w:b/>
-                <w:bCs/>
-              </w:rPr>
-              <w:t>Output</w:t>
-            </w:r>
-            <w:proofErr w:type="spellEnd"/>
-            <w:r>
-              <w:rPr>
-                <w:b/>
-                <w:bCs/>
-              </w:rPr>
-              <w:t xml:space="preserve"> / Return</w:t>
+              <w:t>Output / Return</w:t>
             </w:r>
           </w:p>
         </w:tc>
@@ -599,37 +445,12 @@
             <w:hideMark/>
           </w:tcPr>
           <w:p>
-            <w:proofErr w:type="gramStart"/>
             <w:r>
               <w:rPr>
                 <w:b/>
                 <w:bCs/>
               </w:rPr>
-              <w:t>login</w:t>
-            </w:r>
-            <w:proofErr w:type="gramEnd"/>
-            <w:r>
-              <w:rPr>
-                <w:b/>
-                <w:bCs/>
-              </w:rPr>
-              <w:t>(</w:t>
-            </w:r>
-            <w:proofErr w:type="spellStart"/>
-            <w:r>
-              <w:rPr>
-                <w:b/>
-                <w:bCs/>
-              </w:rPr>
-              <w:t>credentials</w:t>
-            </w:r>
-            <w:proofErr w:type="spellEnd"/>
-            <w:r>
-              <w:rPr>
-                <w:b/>
-                <w:bCs/>
-              </w:rPr>
-              <w:t>)</w:t>
+              <w:t>login(credentials)</w:t>
             </w:r>
           </w:p>
         </w:tc>
@@ -652,39 +473,8 @@
             <w:hideMark/>
           </w:tcPr>
           <w:p>
-            <w:proofErr w:type="spellStart"/>
-            <w:proofErr w:type="gramStart"/>
-            <w:r>
-              <w:t>username</w:t>
-            </w:r>
-            <w:proofErr w:type="spellEnd"/>
-            <w:proofErr w:type="gramEnd"/>
-            <w:r>
-              <w:t xml:space="preserve"> (</w:t>
-            </w:r>
-            <w:proofErr w:type="spellStart"/>
-            <w:r>
-              <w:t>String</w:t>
-            </w:r>
-            <w:proofErr w:type="spellEnd"/>
-            <w:r>
-              <w:t xml:space="preserve">), </w:t>
-            </w:r>
-            <w:proofErr w:type="spellStart"/>
-            <w:r>
-              <w:t>password</w:t>
-            </w:r>
-            <w:proofErr w:type="spellEnd"/>
-            <w:r>
-              <w:t xml:space="preserve"> (</w:t>
-            </w:r>
-            <w:proofErr w:type="spellStart"/>
-            <w:r>
-              <w:t>String</w:t>
-            </w:r>
-            <w:proofErr w:type="spellEnd"/>
-            <w:r>
-              <w:t xml:space="preserve">) </w:t>
+            <w:r>
+              <w:t xml:space="preserve">username (String), password (String) </w:t>
             </w:r>
           </w:p>
         </w:tc>
@@ -707,19 +497,9 @@
             <w:hideMark/>
           </w:tcPr>
           <w:p>
-            <w:proofErr w:type="spellStart"/>
-            <w:r>
-              <w:t>AuthToken</w:t>
-            </w:r>
-            <w:proofErr w:type="spellEnd"/>
-            <w:r>
-              <w:t xml:space="preserve"> veya </w:t>
-            </w:r>
-            <w:proofErr w:type="spellStart"/>
-            <w:r>
-              <w:t>ErrorMessage</w:t>
-            </w:r>
-            <w:proofErr w:type="spellEnd"/>
+            <w:r>
+              <w:t>AuthToken veya ErrorMessage</w:t>
+            </w:r>
           </w:p>
         </w:tc>
       </w:tr>
@@ -746,39 +526,12 @@
             <w:hideMark/>
           </w:tcPr>
           <w:p>
-            <w:proofErr w:type="spellStart"/>
-            <w:proofErr w:type="gramStart"/>
             <w:r>
               <w:rPr>
                 <w:b/>
                 <w:bCs/>
               </w:rPr>
-              <w:t>searchBooks</w:t>
-            </w:r>
-            <w:proofErr w:type="spellEnd"/>
-            <w:proofErr w:type="gramEnd"/>
-            <w:r>
-              <w:rPr>
-                <w:b/>
-                <w:bCs/>
-              </w:rPr>
-              <w:t>(</w:t>
-            </w:r>
-            <w:proofErr w:type="spellStart"/>
-            <w:r>
-              <w:rPr>
-                <w:b/>
-                <w:bCs/>
-              </w:rPr>
-              <w:t>query</w:t>
-            </w:r>
-            <w:proofErr w:type="spellEnd"/>
-            <w:r>
-              <w:rPr>
-                <w:b/>
-                <w:bCs/>
-              </w:rPr>
-              <w:t>)</w:t>
+              <w:t>searchBooks(query)</w:t>
             </w:r>
           </w:p>
         </w:tc>
@@ -801,39 +554,8 @@
             <w:hideMark/>
           </w:tcPr>
           <w:p>
-            <w:proofErr w:type="spellStart"/>
-            <w:proofErr w:type="gramStart"/>
-            <w:r>
-              <w:t>keyword</w:t>
-            </w:r>
-            <w:proofErr w:type="spellEnd"/>
-            <w:proofErr w:type="gramEnd"/>
-            <w:r>
-              <w:t xml:space="preserve"> (</w:t>
-            </w:r>
-            <w:proofErr w:type="spellStart"/>
-            <w:r>
-              <w:t>String</w:t>
-            </w:r>
-            <w:proofErr w:type="spellEnd"/>
-            <w:r>
-              <w:t xml:space="preserve">), </w:t>
-            </w:r>
-            <w:proofErr w:type="spellStart"/>
-            <w:r>
-              <w:t>category</w:t>
-            </w:r>
-            <w:proofErr w:type="spellEnd"/>
-            <w:r>
-              <w:t xml:space="preserve"> (</w:t>
-            </w:r>
-            <w:proofErr w:type="spellStart"/>
-            <w:r>
-              <w:t>String</w:t>
-            </w:r>
-            <w:proofErr w:type="spellEnd"/>
-            <w:r>
-              <w:t xml:space="preserve">) </w:t>
+            <w:r>
+              <w:t xml:space="preserve">keyword (String), category (String) </w:t>
             </w:r>
           </w:p>
         </w:tc>
@@ -856,21 +578,8 @@
             <w:hideMark/>
           </w:tcPr>
           <w:p>
-            <w:proofErr w:type="spellStart"/>
-            <w:r>
-              <w:t>List</w:t>
-            </w:r>
-            <w:proofErr w:type="spellEnd"/>
-            <w:r>
-              <w:t>&lt;</w:t>
-            </w:r>
-            <w:proofErr w:type="spellStart"/>
-            <w:r>
-              <w:t>BookObject</w:t>
-            </w:r>
-            <w:proofErr w:type="spellEnd"/>
-            <w:r>
-              <w:t xml:space="preserve">&gt; </w:t>
+            <w:r>
+              <w:t xml:space="preserve">List&lt;BookObject&gt; </w:t>
             </w:r>
           </w:p>
         </w:tc>
@@ -898,23 +607,13 @@
             <w:hideMark/>
           </w:tcPr>
           <w:p>
-            <w:proofErr w:type="spellStart"/>
-            <w:proofErr w:type="gramStart"/>
             <w:r>
               <w:rPr>
                 <w:b/>
                 <w:bCs/>
               </w:rPr>
-              <w:t>borrowBook</w:t>
-            </w:r>
-            <w:proofErr w:type="spellEnd"/>
-            <w:proofErr w:type="gramEnd"/>
-            <w:r>
-              <w:rPr>
-                <w:b/>
-                <w:bCs/>
-              </w:rPr>
-              <w:t>(id)</w:t>
+              <w:lastRenderedPageBreak/>
+              <w:t>borrowBook(id)</w:t>
             </w:r>
           </w:p>
         </w:tc>
@@ -937,39 +636,8 @@
             <w:hideMark/>
           </w:tcPr>
           <w:p>
-            <w:proofErr w:type="spellStart"/>
-            <w:proofErr w:type="gramStart"/>
-            <w:r>
-              <w:t>userId</w:t>
-            </w:r>
-            <w:proofErr w:type="spellEnd"/>
-            <w:proofErr w:type="gramEnd"/>
-            <w:r>
-              <w:t xml:space="preserve"> (</w:t>
-            </w:r>
-            <w:proofErr w:type="spellStart"/>
-            <w:r>
-              <w:t>Int</w:t>
-            </w:r>
-            <w:proofErr w:type="spellEnd"/>
-            <w:r>
-              <w:t xml:space="preserve">), </w:t>
-            </w:r>
-            <w:proofErr w:type="spellStart"/>
-            <w:r>
-              <w:t>bookId</w:t>
-            </w:r>
-            <w:proofErr w:type="spellEnd"/>
-            <w:r>
-              <w:t xml:space="preserve"> (</w:t>
-            </w:r>
-            <w:proofErr w:type="spellStart"/>
-            <w:r>
-              <w:t>Int</w:t>
-            </w:r>
-            <w:proofErr w:type="spellEnd"/>
-            <w:r>
-              <w:t xml:space="preserve">) </w:t>
+            <w:r>
+              <w:t xml:space="preserve">userId (Int), bookId (Int) </w:t>
             </w:r>
           </w:p>
         </w:tc>
@@ -992,13 +660,8 @@
             <w:hideMark/>
           </w:tcPr>
           <w:p>
-            <w:proofErr w:type="spellStart"/>
-            <w:r>
-              <w:t>Status</w:t>
-            </w:r>
-            <w:proofErr w:type="spellEnd"/>
-            <w:r>
-              <w:t xml:space="preserve"> </w:t>
+            <w:r>
+              <w:t xml:space="preserve">Status </w:t>
             </w:r>
           </w:p>
         </w:tc>
@@ -1026,24 +689,12 @@
             <w:hideMark/>
           </w:tcPr>
           <w:p>
-            <w:proofErr w:type="spellStart"/>
-            <w:proofErr w:type="gramStart"/>
             <w:r>
               <w:rPr>
                 <w:b/>
                 <w:bCs/>
               </w:rPr>
-              <w:lastRenderedPageBreak/>
-              <w:t>calculatePenalty</w:t>
-            </w:r>
-            <w:proofErr w:type="spellEnd"/>
-            <w:proofErr w:type="gramEnd"/>
-            <w:r>
-              <w:rPr>
-                <w:b/>
-                <w:bCs/>
-              </w:rPr>
-              <w:t>(id)</w:t>
+              <w:t>calculatePenalty(id)</w:t>
             </w:r>
           </w:p>
         </w:tc>
@@ -1066,39 +717,8 @@
             <w:hideMark/>
           </w:tcPr>
           <w:p>
-            <w:proofErr w:type="spellStart"/>
-            <w:proofErr w:type="gramStart"/>
-            <w:r>
-              <w:t>transactionId</w:t>
-            </w:r>
-            <w:proofErr w:type="spellEnd"/>
-            <w:proofErr w:type="gramEnd"/>
-            <w:r>
-              <w:t xml:space="preserve"> (</w:t>
-            </w:r>
-            <w:proofErr w:type="spellStart"/>
-            <w:r>
-              <w:t>Int</w:t>
-            </w:r>
-            <w:proofErr w:type="spellEnd"/>
-            <w:r>
-              <w:t xml:space="preserve">), </w:t>
-            </w:r>
-            <w:proofErr w:type="spellStart"/>
-            <w:r>
-              <w:t>currentDate</w:t>
-            </w:r>
-            <w:proofErr w:type="spellEnd"/>
-            <w:r>
-              <w:t xml:space="preserve"> (</w:t>
-            </w:r>
-            <w:proofErr w:type="spellStart"/>
-            <w:r>
-              <w:t>Date</w:t>
-            </w:r>
-            <w:proofErr w:type="spellEnd"/>
-            <w:r>
-              <w:t xml:space="preserve">) </w:t>
+            <w:r>
+              <w:t xml:space="preserve">transactionId (Int), currentDate (Date) </w:t>
             </w:r>
           </w:p>
         </w:tc>
@@ -1121,23 +741,8 @@
             <w:hideMark/>
           </w:tcPr>
           <w:p>
-            <w:proofErr w:type="spellStart"/>
-            <w:proofErr w:type="gramStart"/>
-            <w:r>
-              <w:t>penaltyAmount</w:t>
-            </w:r>
-            <w:proofErr w:type="spellEnd"/>
-            <w:proofErr w:type="gramEnd"/>
-            <w:r>
-              <w:t xml:space="preserve"> (</w:t>
-            </w:r>
-            <w:proofErr w:type="spellStart"/>
-            <w:r>
-              <w:t>Double</w:t>
-            </w:r>
-            <w:proofErr w:type="spellEnd"/>
-            <w:r>
-              <w:t xml:space="preserve">) </w:t>
+            <w:r>
+              <w:t xml:space="preserve">penaltyAmount (Double) </w:t>
             </w:r>
           </w:p>
         </w:tc>
@@ -1153,74 +758,94 @@
         <w:t>Veri Yapıları:</w:t>
       </w:r>
       <w:r>
-        <w:t xml:space="preserve"> User (id, name, role), </w:t>
-      </w:r>
-      <w:proofErr w:type="spellStart"/>
-      <w:r>
-        <w:t>Book</w:t>
-      </w:r>
-      <w:proofErr w:type="spellEnd"/>
-      <w:r>
-        <w:t xml:space="preserve"> (id, </w:t>
-      </w:r>
-      <w:proofErr w:type="spellStart"/>
-      <w:r>
-        <w:t>title</w:t>
-      </w:r>
-      <w:proofErr w:type="spellEnd"/>
-      <w:r>
-        <w:t xml:space="preserve">, </w:t>
-      </w:r>
-      <w:proofErr w:type="spellStart"/>
-      <w:r>
-        <w:t>author</w:t>
-      </w:r>
-      <w:proofErr w:type="spellEnd"/>
-      <w:r>
-        <w:t xml:space="preserve">, </w:t>
-      </w:r>
-      <w:proofErr w:type="spellStart"/>
-      <w:r>
-        <w:t>stock</w:t>
-      </w:r>
-      <w:proofErr w:type="spellEnd"/>
-      <w:r>
-        <w:t xml:space="preserve">), </w:t>
-      </w:r>
-      <w:proofErr w:type="spellStart"/>
-      <w:r>
-        <w:t>Transaction</w:t>
-      </w:r>
-      <w:proofErr w:type="spellEnd"/>
-      <w:r>
-        <w:t xml:space="preserve"> (id, </w:t>
-      </w:r>
-      <w:proofErr w:type="spellStart"/>
-      <w:r>
-        <w:t>userId</w:t>
-      </w:r>
-      <w:proofErr w:type="spellEnd"/>
-      <w:r>
-        <w:t xml:space="preserve">, </w:t>
-      </w:r>
-      <w:proofErr w:type="spellStart"/>
-      <w:r>
-        <w:t>bookId</w:t>
-      </w:r>
-      <w:proofErr w:type="spellEnd"/>
-      <w:r>
-        <w:t xml:space="preserve">, </w:t>
-      </w:r>
-      <w:proofErr w:type="spellStart"/>
-      <w:r>
-        <w:t>dueDate</w:t>
-      </w:r>
-      <w:proofErr w:type="spellEnd"/>
-      <w:r>
-        <w:t>) sınıflarını içerir.</w:t>
-      </w:r>
-    </w:p>
-    <w:p/>
+        <w:t xml:space="preserve"> User (id, name, role), Book (id, title, author, stock), Transaction (id, userId, bookId, dueDate) sınıflarını içerir.</w:t>
+      </w:r>
+    </w:p>
+    <w:p>
+      <w:pPr>
+        <w:rPr>
+          <w:b/>
+          <w:bCs/>
+        </w:rPr>
+      </w:pPr>
+      <w:r>
+        <w:rPr>
+          <w:b/>
+          <w:bCs/>
+        </w:rPr>
+        <w:t>Projenin çalışır hale gelmesi için tasarlanması gereken minimun classlar</w:t>
+      </w:r>
+      <w:r>
+        <w:rPr>
+          <w:b/>
+          <w:bCs/>
+        </w:rPr>
+        <w:t>. İlk sprintte implement edilecekler.</w:t>
+      </w:r>
+    </w:p>
+    <w:p>
+      <w:pPr>
+        <w:pStyle w:val="NormalWeb"/>
+      </w:pPr>
+      <w:r>
+        <w:rPr>
+          <w:noProof/>
+        </w:rPr>
+        <w:drawing>
+          <wp:inline distT="0" distB="0" distL="0" distR="0" wp14:anchorId="2893D354" wp14:editId="3B330927">
+            <wp:extent cx="6301984" cy="4667250"/>
+            <wp:effectExtent l="0" t="0" r="3810" b="0"/>
+            <wp:docPr id="2" name="Resim 2"/>
+            <wp:cNvGraphicFramePr>
+              <a:graphicFrameLocks xmlns:a="http://schemas.openxmlformats.org/drawingml/2006/main" noChangeAspect="1"/>
+            </wp:cNvGraphicFramePr>
+            <a:graphic xmlns:a="http://schemas.openxmlformats.org/drawingml/2006/main">
+              <a:graphicData uri="http://schemas.openxmlformats.org/drawingml/2006/picture">
+                <pic:pic xmlns:pic="http://schemas.openxmlformats.org/drawingml/2006/picture">
+                  <pic:nvPicPr>
+                    <pic:cNvPr id="0" name="Picture 2"/>
+                    <pic:cNvPicPr>
+                      <a:picLocks noChangeAspect="1" noChangeArrowheads="1"/>
+                    </pic:cNvPicPr>
+                  </pic:nvPicPr>
+                  <pic:blipFill>
+                    <a:blip r:embed="rId6" cstate="print">
+                      <a:extLst>
+                        <a:ext uri="{28A0092B-C50C-407E-A947-70E740481C1C}">
+                          <a14:useLocalDpi xmlns:a14="http://schemas.microsoft.com/office/drawing/2010/main" val="0"/>
+                        </a:ext>
+                      </a:extLst>
+                    </a:blip>
+                    <a:srcRect/>
+                    <a:stretch>
+                      <a:fillRect/>
+                    </a:stretch>
+                  </pic:blipFill>
+                  <pic:spPr bwMode="auto">
+                    <a:xfrm>
+                      <a:off x="0" y="0"/>
+                      <a:ext cx="6341036" cy="4696172"/>
+                    </a:xfrm>
+                    <a:prstGeom prst="rect">
+                      <a:avLst/>
+                    </a:prstGeom>
+                    <a:noFill/>
+                    <a:ln>
+                      <a:noFill/>
+                    </a:ln>
+                  </pic:spPr>
+                </pic:pic>
+              </a:graphicData>
+            </a:graphic>
+          </wp:inline>
+        </w:drawing>
+      </w:r>
+    </w:p>
+    <w:p>
+      <w:pPr>
+        <w:pStyle w:val="NormalWeb"/>
+      </w:pPr>
+    </w:p>
     <w:p>
       <w:r>
         <w:t>4. FONKSİYONLARIN ÇALIŞMA AKIŞI (SEQUENCE DIAGRAM)</w:t>
@@ -1238,65 +863,17 @@
     </w:p>
     <w:p>
       <w:r>
-        <w:t xml:space="preserve">2. UI, </w:t>
-      </w:r>
-      <w:proofErr w:type="spellStart"/>
-      <w:r>
-        <w:t>BorrowService</w:t>
-      </w:r>
-      <w:proofErr w:type="spellEnd"/>
-      <w:r>
-        <w:t xml:space="preserve"> bileşenine </w:t>
-      </w:r>
-      <w:proofErr w:type="spellStart"/>
-      <w:r>
-        <w:t>bookId</w:t>
-      </w:r>
-      <w:proofErr w:type="spellEnd"/>
-      <w:r>
-        <w:t xml:space="preserve"> ve </w:t>
-      </w:r>
-      <w:proofErr w:type="spellStart"/>
-      <w:r>
-        <w:t>userId</w:t>
-      </w:r>
-      <w:proofErr w:type="spellEnd"/>
-      <w:r>
-        <w:t xml:space="preserve"> bilgilerini gönderir.</w:t>
-      </w:r>
-    </w:p>
-    <w:p>
-      <w:r>
-        <w:t xml:space="preserve">3. Service, </w:t>
-      </w:r>
-      <w:proofErr w:type="spellStart"/>
-      <w:r>
-        <w:t>BookRepository</w:t>
-      </w:r>
-      <w:proofErr w:type="spellEnd"/>
-      <w:r>
-        <w:t xml:space="preserve"> aracılığıyla MySQL'den kitabın stok durumunu kontrol eder.</w:t>
-      </w:r>
-    </w:p>
-    <w:p>
-      <w:r>
-        <w:t xml:space="preserve">4. Stok mevcutsa, </w:t>
-      </w:r>
-      <w:proofErr w:type="spellStart"/>
-      <w:r>
-        <w:t>veritabanında</w:t>
-      </w:r>
-      <w:proofErr w:type="spellEnd"/>
-      <w:r>
-        <w:t xml:space="preserve"> stok 1 azaltılır ve yeni bir </w:t>
-      </w:r>
-      <w:proofErr w:type="spellStart"/>
-      <w:r>
-        <w:t>Transaction</w:t>
-      </w:r>
-      <w:proofErr w:type="spellEnd"/>
-      <w:r>
-        <w:t xml:space="preserve"> kaydı oluşturulur.</w:t>
+        <w:t>2. UI, BorrowService bileşenine bookId ve userId bilgilerini gönderir.</w:t>
+      </w:r>
+    </w:p>
+    <w:p>
+      <w:r>
+        <w:t>3. Service, BookRepository aracılığıyla MySQL'den kitabın stok durumunu kontrol eder.</w:t>
+      </w:r>
+    </w:p>
+    <w:p>
+      <w:r>
+        <w:t>4. Stok mevcutsa, veritabanında stok 1 azaltılır ve yeni bir Transaction kaydı oluşturulur.</w:t>
       </w:r>
     </w:p>
     <w:p>
@@ -1312,23 +889,7 @@
     </w:p>
     <w:p>
       <w:r>
-        <w:t>Proje, başlangıç aşamasında Tek Makine (</w:t>
-      </w:r>
-      <w:proofErr w:type="spellStart"/>
-      <w:r>
-        <w:t>Single</w:t>
-      </w:r>
-      <w:proofErr w:type="spellEnd"/>
-      <w:r>
-        <w:t xml:space="preserve"> </w:t>
-      </w:r>
-      <w:proofErr w:type="spellStart"/>
-      <w:r>
-        <w:t>Node</w:t>
-      </w:r>
-      <w:proofErr w:type="spellEnd"/>
-      <w:r>
-        <w:t>) mimarisiyle dağıtılacaktır.</w:t>
+        <w:t>Proje, başlangıç aşamasında Tek Makine (Single Node) mimarisiyle dağıtılacaktır.</w:t>
       </w:r>
     </w:p>
     <w:p>
@@ -1338,28 +899,12 @@
     </w:p>
     <w:p>
       <w:r>
-        <w:t xml:space="preserve">- Uygulama Sunucusu: Java Spring </w:t>
-      </w:r>
-      <w:proofErr w:type="spellStart"/>
-      <w:r>
-        <w:t>Boot</w:t>
-      </w:r>
-      <w:proofErr w:type="spellEnd"/>
-      <w:r>
-        <w:t xml:space="preserve"> uygulamasının çalıştığı JVM ortamı.</w:t>
-      </w:r>
-    </w:p>
-    <w:p>
-      <w:r>
-        <w:t xml:space="preserve">- </w:t>
-      </w:r>
-      <w:proofErr w:type="spellStart"/>
-      <w:r>
-        <w:t>Veritabanı</w:t>
-      </w:r>
-      <w:proofErr w:type="spellEnd"/>
-      <w:r>
-        <w:t xml:space="preserve"> Sunucusu: Aynı sunucu üzerinde barındırılan MySQL DB.</w:t>
+        <w:t>- Uygulama Sunucusu: Java Spring Boot uygulamasının çalıştığı JVM ortamı.</w:t>
+      </w:r>
+    </w:p>
+    <w:p>
+      <w:r>
+        <w:t>- Veritabanı Sunucusu: Aynı sunucu üzerinde barındırılan MySQL DB.</w:t>
       </w:r>
     </w:p>
     <w:p/>
@@ -1410,7 +955,6 @@
                 <w:b/>
                 <w:bCs/>
               </w:rPr>
-              <w:lastRenderedPageBreak/>
               <w:t>Görev / Bölüm</w:t>
             </w:r>
           </w:p>
@@ -1801,13 +1345,8 @@
             <w:hideMark/>
           </w:tcPr>
           <w:p>
-            <w:proofErr w:type="spellStart"/>
-            <w:r>
-              <w:t>Sequence</w:t>
-            </w:r>
-            <w:proofErr w:type="spellEnd"/>
-            <w:r>
-              <w:t xml:space="preserve"> &amp; Deployment Diyagramları</w:t>
+            <w:r>
+              <w:t>Sequence &amp; Deployment Diyagramları</w:t>
             </w:r>
           </w:p>
         </w:tc>
@@ -1932,6 +1471,7 @@
           </w:tcPr>
           <w:p>
             <w:r>
+              <w:lastRenderedPageBreak/>
               <w:t>Arayüz ve Parametre Tanımlamaları</w:t>
             </w:r>
           </w:p>
@@ -2056,13 +1596,8 @@
             <w:hideMark/>
           </w:tcPr>
           <w:p>
-            <w:proofErr w:type="spellStart"/>
-            <w:r>
-              <w:t>Döküman</w:t>
-            </w:r>
-            <w:proofErr w:type="spellEnd"/>
-            <w:r>
-              <w:t xml:space="preserve"> Formatlama ve Son Kontrol</w:t>
+            <w:r>
+              <w:t>Döküman Formatlama ve Son Kontrol</w:t>
             </w:r>
           </w:p>
         </w:tc>
@@ -2176,7 +1711,7 @@
 </file>
 
 <file path=word/numbering.xml><?xml version="1.0" encoding="utf-8"?>
-<w:numbering xmlns:wpc="http://schemas.microsoft.com/office/word/2010/wordprocessingCanvas" xmlns:cx="http://schemas.microsoft.com/office/drawing/2014/chartex" xmlns:cx1="http://schemas.microsoft.com/office/drawing/2015/9/8/chartex" xmlns:cx2="http://schemas.microsoft.com/office/drawing/2015/10/21/chartex" xmlns:cx3="http://schemas.microsoft.com/office/drawing/2016/5/9/chartex" xmlns:cx4="http://schemas.microsoft.com/office/drawing/2016/5/10/chartex" xmlns:cx5="http://schemas.microsoft.com/office/drawing/2016/5/11/chartex" xmlns:cx6="http://schemas.microsoft.com/office/drawing/2016/5/12/chartex" xmlns:cx7="http://schemas.microsoft.com/office/drawing/2016/5/13/chartex" xmlns:cx8="http://schemas.microsoft.com/office/drawing/2016/5/14/chartex" xmlns:mc="http://schemas.openxmlformats.org/markup-compatibility/2006" xmlns:aink="http://schemas.microsoft.com/office/drawing/2016/ink" xmlns:am3d="http://schemas.microsoft.com/office/drawing/2017/model3d" xmlns:o="urn:schemas-microsoft-com:office:office" xmlns:oel="http://schemas.microsoft.com/office/2019/extlst" xmlns:r="http://schemas.openxmlformats.org/officeDocument/2006/relationships" xmlns:m="http://schemas.openxmlformats.org/officeDocument/2006/math" xmlns:v="urn:schemas-microsoft-com:vml" xmlns:wp14="http://schemas.microsoft.com/office/word/2010/wordprocessingDrawing" xmlns:wp="http://schemas.openxmlformats.org/drawingml/2006/wordprocessingDrawing" xmlns:w10="urn:schemas-microsoft-com:office:word" xmlns:w="http://schemas.openxmlformats.org/wordprocessingml/2006/main" xmlns:w14="http://schemas.microsoft.com/office/word/2010/wordml" xmlns:w15="http://schemas.microsoft.com/office/word/2012/wordml" xmlns:w16cex="http://schemas.microsoft.com/office/word/2018/wordml/cex" xmlns:w16cid="http://schemas.microsoft.com/office/word/2016/wordml/cid" xmlns:w16="http://schemas.microsoft.com/office/word/2018/wordml" xmlns:w16du="http://schemas.microsoft.com/office/word/2023/wordml/word16du" xmlns:w16sdtdh="http://schemas.microsoft.com/office/word/2020/wordml/sdtdatahash" xmlns:w16sdtfl="http://schemas.microsoft.com/office/word/2024/wordml/sdtformatlock" xmlns:w16se="http://schemas.microsoft.com/office/word/2015/wordml/symex" xmlns:wpg="http://schemas.microsoft.com/office/word/2010/wordprocessingGroup" xmlns:wpi="http://schemas.microsoft.com/office/word/2010/wordprocessingInk" xmlns:wne="http://schemas.microsoft.com/office/word/2006/wordml" xmlns:wps="http://schemas.microsoft.com/office/word/2010/wordprocessingShape" mc:Ignorable="w14 w15 w16se w16cid w16 w16cex w16sdtdh w16sdtfl w16du wp14">
+<w:numbering xmlns:wpc="http://schemas.microsoft.com/office/word/2010/wordprocessingCanvas" xmlns:cx="http://schemas.microsoft.com/office/drawing/2014/chartex" xmlns:cx1="http://schemas.microsoft.com/office/drawing/2015/9/8/chartex" xmlns:cx2="http://schemas.microsoft.com/office/drawing/2015/10/21/chartex" xmlns:cx3="http://schemas.microsoft.com/office/drawing/2016/5/9/chartex" xmlns:cx4="http://schemas.microsoft.com/office/drawing/2016/5/10/chartex" xmlns:cx5="http://schemas.microsoft.com/office/drawing/2016/5/11/chartex" xmlns:cx6="http://schemas.microsoft.com/office/drawing/2016/5/12/chartex" xmlns:cx7="http://schemas.microsoft.com/office/drawing/2016/5/13/chartex" xmlns:cx8="http://schemas.microsoft.com/office/drawing/2016/5/14/chartex" xmlns:mc="http://schemas.openxmlformats.org/markup-compatibility/2006" xmlns:aink="http://schemas.microsoft.com/office/drawing/2016/ink" xmlns:am3d="http://schemas.microsoft.com/office/drawing/2017/model3d" xmlns:o="urn:schemas-microsoft-com:office:office" xmlns:oel="http://schemas.microsoft.com/office/2019/extlst" xmlns:r="http://schemas.openxmlformats.org/officeDocument/2006/relationships" xmlns:m="http://schemas.openxmlformats.org/officeDocument/2006/math" xmlns:v="urn:schemas-microsoft-com:vml" xmlns:wp14="http://schemas.microsoft.com/office/word/2010/wordprocessingDrawing" xmlns:wp="http://schemas.openxmlformats.org/drawingml/2006/wordprocessingDrawing" xmlns:w10="urn:schemas-microsoft-com:office:word" xmlns:w="http://schemas.openxmlformats.org/wordprocessingml/2006/main" xmlns:w14="http://schemas.microsoft.com/office/word/2010/wordml" xmlns:w15="http://schemas.microsoft.com/office/word/2012/wordml" xmlns:w16cex="http://schemas.microsoft.com/office/word/2018/wordml/cex" xmlns:w16cid="http://schemas.microsoft.com/office/word/2016/wordml/cid" xmlns:w16="http://schemas.microsoft.com/office/word/2018/wordml" xmlns:w16sdtdh="http://schemas.microsoft.com/office/word/2020/wordml/sdtdatahash" xmlns:w16se="http://schemas.microsoft.com/office/word/2015/wordml/symex" xmlns:wpg="http://schemas.microsoft.com/office/word/2010/wordprocessingGroup" xmlns:wpi="http://schemas.microsoft.com/office/word/2010/wordprocessingInk" xmlns:wne="http://schemas.microsoft.com/office/word/2006/wordml" xmlns:wps="http://schemas.microsoft.com/office/word/2010/wordprocessingShape" mc:Ignorable="w14 w15 w16se w16cid w16 w16cex w16sdtdh wp14">
   <w:abstractNum w:abstractNumId="0" w15:restartNumberingAfterBreak="0">
     <w:nsid w:val="2BBA4CD2"/>
     <w:multiLevelType w:val="hybridMultilevel"/>
@@ -2389,7 +1924,7 @@
 </file>
 
 <file path=word/styles.xml><?xml version="1.0" encoding="utf-8"?>
-<w:styles xmlns:mc="http://schemas.openxmlformats.org/markup-compatibility/2006" xmlns:r="http://schemas.openxmlformats.org/officeDocument/2006/relationships" xmlns:w="http://schemas.openxmlformats.org/wordprocessingml/2006/main" xmlns:w14="http://schemas.microsoft.com/office/word/2010/wordml" xmlns:w15="http://schemas.microsoft.com/office/word/2012/wordml" xmlns:w16cex="http://schemas.microsoft.com/office/word/2018/wordml/cex" xmlns:w16cid="http://schemas.microsoft.com/office/word/2016/wordml/cid" xmlns:w16="http://schemas.microsoft.com/office/word/2018/wordml" xmlns:w16du="http://schemas.microsoft.com/office/word/2023/wordml/word16du" xmlns:w16sdtdh="http://schemas.microsoft.com/office/word/2020/wordml/sdtdatahash" xmlns:w16sdtfl="http://schemas.microsoft.com/office/word/2024/wordml/sdtformatlock" xmlns:w16se="http://schemas.microsoft.com/office/word/2015/wordml/symex" mc:Ignorable="w14 w15 w16se w16cid w16 w16cex w16sdtdh w16sdtfl w16du">
+<w:styles xmlns:mc="http://schemas.openxmlformats.org/markup-compatibility/2006" xmlns:r="http://schemas.openxmlformats.org/officeDocument/2006/relationships" xmlns:w="http://schemas.openxmlformats.org/wordprocessingml/2006/main" xmlns:w14="http://schemas.microsoft.com/office/word/2010/wordml" xmlns:w15="http://schemas.microsoft.com/office/word/2012/wordml" xmlns:w16cex="http://schemas.microsoft.com/office/word/2018/wordml/cex" xmlns:w16cid="http://schemas.microsoft.com/office/word/2016/wordml/cid" xmlns:w16="http://schemas.microsoft.com/office/word/2018/wordml" xmlns:w16sdtdh="http://schemas.microsoft.com/office/word/2020/wordml/sdtdatahash" xmlns:w16se="http://schemas.microsoft.com/office/word/2015/wordml/symex" mc:Ignorable="w14 w15 w16se w16cid w16 w16cex w16sdtdh">
   <w:docDefaults>
     <w:rPrDefault>
       <w:rPr>
@@ -2991,6 +2526,7 @@
   <w:style w:type="character" w:default="1" w:styleId="VarsaylanParagrafYazTipi">
     <w:name w:val="Default Paragraph Font"/>
     <w:uiPriority w:val="1"/>
+    <w:semiHidden/>
     <w:unhideWhenUsed/>
   </w:style>
   <w:style w:type="table" w:default="1" w:styleId="NormalTablo">
@@ -3302,6 +2838,41 @@
       <w:smallCaps/>
       <w:color w:val="0F4761" w:themeColor="accent1" w:themeShade="BF"/>
       <w:spacing w:val="5"/>
+    </w:rPr>
+  </w:style>
+  <w:style w:type="table" w:styleId="TabloKlavuzu">
+    <w:name w:val="Table Grid"/>
+    <w:basedOn w:val="NormalTablo"/>
+    <w:uiPriority w:val="39"/>
+    <w:rsid w:val="009D3440"/>
+    <w:pPr>
+      <w:spacing w:after="0" w:line="240" w:lineRule="auto"/>
+    </w:pPr>
+    <w:tblPr>
+      <w:tblBorders>
+        <w:top w:val="single" w:sz="4" w:space="0" w:color="auto"/>
+        <w:left w:val="single" w:sz="4" w:space="0" w:color="auto"/>
+        <w:bottom w:val="single" w:sz="4" w:space="0" w:color="auto"/>
+        <w:right w:val="single" w:sz="4" w:space="0" w:color="auto"/>
+        <w:insideH w:val="single" w:sz="4" w:space="0" w:color="auto"/>
+        <w:insideV w:val="single" w:sz="4" w:space="0" w:color="auto"/>
+      </w:tblBorders>
+    </w:tblPr>
+  </w:style>
+  <w:style w:type="paragraph" w:styleId="NormalWeb">
+    <w:name w:val="Normal (Web)"/>
+    <w:basedOn w:val="Normal"/>
+    <w:uiPriority w:val="99"/>
+    <w:unhideWhenUsed/>
+    <w:rsid w:val="0023728E"/>
+    <w:pPr>
+      <w:spacing w:before="100" w:beforeAutospacing="1" w:after="100" w:afterAutospacing="1" w:line="240" w:lineRule="auto"/>
+    </w:pPr>
+    <w:rPr>
+      <w:rFonts w:ascii="Times New Roman" w:eastAsia="Times New Roman" w:hAnsi="Times New Roman" w:cs="Times New Roman"/>
+      <w:kern w:val="0"/>
+      <w:lang w:eastAsia="tr-TR"/>
+      <w14:ligatures w14:val="none"/>
     </w:rPr>
   </w:style>
 </w:styles>

</xml_diff>

<commit_message>
Tasarım dökümanında iyileştirmeler yapıldı.
</commit_message>
<xml_diff>
--- a/docs/Design Document.docx
+++ b/docs/Design Document.docx
@@ -40,27 +40,67 @@
     </w:p>
     <w:p>
       <w:r>
-        <w:t>2. ÜST SEVİYE BİLEŞEN YAPISI (COMPONENT DIAGRAM).....................2</w:t>
-      </w:r>
-    </w:p>
-    <w:p>
-      <w:r>
-        <w:t>3. BİLEŞENLER ARASI ARAYÜZLER VE PARAMETRELER (CLASS DIAGRAM).........3</w:t>
-      </w:r>
-    </w:p>
-    <w:p>
-      <w:r>
-        <w:t>4. FONKSİYONLARIN ÇALIŞMA AKIŞI (SEQUENCE DIAGRAM)...................4</w:t>
-      </w:r>
-    </w:p>
-    <w:p>
-      <w:r>
-        <w:t>5. SİSTEMİN DAĞITIMI (DEPLOYMENT DIAGRAM)............................5</w:t>
-      </w:r>
-    </w:p>
-    <w:p>
-      <w:r>
-        <w:t>6. GÖREV MATRİSİ (TASK MATRIX).......................................6</w:t>
+        <w:t xml:space="preserve">2. ÜST SEVİYE BİLEŞEN YAPISI (COMPONENT </w:t>
+      </w:r>
+      <w:proofErr w:type="gramStart"/>
+      <w:r>
+        <w:t>DIAGRAM).....................</w:t>
+      </w:r>
+      <w:proofErr w:type="gramEnd"/>
+      <w:r>
+        <w:t>2</w:t>
+      </w:r>
+    </w:p>
+    <w:p>
+      <w:r>
+        <w:t xml:space="preserve">3. BİLEŞENLER ARASI ARAYÜZLER VE PARAMETRELER (CLASS </w:t>
+      </w:r>
+      <w:proofErr w:type="gramStart"/>
+      <w:r>
+        <w:t>DIAGRAM).........</w:t>
+      </w:r>
+      <w:proofErr w:type="gramEnd"/>
+      <w:r>
+        <w:t>3</w:t>
+      </w:r>
+    </w:p>
+    <w:p>
+      <w:r>
+        <w:t xml:space="preserve">4. FONKSİYONLARIN ÇALIŞMA AKIŞI (SEQUENCE </w:t>
+      </w:r>
+      <w:proofErr w:type="gramStart"/>
+      <w:r>
+        <w:t>DIAGRAM)...................</w:t>
+      </w:r>
+      <w:proofErr w:type="gramEnd"/>
+      <w:r>
+        <w:t>4</w:t>
+      </w:r>
+    </w:p>
+    <w:p>
+      <w:r>
+        <w:t xml:space="preserve">5. SİSTEMİN DAĞITIMI (DEPLOYMENT </w:t>
+      </w:r>
+      <w:proofErr w:type="gramStart"/>
+      <w:r>
+        <w:t>DIAGRAM)............................</w:t>
+      </w:r>
+      <w:proofErr w:type="gramEnd"/>
+      <w:r>
+        <w:t>5</w:t>
+      </w:r>
+    </w:p>
+    <w:p>
+      <w:r>
+        <w:t xml:space="preserve">6. GÖREV MATRİSİ (TASK </w:t>
+      </w:r>
+      <w:proofErr w:type="gramStart"/>
+      <w:r>
+        <w:t>MATRIX).......................................</w:t>
+      </w:r>
+      <w:proofErr w:type="gramEnd"/>
+      <w:r>
+        <w:t>6</w:t>
       </w:r>
     </w:p>
     <w:p/>
@@ -85,8 +125,21 @@
       <w:pPr>
         <w:ind w:firstLine="708"/>
       </w:pPr>
-      <w:r>
-        <w:t>LibRA projesinde Katmanlı Mimari (Layered Architecture) tercih edilmiştir. Bu mimari, sistemin sürdürülebilirliğini artırmak, kodun yeniden kullanılabilirliğini sağlamak ve farklı sorumlulukları birbirinden net bir şekilde ayırmak amacıyla kullanılmıştır.</w:t>
+      <w:proofErr w:type="spellStart"/>
+      <w:r>
+        <w:t>LibRA</w:t>
+      </w:r>
+      <w:proofErr w:type="spellEnd"/>
+      <w:r>
+        <w:t xml:space="preserve"> projesinde Katmanlı Mimari (</w:t>
+      </w:r>
+      <w:proofErr w:type="spellStart"/>
+      <w:r>
+        <w:t>Layered</w:t>
+      </w:r>
+      <w:proofErr w:type="spellEnd"/>
+      <w:r>
+        <w:t xml:space="preserve"> Architecture) tercih edilmiştir. Bu mimari, sistemin sürdürülebilirliğini artırmak, kodun yeniden kullanılabilirliğini sağlamak ve farklı sorumlulukları birbirinden net bir şekilde ayırmak amacıyla kullanılmıştır.</w:t>
       </w:r>
     </w:p>
     <w:p/>
@@ -99,10 +152,42 @@
         </w:numPr>
       </w:pPr>
       <w:r>
-        <w:t>Sunum Katmanı (Presentation Layer): Kullanıcı etkileşimini yöneten katmandır. Web arayüzü (HTML/CSS/JS) bu katmanda yer alır.</w:t>
-      </w:r>
-      <w:r>
-        <w:t xml:space="preserve"> Bu dosyalar kullanıcı arayüzünü oluşturur ve API’a istek gönderir. Java Sprin Boot ve JPA ile hazırlanmış Controller sınıfları da bu katmanda yer alır. Arayüzden gelen istekleri karşılar ve ilgili Service katmanına yönlendirir.</w:t>
+        <w:t xml:space="preserve">Sunum Katmanı (Presentation </w:t>
+      </w:r>
+      <w:proofErr w:type="spellStart"/>
+      <w:r>
+        <w:t>Layer</w:t>
+      </w:r>
+      <w:proofErr w:type="spellEnd"/>
+      <w:r>
+        <w:t>): Kullanıcı etkileşimini yöneten katmandır. Web arayüzü (HTML/CSS/JS) bu katmanda yer alır.</w:t>
+      </w:r>
+      <w:r>
+        <w:t xml:space="preserve"> Bu dosyalar kullanıcı arayüzünü oluşturur ve </w:t>
+      </w:r>
+      <w:proofErr w:type="spellStart"/>
+      <w:r>
+        <w:t>API’a</w:t>
+      </w:r>
+      <w:proofErr w:type="spellEnd"/>
+      <w:r>
+        <w:t xml:space="preserve"> istek gönderir. Java </w:t>
+      </w:r>
+      <w:proofErr w:type="spellStart"/>
+      <w:r>
+        <w:t>Sprin</w:t>
+      </w:r>
+      <w:proofErr w:type="spellEnd"/>
+      <w:r>
+        <w:t xml:space="preserve"> </w:t>
+      </w:r>
+      <w:proofErr w:type="spellStart"/>
+      <w:r>
+        <w:t>Boot</w:t>
+      </w:r>
+      <w:proofErr w:type="spellEnd"/>
+      <w:r>
+        <w:t xml:space="preserve"> ve JPA ile hazırlanmış Controller sınıfları da bu katmanda yer alır. Arayüzden gelen istekleri karşılar ve ilgili Service katmanına yönlendirir.</w:t>
       </w:r>
     </w:p>
     <w:p/>
@@ -115,7 +200,31 @@
         </w:numPr>
       </w:pPr>
       <w:r>
-        <w:t>Uygulama/Servis Katmanı (Service Layer): Sistemin iş mantığının (business logic) yürütüldüğü katmandır. Ödünç alma kuralları, ceza hesaplama algoritmaları ve kullanıcı yetkilendirme süreçleri burada işlenir.</w:t>
+        <w:t xml:space="preserve">Uygulama/Servis Katmanı (Service </w:t>
+      </w:r>
+      <w:proofErr w:type="spellStart"/>
+      <w:r>
+        <w:t>Layer</w:t>
+      </w:r>
+      <w:proofErr w:type="spellEnd"/>
+      <w:r>
+        <w:t>): Sistemin iş mantığının (</w:t>
+      </w:r>
+      <w:proofErr w:type="spellStart"/>
+      <w:r>
+        <w:t>business</w:t>
+      </w:r>
+      <w:proofErr w:type="spellEnd"/>
+      <w:r>
+        <w:t xml:space="preserve"> </w:t>
+      </w:r>
+      <w:proofErr w:type="spellStart"/>
+      <w:r>
+        <w:t>logic</w:t>
+      </w:r>
+      <w:proofErr w:type="spellEnd"/>
+      <w:r>
+        <w:t>) yürütüldüğü katmandır. Ödünç alma kuralları, ceza hesaplama algoritmaları ve kullanıcı yetkilendirme süreçleri burada işlenir.</w:t>
       </w:r>
       <w:r>
         <w:t xml:space="preserve"> Java Service </w:t>
@@ -142,15 +251,62 @@
       <w:r>
         <w:t>(</w:t>
       </w:r>
-      <w:r>
-        <w:t>Repository Layer): İş mantığı ile veritabanı arasındaki köprüdür. MySQL veritabanına yönelik sorguların yürütüldüğü katmandır.</w:t>
-      </w:r>
-      <w:r>
-        <w:t xml:space="preserve"> JPA kullanarak veri tabanına SQL sorguları gönermekten sorumludur. Repository </w:t>
-      </w:r>
+      <w:proofErr w:type="spellStart"/>
+      <w:r>
+        <w:t>Repository</w:t>
+      </w:r>
+      <w:proofErr w:type="spellEnd"/>
+      <w:r>
+        <w:t xml:space="preserve"> </w:t>
+      </w:r>
+      <w:proofErr w:type="spellStart"/>
+      <w:r>
+        <w:t>Layer</w:t>
+      </w:r>
+      <w:proofErr w:type="spellEnd"/>
+      <w:r>
+        <w:t xml:space="preserve">): İş mantığı ile </w:t>
+      </w:r>
+      <w:proofErr w:type="spellStart"/>
+      <w:r>
+        <w:t>veritabanı</w:t>
+      </w:r>
+      <w:proofErr w:type="spellEnd"/>
+      <w:r>
+        <w:t xml:space="preserve"> arasındaki köprüdür. MySQL </w:t>
+      </w:r>
+      <w:proofErr w:type="spellStart"/>
+      <w:r>
+        <w:t>veritabanına</w:t>
+      </w:r>
+      <w:proofErr w:type="spellEnd"/>
+      <w:r>
+        <w:t xml:space="preserve"> yönelik sorguların yürütüldüğü katmandır.</w:t>
+      </w:r>
+      <w:r>
+        <w:t xml:space="preserve"> JPA kullanarak veri tabanına SQL sorguları </w:t>
+      </w:r>
+      <w:proofErr w:type="spellStart"/>
+      <w:r>
+        <w:t>gönermekten</w:t>
+      </w:r>
+      <w:proofErr w:type="spellEnd"/>
+      <w:r>
+        <w:t xml:space="preserve"> sorumludur. </w:t>
+      </w:r>
+      <w:proofErr w:type="spellStart"/>
+      <w:r>
+        <w:t>Repository</w:t>
+      </w:r>
+      <w:proofErr w:type="spellEnd"/>
+      <w:r>
+        <w:t xml:space="preserve"> </w:t>
+      </w:r>
+      <w:proofErr w:type="spellStart"/>
       <w:r>
         <w:t>interface’lerinden</w:t>
       </w:r>
+      <w:proofErr w:type="spellEnd"/>
       <w:r>
         <w:t xml:space="preserve"> oluşur.</w:t>
       </w:r>
@@ -181,8 +337,21 @@
           <w:numId w:val="2"/>
         </w:numPr>
       </w:pPr>
-      <w:r>
-        <w:t>Entity Katmanı: Veri tabanındaki tabloları Java sınıflarının tanımasını sağlayan Entity sınıfları, Book.java User.java gibi dosyalardan oluşur.</w:t>
+      <w:proofErr w:type="spellStart"/>
+      <w:r>
+        <w:t>Entity</w:t>
+      </w:r>
+      <w:proofErr w:type="spellEnd"/>
+      <w:r>
+        <w:t xml:space="preserve"> Katmanı: Veri tabanındaki tabloları Java sınıflarının tanımasını sağlayan </w:t>
+      </w:r>
+      <w:proofErr w:type="spellStart"/>
+      <w:r>
+        <w:t>Entity</w:t>
+      </w:r>
+      <w:proofErr w:type="spellEnd"/>
+      <w:r>
+        <w:t xml:space="preserve"> sınıfları, Book.java User.java gibi dosyalardan oluşur.</w:t>
       </w:r>
     </w:p>
     <w:p/>
@@ -249,7 +418,15 @@
         <w:ind w:firstLine="708"/>
       </w:pPr>
       <w:r>
-        <w:t>Sistem, modüler bir yapıda tasarlanmış olup bileşenler birbirleriyle API/Interface düzeyinde haberleşir.</w:t>
+        <w:t>Sistem, modüler bir yapıda tasarlanmış olup bileşenler birbirleriyle API/</w:t>
+      </w:r>
+      <w:proofErr w:type="spellStart"/>
+      <w:r>
+        <w:t>Interface</w:t>
+      </w:r>
+      <w:proofErr w:type="spellEnd"/>
+      <w:r>
+        <w:t xml:space="preserve"> düzeyinde haberleşir.</w:t>
       </w:r>
     </w:p>
     <w:p/>
@@ -265,29 +442,71 @@
     </w:p>
     <w:p>
       <w:r>
-        <w:t>- REST API:</w:t>
-      </w:r>
-      <w:r>
-        <w:t xml:space="preserve"> UI ile backend modülleri arasındaki yönlendirmeyi sağlayan arayüz</w:t>
-      </w:r>
-      <w:r>
-        <w:t>.</w:t>
-      </w:r>
-    </w:p>
-    <w:p>
-      <w:r>
-        <w:t>- Auth Module: Kullanıcı kayıt, giriş ve yetkilendirme (Admin/User) işlemlerinden sorumludur.</w:t>
-      </w:r>
-    </w:p>
-    <w:p>
-      <w:r>
-        <w:t>- Search Engine</w:t>
-      </w:r>
-      <w:r>
-        <w:t xml:space="preserve"> (Book Service)</w:t>
-      </w:r>
-      <w:r>
-        <w:t>: MySQL veritabanı üzerinde kompleks arama ve filtreleme işlemlerini yönetir.</w:t>
+        <w:t xml:space="preserve">- REST API: UI ile </w:t>
+      </w:r>
+      <w:proofErr w:type="spellStart"/>
+      <w:r>
+        <w:t>backend</w:t>
+      </w:r>
+      <w:proofErr w:type="spellEnd"/>
+      <w:r>
+        <w:t xml:space="preserve"> modülleri arasındaki yönlendirmeyi sağlayan arayüz.</w:t>
+      </w:r>
+    </w:p>
+    <w:p>
+      <w:r>
+        <w:t xml:space="preserve">- </w:t>
+      </w:r>
+      <w:proofErr w:type="spellStart"/>
+      <w:r>
+        <w:t>Auth</w:t>
+      </w:r>
+      <w:proofErr w:type="spellEnd"/>
+      <w:r>
+        <w:t xml:space="preserve"> </w:t>
+      </w:r>
+      <w:proofErr w:type="spellStart"/>
+      <w:r>
+        <w:t>Module</w:t>
+      </w:r>
+      <w:proofErr w:type="spellEnd"/>
+      <w:r>
+        <w:t>: Kullanıcı kayıt, giriş ve yetkilendirme (Admin/User) işlemlerinden sorumludur.</w:t>
+      </w:r>
+    </w:p>
+    <w:p>
+      <w:r>
+        <w:t xml:space="preserve">- </w:t>
+      </w:r>
+      <w:proofErr w:type="spellStart"/>
+      <w:r>
+        <w:t>Search</w:t>
+      </w:r>
+      <w:proofErr w:type="spellEnd"/>
+      <w:r>
+        <w:t xml:space="preserve"> Engine</w:t>
+      </w:r>
+      <w:r>
+        <w:t xml:space="preserve"> (</w:t>
+      </w:r>
+      <w:proofErr w:type="spellStart"/>
+      <w:r>
+        <w:t>Book</w:t>
+      </w:r>
+      <w:proofErr w:type="spellEnd"/>
+      <w:r>
+        <w:t xml:space="preserve"> Service)</w:t>
+      </w:r>
+      <w:r>
+        <w:t xml:space="preserve">: MySQL </w:t>
+      </w:r>
+      <w:proofErr w:type="spellStart"/>
+      <w:r>
+        <w:t>veritabanı</w:t>
+      </w:r>
+      <w:proofErr w:type="spellEnd"/>
+      <w:r>
+        <w:t xml:space="preserve"> üzerinde kompleks arama ve filtreleme işlemlerini yönetir.</w:t>
       </w:r>
     </w:p>
     <w:p>
@@ -297,12 +516,28 @@
     </w:p>
     <w:p>
       <w:r>
-        <w:t>- Borrowing Service: Kitap ödünç alma ve iade işlemlerinin kontrolünü sağlar.</w:t>
-      </w:r>
-    </w:p>
-    <w:p>
-      <w:r>
-        <w:t>- Penalty Service: Geciken iadeler için sistem tarihine göre otomatik ceza hesaplaması yapar.</w:t>
+        <w:t xml:space="preserve">- </w:t>
+      </w:r>
+      <w:proofErr w:type="spellStart"/>
+      <w:r>
+        <w:t>Borrowing</w:t>
+      </w:r>
+      <w:proofErr w:type="spellEnd"/>
+      <w:r>
+        <w:t xml:space="preserve"> Service: Kitap ödünç alma ve iade işlemlerinin kontrolünü sağlar.</w:t>
+      </w:r>
+    </w:p>
+    <w:p>
+      <w:r>
+        <w:t xml:space="preserve">- </w:t>
+      </w:r>
+      <w:proofErr w:type="spellStart"/>
+      <w:r>
+        <w:t>Penalty</w:t>
+      </w:r>
+      <w:proofErr w:type="spellEnd"/>
+      <w:r>
+        <w:t xml:space="preserve"> Service: Geciken iadeler için sistem tarihine göre otomatik ceza hesaplaması yapar.</w:t>
       </w:r>
     </w:p>
     <w:p/>
@@ -361,7 +596,39 @@
                 <w:b/>
                 <w:bCs/>
               </w:rPr>
-              <w:t>Arayüz (Interface/Method)</w:t>
+              <w:t>Arayüz (</w:t>
+            </w:r>
+            <w:proofErr w:type="spellStart"/>
+            <w:r>
+              <w:rPr>
+                <w:b/>
+                <w:bCs/>
+              </w:rPr>
+              <w:t>Interface</w:t>
+            </w:r>
+            <w:proofErr w:type="spellEnd"/>
+            <w:r>
+              <w:rPr>
+                <w:b/>
+                <w:bCs/>
+              </w:rPr>
+              <w:t>/</w:t>
+            </w:r>
+            <w:proofErr w:type="spellStart"/>
+            <w:r>
+              <w:rPr>
+                <w:b/>
+                <w:bCs/>
+              </w:rPr>
+              <w:t>Method</w:t>
+            </w:r>
+            <w:proofErr w:type="spellEnd"/>
+            <w:r>
+              <w:rPr>
+                <w:b/>
+                <w:bCs/>
+              </w:rPr>
+              <w:t>)</w:t>
             </w:r>
           </w:p>
         </w:tc>
@@ -384,12 +651,21 @@
             <w:hideMark/>
           </w:tcPr>
           <w:p>
+            <w:proofErr w:type="spellStart"/>
             <w:r>
               <w:rPr>
                 <w:b/>
                 <w:bCs/>
               </w:rPr>
-              <w:t>Input Parametreleri</w:t>
+              <w:t>Input</w:t>
+            </w:r>
+            <w:proofErr w:type="spellEnd"/>
+            <w:r>
+              <w:rPr>
+                <w:b/>
+                <w:bCs/>
+              </w:rPr>
+              <w:t xml:space="preserve"> Parametreleri</w:t>
             </w:r>
           </w:p>
         </w:tc>
@@ -412,12 +688,21 @@
             <w:hideMark/>
           </w:tcPr>
           <w:p>
+            <w:proofErr w:type="spellStart"/>
             <w:r>
               <w:rPr>
                 <w:b/>
                 <w:bCs/>
               </w:rPr>
-              <w:t>Output / Return</w:t>
+              <w:t>Output</w:t>
+            </w:r>
+            <w:proofErr w:type="spellEnd"/>
+            <w:r>
+              <w:rPr>
+                <w:b/>
+                <w:bCs/>
+              </w:rPr>
+              <w:t xml:space="preserve"> / Return</w:t>
             </w:r>
           </w:p>
         </w:tc>
@@ -445,12 +730,37 @@
             <w:hideMark/>
           </w:tcPr>
           <w:p>
+            <w:proofErr w:type="gramStart"/>
             <w:r>
               <w:rPr>
                 <w:b/>
                 <w:bCs/>
               </w:rPr>
-              <w:t>login(credentials)</w:t>
+              <w:t>login</w:t>
+            </w:r>
+            <w:proofErr w:type="gramEnd"/>
+            <w:r>
+              <w:rPr>
+                <w:b/>
+                <w:bCs/>
+              </w:rPr>
+              <w:t>(</w:t>
+            </w:r>
+            <w:proofErr w:type="spellStart"/>
+            <w:r>
+              <w:rPr>
+                <w:b/>
+                <w:bCs/>
+              </w:rPr>
+              <w:t>credentials</w:t>
+            </w:r>
+            <w:proofErr w:type="spellEnd"/>
+            <w:r>
+              <w:rPr>
+                <w:b/>
+                <w:bCs/>
+              </w:rPr>
+              <w:t>)</w:t>
             </w:r>
           </w:p>
         </w:tc>
@@ -473,8 +783,39 @@
             <w:hideMark/>
           </w:tcPr>
           <w:p>
-            <w:r>
-              <w:t xml:space="preserve">username (String), password (String) </w:t>
+            <w:proofErr w:type="spellStart"/>
+            <w:proofErr w:type="gramStart"/>
+            <w:r>
+              <w:t>username</w:t>
+            </w:r>
+            <w:proofErr w:type="spellEnd"/>
+            <w:proofErr w:type="gramEnd"/>
+            <w:r>
+              <w:t xml:space="preserve"> (</w:t>
+            </w:r>
+            <w:proofErr w:type="spellStart"/>
+            <w:r>
+              <w:t>String</w:t>
+            </w:r>
+            <w:proofErr w:type="spellEnd"/>
+            <w:r>
+              <w:t xml:space="preserve">), </w:t>
+            </w:r>
+            <w:proofErr w:type="spellStart"/>
+            <w:r>
+              <w:t>password</w:t>
+            </w:r>
+            <w:proofErr w:type="spellEnd"/>
+            <w:r>
+              <w:t xml:space="preserve"> (</w:t>
+            </w:r>
+            <w:proofErr w:type="spellStart"/>
+            <w:r>
+              <w:t>String</w:t>
+            </w:r>
+            <w:proofErr w:type="spellEnd"/>
+            <w:r>
+              <w:t xml:space="preserve">) </w:t>
             </w:r>
           </w:p>
         </w:tc>
@@ -497,9 +838,19 @@
             <w:hideMark/>
           </w:tcPr>
           <w:p>
-            <w:r>
-              <w:t>AuthToken veya ErrorMessage</w:t>
-            </w:r>
+            <w:proofErr w:type="spellStart"/>
+            <w:r>
+              <w:t>AuthToken</w:t>
+            </w:r>
+            <w:proofErr w:type="spellEnd"/>
+            <w:r>
+              <w:t xml:space="preserve"> veya </w:t>
+            </w:r>
+            <w:proofErr w:type="spellStart"/>
+            <w:r>
+              <w:t>ErrorMessage</w:t>
+            </w:r>
+            <w:proofErr w:type="spellEnd"/>
           </w:p>
         </w:tc>
       </w:tr>
@@ -526,12 +877,39 @@
             <w:hideMark/>
           </w:tcPr>
           <w:p>
+            <w:proofErr w:type="spellStart"/>
+            <w:proofErr w:type="gramStart"/>
             <w:r>
               <w:rPr>
                 <w:b/>
                 <w:bCs/>
               </w:rPr>
-              <w:t>searchBooks(query)</w:t>
+              <w:t>searchBooks</w:t>
+            </w:r>
+            <w:proofErr w:type="spellEnd"/>
+            <w:proofErr w:type="gramEnd"/>
+            <w:r>
+              <w:rPr>
+                <w:b/>
+                <w:bCs/>
+              </w:rPr>
+              <w:t>(</w:t>
+            </w:r>
+            <w:proofErr w:type="spellStart"/>
+            <w:r>
+              <w:rPr>
+                <w:b/>
+                <w:bCs/>
+              </w:rPr>
+              <w:t>query</w:t>
+            </w:r>
+            <w:proofErr w:type="spellEnd"/>
+            <w:r>
+              <w:rPr>
+                <w:b/>
+                <w:bCs/>
+              </w:rPr>
+              <w:t>)</w:t>
             </w:r>
           </w:p>
         </w:tc>
@@ -554,8 +932,39 @@
             <w:hideMark/>
           </w:tcPr>
           <w:p>
-            <w:r>
-              <w:t xml:space="preserve">keyword (String), category (String) </w:t>
+            <w:proofErr w:type="spellStart"/>
+            <w:proofErr w:type="gramStart"/>
+            <w:r>
+              <w:t>keyword</w:t>
+            </w:r>
+            <w:proofErr w:type="spellEnd"/>
+            <w:proofErr w:type="gramEnd"/>
+            <w:r>
+              <w:t xml:space="preserve"> (</w:t>
+            </w:r>
+            <w:proofErr w:type="spellStart"/>
+            <w:r>
+              <w:t>String</w:t>
+            </w:r>
+            <w:proofErr w:type="spellEnd"/>
+            <w:r>
+              <w:t xml:space="preserve">), </w:t>
+            </w:r>
+            <w:proofErr w:type="spellStart"/>
+            <w:r>
+              <w:t>category</w:t>
+            </w:r>
+            <w:proofErr w:type="spellEnd"/>
+            <w:r>
+              <w:t xml:space="preserve"> (</w:t>
+            </w:r>
+            <w:proofErr w:type="spellStart"/>
+            <w:r>
+              <w:t>String</w:t>
+            </w:r>
+            <w:proofErr w:type="spellEnd"/>
+            <w:r>
+              <w:t xml:space="preserve">) </w:t>
             </w:r>
           </w:p>
         </w:tc>
@@ -578,8 +987,21 @@
             <w:hideMark/>
           </w:tcPr>
           <w:p>
-            <w:r>
-              <w:t xml:space="preserve">List&lt;BookObject&gt; </w:t>
+            <w:proofErr w:type="spellStart"/>
+            <w:r>
+              <w:t>List</w:t>
+            </w:r>
+            <w:proofErr w:type="spellEnd"/>
+            <w:r>
+              <w:t>&lt;</w:t>
+            </w:r>
+            <w:proofErr w:type="spellStart"/>
+            <w:r>
+              <w:t>BookObject</w:t>
+            </w:r>
+            <w:proofErr w:type="spellEnd"/>
+            <w:r>
+              <w:t xml:space="preserve">&gt; </w:t>
             </w:r>
           </w:p>
         </w:tc>
@@ -607,13 +1029,24 @@
             <w:hideMark/>
           </w:tcPr>
           <w:p>
+            <w:proofErr w:type="spellStart"/>
+            <w:proofErr w:type="gramStart"/>
             <w:r>
               <w:rPr>
                 <w:b/>
                 <w:bCs/>
               </w:rPr>
               <w:lastRenderedPageBreak/>
-              <w:t>borrowBook(id)</w:t>
+              <w:t>borrowBook</w:t>
+            </w:r>
+            <w:proofErr w:type="spellEnd"/>
+            <w:proofErr w:type="gramEnd"/>
+            <w:r>
+              <w:rPr>
+                <w:b/>
+                <w:bCs/>
+              </w:rPr>
+              <w:t>(id)</w:t>
             </w:r>
           </w:p>
         </w:tc>
@@ -636,8 +1069,39 @@
             <w:hideMark/>
           </w:tcPr>
           <w:p>
-            <w:r>
-              <w:t xml:space="preserve">userId (Int), bookId (Int) </w:t>
+            <w:proofErr w:type="spellStart"/>
+            <w:proofErr w:type="gramStart"/>
+            <w:r>
+              <w:t>userId</w:t>
+            </w:r>
+            <w:proofErr w:type="spellEnd"/>
+            <w:proofErr w:type="gramEnd"/>
+            <w:r>
+              <w:t xml:space="preserve"> (</w:t>
+            </w:r>
+            <w:proofErr w:type="spellStart"/>
+            <w:r>
+              <w:t>Int</w:t>
+            </w:r>
+            <w:proofErr w:type="spellEnd"/>
+            <w:r>
+              <w:t xml:space="preserve">), </w:t>
+            </w:r>
+            <w:proofErr w:type="spellStart"/>
+            <w:r>
+              <w:t>bookId</w:t>
+            </w:r>
+            <w:proofErr w:type="spellEnd"/>
+            <w:r>
+              <w:t xml:space="preserve"> (</w:t>
+            </w:r>
+            <w:proofErr w:type="spellStart"/>
+            <w:r>
+              <w:t>Int</w:t>
+            </w:r>
+            <w:proofErr w:type="spellEnd"/>
+            <w:r>
+              <w:t xml:space="preserve">) </w:t>
             </w:r>
           </w:p>
         </w:tc>
@@ -660,8 +1124,13 @@
             <w:hideMark/>
           </w:tcPr>
           <w:p>
-            <w:r>
-              <w:t xml:space="preserve">Status </w:t>
+            <w:proofErr w:type="spellStart"/>
+            <w:r>
+              <w:t>Status</w:t>
+            </w:r>
+            <w:proofErr w:type="spellEnd"/>
+            <w:r>
+              <w:t xml:space="preserve"> </w:t>
             </w:r>
           </w:p>
         </w:tc>
@@ -689,12 +1158,23 @@
             <w:hideMark/>
           </w:tcPr>
           <w:p>
+            <w:proofErr w:type="spellStart"/>
+            <w:proofErr w:type="gramStart"/>
             <w:r>
               <w:rPr>
                 <w:b/>
                 <w:bCs/>
               </w:rPr>
-              <w:t>calculatePenalty(id)</w:t>
+              <w:t>calculatePenalty</w:t>
+            </w:r>
+            <w:proofErr w:type="spellEnd"/>
+            <w:proofErr w:type="gramEnd"/>
+            <w:r>
+              <w:rPr>
+                <w:b/>
+                <w:bCs/>
+              </w:rPr>
+              <w:t>(id)</w:t>
             </w:r>
           </w:p>
         </w:tc>
@@ -717,8 +1197,39 @@
             <w:hideMark/>
           </w:tcPr>
           <w:p>
-            <w:r>
-              <w:t xml:space="preserve">transactionId (Int), currentDate (Date) </w:t>
+            <w:proofErr w:type="spellStart"/>
+            <w:proofErr w:type="gramStart"/>
+            <w:r>
+              <w:t>transactionId</w:t>
+            </w:r>
+            <w:proofErr w:type="spellEnd"/>
+            <w:proofErr w:type="gramEnd"/>
+            <w:r>
+              <w:t xml:space="preserve"> (</w:t>
+            </w:r>
+            <w:proofErr w:type="spellStart"/>
+            <w:r>
+              <w:t>Int</w:t>
+            </w:r>
+            <w:proofErr w:type="spellEnd"/>
+            <w:r>
+              <w:t xml:space="preserve">), </w:t>
+            </w:r>
+            <w:proofErr w:type="spellStart"/>
+            <w:r>
+              <w:t>currentDate</w:t>
+            </w:r>
+            <w:proofErr w:type="spellEnd"/>
+            <w:r>
+              <w:t xml:space="preserve"> (</w:t>
+            </w:r>
+            <w:proofErr w:type="spellStart"/>
+            <w:r>
+              <w:t>Date</w:t>
+            </w:r>
+            <w:proofErr w:type="spellEnd"/>
+            <w:r>
+              <w:t xml:space="preserve">) </w:t>
             </w:r>
           </w:p>
         </w:tc>
@@ -741,8 +1252,23 @@
             <w:hideMark/>
           </w:tcPr>
           <w:p>
-            <w:r>
-              <w:t xml:space="preserve">penaltyAmount (Double) </w:t>
+            <w:proofErr w:type="spellStart"/>
+            <w:proofErr w:type="gramStart"/>
+            <w:r>
+              <w:t>penaltyAmount</w:t>
+            </w:r>
+            <w:proofErr w:type="spellEnd"/>
+            <w:proofErr w:type="gramEnd"/>
+            <w:r>
+              <w:t xml:space="preserve"> (</w:t>
+            </w:r>
+            <w:proofErr w:type="spellStart"/>
+            <w:r>
+              <w:t>Double</w:t>
+            </w:r>
+            <w:proofErr w:type="spellEnd"/>
+            <w:r>
+              <w:t xml:space="preserve">) </w:t>
             </w:r>
           </w:p>
         </w:tc>
@@ -758,7 +1284,71 @@
         <w:t>Veri Yapıları:</w:t>
       </w:r>
       <w:r>
-        <w:t xml:space="preserve"> User (id, name, role), Book (id, title, author, stock), Transaction (id, userId, bookId, dueDate) sınıflarını içerir.</w:t>
+        <w:t xml:space="preserve"> User (id, name, role), </w:t>
+      </w:r>
+      <w:proofErr w:type="spellStart"/>
+      <w:r>
+        <w:t>Book</w:t>
+      </w:r>
+      <w:proofErr w:type="spellEnd"/>
+      <w:r>
+        <w:t xml:space="preserve"> (id, </w:t>
+      </w:r>
+      <w:proofErr w:type="spellStart"/>
+      <w:r>
+        <w:t>title</w:t>
+      </w:r>
+      <w:proofErr w:type="spellEnd"/>
+      <w:r>
+        <w:t xml:space="preserve">, </w:t>
+      </w:r>
+      <w:proofErr w:type="spellStart"/>
+      <w:r>
+        <w:t>author</w:t>
+      </w:r>
+      <w:proofErr w:type="spellEnd"/>
+      <w:r>
+        <w:t xml:space="preserve">, </w:t>
+      </w:r>
+      <w:proofErr w:type="spellStart"/>
+      <w:r>
+        <w:t>stock</w:t>
+      </w:r>
+      <w:proofErr w:type="spellEnd"/>
+      <w:r>
+        <w:t xml:space="preserve">), </w:t>
+      </w:r>
+      <w:proofErr w:type="spellStart"/>
+      <w:r>
+        <w:t>Transaction</w:t>
+      </w:r>
+      <w:proofErr w:type="spellEnd"/>
+      <w:r>
+        <w:t xml:space="preserve"> (id, </w:t>
+      </w:r>
+      <w:proofErr w:type="spellStart"/>
+      <w:r>
+        <w:t>userId</w:t>
+      </w:r>
+      <w:proofErr w:type="spellEnd"/>
+      <w:r>
+        <w:t xml:space="preserve">, </w:t>
+      </w:r>
+      <w:proofErr w:type="spellStart"/>
+      <w:r>
+        <w:t>bookId</w:t>
+      </w:r>
+      <w:proofErr w:type="spellEnd"/>
+      <w:r>
+        <w:t xml:space="preserve">, </w:t>
+      </w:r>
+      <w:proofErr w:type="spellStart"/>
+      <w:r>
+        <w:t>dueDate</w:t>
+      </w:r>
+      <w:proofErr w:type="spellEnd"/>
+      <w:r>
+        <w:t>) sınıflarını içerir.</w:t>
       </w:r>
     </w:p>
     <w:p>
@@ -766,21 +1356,78 @@
         <w:rPr>
           <w:b/>
           <w:bCs/>
+          <w:sz w:val="28"/>
+          <w:szCs w:val="28"/>
         </w:rPr>
       </w:pPr>
       <w:r>
         <w:rPr>
           <w:b/>
           <w:bCs/>
+          <w:sz w:val="28"/>
+          <w:szCs w:val="28"/>
         </w:rPr>
-        <w:t>Projenin çalışır hale gelmesi için tasarlanması gereken minimun classlar</w:t>
-      </w:r>
+        <w:t xml:space="preserve">Projenin çalışır hale gelmesi için tasarlanması gereken </w:t>
+      </w:r>
+      <w:proofErr w:type="spellStart"/>
       <w:r>
         <w:rPr>
           <w:b/>
           <w:bCs/>
+          <w:sz w:val="28"/>
+          <w:szCs w:val="28"/>
         </w:rPr>
-        <w:t>. İlk sprintte implement edilecekler.</w:t>
+        <w:t>minimun</w:t>
+      </w:r>
+      <w:proofErr w:type="spellEnd"/>
+      <w:r>
+        <w:rPr>
+          <w:b/>
+          <w:bCs/>
+          <w:sz w:val="28"/>
+          <w:szCs w:val="28"/>
+        </w:rPr>
+        <w:t xml:space="preserve"> </w:t>
+      </w:r>
+      <w:proofErr w:type="spellStart"/>
+      <w:r>
+        <w:rPr>
+          <w:b/>
+          <w:bCs/>
+          <w:sz w:val="28"/>
+          <w:szCs w:val="28"/>
+        </w:rPr>
+        <w:t>classlar</w:t>
+      </w:r>
+      <w:proofErr w:type="spellEnd"/>
+      <w:r>
+        <w:rPr>
+          <w:b/>
+          <w:bCs/>
+          <w:sz w:val="28"/>
+          <w:szCs w:val="28"/>
+        </w:rPr>
+        <w:t xml:space="preserve">. İlk sprintte </w:t>
+      </w:r>
+      <w:proofErr w:type="spellStart"/>
+      <w:r>
+        <w:rPr>
+          <w:b/>
+          <w:bCs/>
+          <w:sz w:val="28"/>
+          <w:szCs w:val="28"/>
+        </w:rPr>
+        <w:t>implement</w:t>
+      </w:r>
+      <w:proofErr w:type="spellEnd"/>
+      <w:r>
+        <w:rPr>
+          <w:b/>
+          <w:bCs/>
+          <w:sz w:val="28"/>
+          <w:szCs w:val="28"/>
+        </w:rPr>
+        <w:t xml:space="preserve"> edilecekler.</w:t>
       </w:r>
     </w:p>
     <w:p>
@@ -843,11 +1490,636 @@
     </w:p>
     <w:p>
       <w:pPr>
+        <w:rPr>
+          <w:b/>
+          <w:bCs/>
+          <w:sz w:val="28"/>
+          <w:szCs w:val="28"/>
+        </w:rPr>
+      </w:pPr>
+      <w:r>
+        <w:rPr>
+          <w:b/>
+          <w:bCs/>
+          <w:sz w:val="28"/>
+          <w:szCs w:val="28"/>
+        </w:rPr>
+        <w:lastRenderedPageBreak/>
+        <w:t xml:space="preserve">Arama stratejilerinin ayrı sınıflarda çözülmesi için projeye eklenecek </w:t>
+      </w:r>
+      <w:proofErr w:type="spellStart"/>
+      <w:r>
+        <w:rPr>
+          <w:b/>
+          <w:bCs/>
+          <w:sz w:val="28"/>
+          <w:szCs w:val="28"/>
+        </w:rPr>
+        <w:t>ISearchStrategy</w:t>
+      </w:r>
+      <w:proofErr w:type="spellEnd"/>
+      <w:r>
+        <w:rPr>
+          <w:b/>
+          <w:bCs/>
+          <w:sz w:val="28"/>
+          <w:szCs w:val="28"/>
+        </w:rPr>
+        <w:t xml:space="preserve"> </w:t>
+      </w:r>
+      <w:proofErr w:type="spellStart"/>
+      <w:r>
+        <w:rPr>
+          <w:b/>
+          <w:bCs/>
+          <w:sz w:val="28"/>
+          <w:szCs w:val="28"/>
+        </w:rPr>
+        <w:t>interface’i</w:t>
+      </w:r>
+      <w:proofErr w:type="spellEnd"/>
+      <w:r>
+        <w:rPr>
+          <w:b/>
+          <w:bCs/>
+          <w:sz w:val="28"/>
+          <w:szCs w:val="28"/>
+        </w:rPr>
+        <w:t>.</w:t>
+      </w:r>
+    </w:p>
+    <w:p>
+      <w:pPr>
         <w:pStyle w:val="NormalWeb"/>
       </w:pPr>
-    </w:p>
-    <w:p>
-      <w:r>
+      <w:r>
+        <w:rPr>
+          <w:noProof/>
+        </w:rPr>
+        <w:drawing>
+          <wp:inline distT="0" distB="0" distL="0" distR="0" wp14:anchorId="2D96C9D5" wp14:editId="00CA3538">
+            <wp:extent cx="6509091" cy="1187450"/>
+            <wp:effectExtent l="0" t="0" r="6350" b="0"/>
+            <wp:docPr id="1" name="Resim 1"/>
+            <wp:cNvGraphicFramePr>
+              <a:graphicFrameLocks xmlns:a="http://schemas.openxmlformats.org/drawingml/2006/main" noChangeAspect="1"/>
+            </wp:cNvGraphicFramePr>
+            <a:graphic xmlns:a="http://schemas.openxmlformats.org/drawingml/2006/main">
+              <a:graphicData uri="http://schemas.openxmlformats.org/drawingml/2006/picture">
+                <pic:pic xmlns:pic="http://schemas.openxmlformats.org/drawingml/2006/picture">
+                  <pic:nvPicPr>
+                    <pic:cNvPr id="0" name="Picture 1"/>
+                    <pic:cNvPicPr>
+                      <a:picLocks noChangeAspect="1" noChangeArrowheads="1"/>
+                    </pic:cNvPicPr>
+                  </pic:nvPicPr>
+                  <pic:blipFill>
+                    <a:blip r:embed="rId7" cstate="print">
+                      <a:extLst>
+                        <a:ext uri="{28A0092B-C50C-407E-A947-70E740481C1C}">
+                          <a14:useLocalDpi xmlns:a14="http://schemas.microsoft.com/office/drawing/2010/main" val="0"/>
+                        </a:ext>
+                      </a:extLst>
+                    </a:blip>
+                    <a:srcRect/>
+                    <a:stretch>
+                      <a:fillRect/>
+                    </a:stretch>
+                  </pic:blipFill>
+                  <pic:spPr bwMode="auto">
+                    <a:xfrm>
+                      <a:off x="0" y="0"/>
+                      <a:ext cx="6520393" cy="1189512"/>
+                    </a:xfrm>
+                    <a:prstGeom prst="rect">
+                      <a:avLst/>
+                    </a:prstGeom>
+                    <a:noFill/>
+                    <a:ln>
+                      <a:noFill/>
+                    </a:ln>
+                  </pic:spPr>
+                </pic:pic>
+              </a:graphicData>
+            </a:graphic>
+          </wp:inline>
+        </w:drawing>
+      </w:r>
+    </w:p>
+    <w:p>
+      <w:pPr>
+        <w:rPr>
+          <w:b/>
+          <w:bCs/>
+          <w:sz w:val="28"/>
+          <w:szCs w:val="28"/>
+        </w:rPr>
+      </w:pPr>
+      <w:r>
+        <w:rPr>
+          <w:b/>
+          <w:bCs/>
+          <w:sz w:val="28"/>
+          <w:szCs w:val="28"/>
+        </w:rPr>
+        <w:t xml:space="preserve">Projenin son versiyonunda </w:t>
+      </w:r>
+      <w:proofErr w:type="spellStart"/>
+      <w:r>
+        <w:rPr>
+          <w:b/>
+          <w:bCs/>
+          <w:sz w:val="28"/>
+          <w:szCs w:val="28"/>
+        </w:rPr>
+        <w:t>implement</w:t>
+      </w:r>
+      <w:proofErr w:type="spellEnd"/>
+      <w:r>
+        <w:rPr>
+          <w:b/>
+          <w:bCs/>
+          <w:sz w:val="28"/>
+          <w:szCs w:val="28"/>
+        </w:rPr>
+        <w:t xml:space="preserve"> edilmesi planlanan sınıf yapıları.</w:t>
+      </w:r>
+    </w:p>
+    <w:p>
+      <w:pPr>
+        <w:pStyle w:val="NormalWeb"/>
+      </w:pPr>
+      <w:r>
+        <w:rPr>
+          <w:noProof/>
+        </w:rPr>
+        <w:drawing>
+          <wp:inline distT="0" distB="0" distL="0" distR="0" wp14:anchorId="6F076852" wp14:editId="059306A3">
+            <wp:extent cx="6445583" cy="4461510"/>
+            <wp:effectExtent l="0" t="0" r="0" b="0"/>
+            <wp:docPr id="3" name="Resim 3"/>
+            <wp:cNvGraphicFramePr>
+              <a:graphicFrameLocks xmlns:a="http://schemas.openxmlformats.org/drawingml/2006/main" noChangeAspect="1"/>
+            </wp:cNvGraphicFramePr>
+            <a:graphic xmlns:a="http://schemas.openxmlformats.org/drawingml/2006/main">
+              <a:graphicData uri="http://schemas.openxmlformats.org/drawingml/2006/picture">
+                <pic:pic xmlns:pic="http://schemas.openxmlformats.org/drawingml/2006/picture">
+                  <pic:nvPicPr>
+                    <pic:cNvPr id="0" name="Picture 2"/>
+                    <pic:cNvPicPr>
+                      <a:picLocks noChangeAspect="1" noChangeArrowheads="1"/>
+                    </pic:cNvPicPr>
+                  </pic:nvPicPr>
+                  <pic:blipFill>
+                    <a:blip r:embed="rId8" cstate="print">
+                      <a:extLst>
+                        <a:ext uri="{28A0092B-C50C-407E-A947-70E740481C1C}">
+                          <a14:useLocalDpi xmlns:a14="http://schemas.microsoft.com/office/drawing/2010/main" val="0"/>
+                        </a:ext>
+                      </a:extLst>
+                    </a:blip>
+                    <a:srcRect/>
+                    <a:stretch>
+                      <a:fillRect/>
+                    </a:stretch>
+                  </pic:blipFill>
+                  <pic:spPr bwMode="auto">
+                    <a:xfrm>
+                      <a:off x="0" y="0"/>
+                      <a:ext cx="6464405" cy="4474538"/>
+                    </a:xfrm>
+                    <a:prstGeom prst="rect">
+                      <a:avLst/>
+                    </a:prstGeom>
+                    <a:noFill/>
+                    <a:ln>
+                      <a:noFill/>
+                    </a:ln>
+                  </pic:spPr>
+                </pic:pic>
+              </a:graphicData>
+            </a:graphic>
+          </wp:inline>
+        </w:drawing>
+      </w:r>
+    </w:p>
+    <w:p/>
+    <w:p>
+      <w:pPr>
+        <w:pStyle w:val="Balk2"/>
+      </w:pPr>
+    </w:p>
+    <w:p>
+      <w:pPr>
+        <w:pStyle w:val="Balk2"/>
+      </w:pPr>
+    </w:p>
+    <w:p>
+      <w:pPr>
+        <w:pStyle w:val="Balk2"/>
+      </w:pPr>
+      <w:proofErr w:type="spellStart"/>
+      <w:r>
+        <w:t>Entity</w:t>
+      </w:r>
+      <w:proofErr w:type="spellEnd"/>
+      <w:r>
+        <w:t xml:space="preserve"> Katmanı</w:t>
+      </w:r>
+    </w:p>
+    <w:p>
+      <w:pPr>
+        <w:rPr>
+          <w:rFonts w:ascii="Times New Roman" w:eastAsiaTheme="majorEastAsia" w:hAnsi="Times New Roman" w:cs="Times New Roman"/>
+          <w:kern w:val="0"/>
+          <w:lang w:eastAsia="tr-TR"/>
+          <w14:ligatures w14:val="none"/>
+        </w:rPr>
+      </w:pPr>
+      <w:proofErr w:type="spellStart"/>
+      <w:r>
+        <w:t>Book</w:t>
+      </w:r>
+      <w:proofErr w:type="spellEnd"/>
+      <w:r>
+        <w:t xml:space="preserve"> ve User </w:t>
+      </w:r>
+      <w:proofErr w:type="spellStart"/>
+      <w:r>
+        <w:t>entity</w:t>
+      </w:r>
+      <w:proofErr w:type="spellEnd"/>
+      <w:r>
+        <w:t xml:space="preserve"> </w:t>
+      </w:r>
+      <w:proofErr w:type="spellStart"/>
+      <w:r>
+        <w:t>classları</w:t>
+      </w:r>
+      <w:proofErr w:type="spellEnd"/>
+      <w:r>
+        <w:t xml:space="preserve"> </w:t>
+      </w:r>
+      <w:proofErr w:type="spellStart"/>
+      <w:r>
+        <w:t>v</w:t>
+      </w:r>
+      <w:r>
+        <w:t>eritabanındaki</w:t>
+      </w:r>
+      <w:proofErr w:type="spellEnd"/>
+      <w:r>
+        <w:t xml:space="preserve"> tabloların birebir Java karşılığı olan, sistemin temel yapı taşlarıdır</w:t>
+      </w:r>
+      <w:r>
+        <w:t xml:space="preserve">. </w:t>
+      </w:r>
+      <w:proofErr w:type="spellStart"/>
+      <w:r>
+        <w:t>BorrowingRecord</w:t>
+      </w:r>
+      <w:proofErr w:type="spellEnd"/>
+      <w:r>
+        <w:t xml:space="preserve">, </w:t>
+      </w:r>
+      <w:proofErr w:type="spellStart"/>
+      <w:r>
+        <w:t>WaitlistRecord</w:t>
+      </w:r>
+      <w:proofErr w:type="spellEnd"/>
+      <w:r>
+        <w:t xml:space="preserve">, </w:t>
+      </w:r>
+      <w:proofErr w:type="spellStart"/>
+      <w:r>
+        <w:t>Penalty</w:t>
+      </w:r>
+      <w:proofErr w:type="spellEnd"/>
+      <w:r>
+        <w:t xml:space="preserve"> </w:t>
+      </w:r>
+      <w:proofErr w:type="spellStart"/>
+      <w:r>
+        <w:t>classlarık</w:t>
+      </w:r>
+      <w:proofErr w:type="spellEnd"/>
+      <w:r>
+        <w:t xml:space="preserve"> </w:t>
+      </w:r>
+      <w:proofErr w:type="spellStart"/>
+      <w:r>
+        <w:t>ullanıcı</w:t>
+      </w:r>
+      <w:proofErr w:type="spellEnd"/>
+      <w:r>
+        <w:t xml:space="preserve"> ve </w:t>
+      </w:r>
+      <w:r>
+        <w:t>k</w:t>
+      </w:r>
+      <w:r>
+        <w:t>itap arasındaki etkileşimleri tuta</w:t>
+      </w:r>
+      <w:r>
+        <w:t>r.</w:t>
+      </w:r>
+    </w:p>
+    <w:p>
+      <w:proofErr w:type="spellStart"/>
+      <w:r>
+        <w:t>BorrowingRecord</w:t>
+      </w:r>
+      <w:proofErr w:type="spellEnd"/>
+      <w:r>
+        <w:t>: Kim, hangi kitabı, ne zaman aldı ve teslim tarihi ne?</w:t>
+      </w:r>
+    </w:p>
+    <w:p>
+      <w:proofErr w:type="spellStart"/>
+      <w:r>
+        <w:t>WaitlistRecord</w:t>
+      </w:r>
+      <w:proofErr w:type="spellEnd"/>
+      <w:r>
+        <w:t>: Stokta olmayan kitaplar için kim, ne zamandan beri sırada bekliyor?</w:t>
+      </w:r>
+    </w:p>
+    <w:p>
+      <w:proofErr w:type="spellStart"/>
+      <w:r>
+        <w:t>Penalty</w:t>
+      </w:r>
+      <w:proofErr w:type="spellEnd"/>
+      <w:r>
+        <w:t>: Hangi gecikmiş ödünç alma işleminden dolayı, ne kadar ceza kesildi ve ödendi mi?</w:t>
+      </w:r>
+    </w:p>
+    <w:p>
+      <w:pPr>
+        <w:pStyle w:val="Balk2"/>
+      </w:pPr>
+      <w:proofErr w:type="spellStart"/>
+      <w:r>
+        <w:t>Repository</w:t>
+      </w:r>
+      <w:proofErr w:type="spellEnd"/>
+      <w:r>
+        <w:t xml:space="preserve"> Katmanı</w:t>
+      </w:r>
+    </w:p>
+    <w:p>
+      <w:r>
+        <w:t xml:space="preserve">Spring Data JPA kullanılarak oluşturulan, SQL yazmadan </w:t>
+      </w:r>
+      <w:proofErr w:type="spellStart"/>
+      <w:r>
+        <w:t>veritabanı</w:t>
+      </w:r>
+      <w:proofErr w:type="spellEnd"/>
+      <w:r>
+        <w:t xml:space="preserve"> işlemlerini halleden arayüzlerdir (</w:t>
+      </w:r>
+      <w:proofErr w:type="spellStart"/>
+      <w:r>
+        <w:t>UserRepository</w:t>
+      </w:r>
+      <w:proofErr w:type="spellEnd"/>
+      <w:r>
+        <w:t xml:space="preserve">, </w:t>
+      </w:r>
+      <w:proofErr w:type="spellStart"/>
+      <w:r>
+        <w:t>BookRepository</w:t>
+      </w:r>
+      <w:proofErr w:type="spellEnd"/>
+      <w:r>
+        <w:t xml:space="preserve">, </w:t>
+      </w:r>
+      <w:proofErr w:type="spellStart"/>
+      <w:r>
+        <w:t>BorrowingRepository</w:t>
+      </w:r>
+      <w:proofErr w:type="spellEnd"/>
+      <w:r>
+        <w:t xml:space="preserve">, </w:t>
+      </w:r>
+      <w:proofErr w:type="spellStart"/>
+      <w:r>
+        <w:t>WaitlistRepository</w:t>
+      </w:r>
+      <w:proofErr w:type="spellEnd"/>
+      <w:r>
+        <w:t xml:space="preserve">, </w:t>
+      </w:r>
+      <w:proofErr w:type="spellStart"/>
+      <w:r>
+        <w:t>PenaltyRepository</w:t>
+      </w:r>
+      <w:proofErr w:type="spellEnd"/>
+      <w:r>
+        <w:t xml:space="preserve">). Sadece </w:t>
+      </w:r>
+      <w:proofErr w:type="spellStart"/>
+      <w:r>
+        <w:t>Entity</w:t>
+      </w:r>
+      <w:proofErr w:type="spellEnd"/>
+      <w:r>
+        <w:t xml:space="preserve"> sınıflarıyla konuşurlar.</w:t>
+      </w:r>
+    </w:p>
+    <w:p>
+      <w:pPr>
+        <w:pStyle w:val="Balk2"/>
+      </w:pPr>
+      <w:r>
+        <w:t>Service Katmanı</w:t>
+      </w:r>
+    </w:p>
+    <w:p>
+      <w:r>
+        <w:t xml:space="preserve">Sistemin </w:t>
+      </w:r>
+      <w:r>
+        <w:t>çalışma mantığının yazıldığı katmandır</w:t>
+      </w:r>
+      <w:r>
+        <w:t>. İş kuralları burada işletilir</w:t>
+      </w:r>
+      <w:r>
+        <w:t xml:space="preserve"> ve gerekli kontroller yapılır</w:t>
+      </w:r>
+      <w:r>
+        <w:t>. Katmanın en önemli özellikleri şunlardır:</w:t>
+      </w:r>
+    </w:p>
+    <w:p>
+      <w:r>
+        <w:t xml:space="preserve">Sorumluluklar parçalanmıştır. </w:t>
+      </w:r>
+      <w:proofErr w:type="spellStart"/>
+      <w:r>
+        <w:t>UserService</w:t>
+      </w:r>
+      <w:proofErr w:type="spellEnd"/>
+      <w:r>
+        <w:t xml:space="preserve">, </w:t>
+      </w:r>
+      <w:proofErr w:type="spellStart"/>
+      <w:r>
+        <w:t>WaitlistService</w:t>
+      </w:r>
+      <w:proofErr w:type="spellEnd"/>
+      <w:r>
+        <w:t xml:space="preserve">, </w:t>
+      </w:r>
+      <w:proofErr w:type="spellStart"/>
+      <w:r>
+        <w:t>PenaltyService</w:t>
+      </w:r>
+      <w:proofErr w:type="spellEnd"/>
+      <w:r>
+        <w:t xml:space="preserve"> ve </w:t>
+      </w:r>
+      <w:proofErr w:type="spellStart"/>
+      <w:r>
+        <w:t>ProfileService</w:t>
+      </w:r>
+      <w:proofErr w:type="spellEnd"/>
+      <w:r>
+        <w:t xml:space="preserve"> kendi işlerine odaklanır.</w:t>
+      </w:r>
+    </w:p>
+    <w:p>
+      <w:r>
+        <w:t xml:space="preserve">Servisler birbirleriyle iletişim kurar. Örneğin bir kitap iade edildiğinde </w:t>
+      </w:r>
+      <w:proofErr w:type="spellStart"/>
+      <w:r>
+        <w:t>BorrowingService</w:t>
+      </w:r>
+      <w:proofErr w:type="spellEnd"/>
+      <w:r>
+        <w:t xml:space="preserve">, gecikme olup olmadığını sormak için </w:t>
+      </w:r>
+      <w:proofErr w:type="spellStart"/>
+      <w:r>
+        <w:t>PenaltyService'i</w:t>
+      </w:r>
+      <w:proofErr w:type="spellEnd"/>
+      <w:r>
+        <w:t xml:space="preserve">, kitap için sırada bekleyen var mı diye sormak için </w:t>
+      </w:r>
+      <w:proofErr w:type="spellStart"/>
+      <w:r>
+        <w:t>WaitlistService'i</w:t>
+      </w:r>
+      <w:proofErr w:type="spellEnd"/>
+      <w:r>
+        <w:t xml:space="preserve"> tetikler.</w:t>
+      </w:r>
+    </w:p>
+    <w:p>
+      <w:proofErr w:type="spellStart"/>
+      <w:r>
+        <w:t>BookService</w:t>
+      </w:r>
+      <w:proofErr w:type="spellEnd"/>
+      <w:r>
+        <w:t xml:space="preserve"> arama yaparken karmaşık </w:t>
+      </w:r>
+      <w:proofErr w:type="spellStart"/>
+      <w:r>
+        <w:t>if</w:t>
+      </w:r>
+      <w:proofErr w:type="spellEnd"/>
+      <w:r>
+        <w:t xml:space="preserve">-else blokları kullanmaz. İşi, </w:t>
+      </w:r>
+      <w:proofErr w:type="spellStart"/>
+      <w:r>
+        <w:t>ISearchStrategy</w:t>
+      </w:r>
+      <w:proofErr w:type="spellEnd"/>
+      <w:r>
+        <w:t xml:space="preserve"> arayüzünden türetilmiş alt sınıflara (</w:t>
+      </w:r>
+      <w:proofErr w:type="spellStart"/>
+      <w:r>
+        <w:t>TitleSearchStrategy</w:t>
+      </w:r>
+      <w:proofErr w:type="spellEnd"/>
+      <w:r>
+        <w:t xml:space="preserve">, </w:t>
+      </w:r>
+      <w:proofErr w:type="spellStart"/>
+      <w:r>
+        <w:t>AuthorSearchStrategy</w:t>
+      </w:r>
+      <w:proofErr w:type="spellEnd"/>
+      <w:r>
+        <w:t xml:space="preserve"> vb.) devreder. Böylece projeye yeni bir arama filtresi eklenmek istendiğinde mevcut hiçbir kod bozulmaz (OCP uyumu).</w:t>
+      </w:r>
+    </w:p>
+    <w:p>
+      <w:pPr>
+        <w:pStyle w:val="Balk2"/>
+      </w:pPr>
+      <w:r>
+        <w:t>Controller Katmanı (API/Sunum)</w:t>
+      </w:r>
+    </w:p>
+    <w:p>
+      <w:r>
+        <w:t xml:space="preserve">Web </w:t>
+      </w:r>
+      <w:proofErr w:type="gramStart"/>
+      <w:r>
+        <w:t xml:space="preserve">sayfasından </w:t>
+      </w:r>
+      <w:r>
+        <w:t xml:space="preserve"> gelen</w:t>
+      </w:r>
+      <w:proofErr w:type="gramEnd"/>
+      <w:r>
+        <w:t xml:space="preserve"> HTTP isteklerini karşılayan ve ilgili Service sınıfına yönlendiren </w:t>
+      </w:r>
+      <w:r>
+        <w:t>yapılardır.</w:t>
+      </w:r>
+      <w:r>
+        <w:t xml:space="preserve"> </w:t>
+      </w:r>
+      <w:proofErr w:type="spellStart"/>
+      <w:r>
+        <w:t>UserController</w:t>
+      </w:r>
+      <w:proofErr w:type="spellEnd"/>
+      <w:r>
+        <w:t xml:space="preserve">, </w:t>
+      </w:r>
+      <w:proofErr w:type="spellStart"/>
+      <w:r>
+        <w:t>BookController</w:t>
+      </w:r>
+      <w:proofErr w:type="spellEnd"/>
+      <w:r>
+        <w:t xml:space="preserve">, </w:t>
+      </w:r>
+      <w:proofErr w:type="spellStart"/>
+      <w:r>
+        <w:t>BorrowingController</w:t>
+      </w:r>
+      <w:proofErr w:type="spellEnd"/>
+      <w:r>
+        <w:t>, vb. şeklinde her servisin bir kontrolcüsü vardır.</w:t>
+      </w:r>
+    </w:p>
+    <w:p/>
+    <w:p/>
+    <w:p>
+      <w:r>
+        <w:lastRenderedPageBreak/>
         <w:t>4. FONKSİYONLARIN ÇALIŞMA AKIŞI (SEQUENCE DIAGRAM)</w:t>
       </w:r>
     </w:p>
@@ -863,17 +2135,65 @@
     </w:p>
     <w:p>
       <w:r>
-        <w:t>2. UI, BorrowService bileşenine bookId ve userId bilgilerini gönderir.</w:t>
-      </w:r>
-    </w:p>
-    <w:p>
-      <w:r>
-        <w:t>3. Service, BookRepository aracılığıyla MySQL'den kitabın stok durumunu kontrol eder.</w:t>
-      </w:r>
-    </w:p>
-    <w:p>
-      <w:r>
-        <w:t>4. Stok mevcutsa, veritabanında stok 1 azaltılır ve yeni bir Transaction kaydı oluşturulur.</w:t>
+        <w:t xml:space="preserve">2. UI, </w:t>
+      </w:r>
+      <w:proofErr w:type="spellStart"/>
+      <w:r>
+        <w:t>BorrowService</w:t>
+      </w:r>
+      <w:proofErr w:type="spellEnd"/>
+      <w:r>
+        <w:t xml:space="preserve"> bileşenine </w:t>
+      </w:r>
+      <w:proofErr w:type="spellStart"/>
+      <w:r>
+        <w:t>bookId</w:t>
+      </w:r>
+      <w:proofErr w:type="spellEnd"/>
+      <w:r>
+        <w:t xml:space="preserve"> ve </w:t>
+      </w:r>
+      <w:proofErr w:type="spellStart"/>
+      <w:r>
+        <w:t>userId</w:t>
+      </w:r>
+      <w:proofErr w:type="spellEnd"/>
+      <w:r>
+        <w:t xml:space="preserve"> bilgilerini gönderir.</w:t>
+      </w:r>
+    </w:p>
+    <w:p>
+      <w:r>
+        <w:t xml:space="preserve">3. Service, </w:t>
+      </w:r>
+      <w:proofErr w:type="spellStart"/>
+      <w:r>
+        <w:t>BookRepository</w:t>
+      </w:r>
+      <w:proofErr w:type="spellEnd"/>
+      <w:r>
+        <w:t xml:space="preserve"> aracılığıyla MySQL'den kitabın stok durumunu kontrol eder.</w:t>
+      </w:r>
+    </w:p>
+    <w:p>
+      <w:r>
+        <w:t xml:space="preserve">4. Stok mevcutsa, </w:t>
+      </w:r>
+      <w:proofErr w:type="spellStart"/>
+      <w:r>
+        <w:t>veritabanında</w:t>
+      </w:r>
+      <w:proofErr w:type="spellEnd"/>
+      <w:r>
+        <w:t xml:space="preserve"> stok 1 azaltılır ve yeni bir </w:t>
+      </w:r>
+      <w:proofErr w:type="spellStart"/>
+      <w:r>
+        <w:t>Transaction</w:t>
+      </w:r>
+      <w:proofErr w:type="spellEnd"/>
+      <w:r>
+        <w:t xml:space="preserve"> kaydı oluşturulur.</w:t>
       </w:r>
     </w:p>
     <w:p>
@@ -889,7 +2209,23 @@
     </w:p>
     <w:p>
       <w:r>
-        <w:t>Proje, başlangıç aşamasında Tek Makine (Single Node) mimarisiyle dağıtılacaktır.</w:t>
+        <w:t>Proje, başlangıç aşamasında Tek Makine (</w:t>
+      </w:r>
+      <w:proofErr w:type="spellStart"/>
+      <w:r>
+        <w:t>Single</w:t>
+      </w:r>
+      <w:proofErr w:type="spellEnd"/>
+      <w:r>
+        <w:t xml:space="preserve"> </w:t>
+      </w:r>
+      <w:proofErr w:type="spellStart"/>
+      <w:r>
+        <w:t>Node</w:t>
+      </w:r>
+      <w:proofErr w:type="spellEnd"/>
+      <w:r>
+        <w:t>) mimarisiyle dağıtılacaktır.</w:t>
       </w:r>
     </w:p>
     <w:p>
@@ -899,14 +2235,39 @@
     </w:p>
     <w:p>
       <w:r>
-        <w:t>- Uygulama Sunucusu: Java Spring Boot uygulamasının çalıştığı JVM ortamı.</w:t>
-      </w:r>
-    </w:p>
-    <w:p>
-      <w:r>
-        <w:t>- Veritabanı Sunucusu: Aynı sunucu üzerinde barındırılan MySQL DB.</w:t>
-      </w:r>
-    </w:p>
+        <w:t xml:space="preserve">- Uygulama Sunucusu: Java Spring </w:t>
+      </w:r>
+      <w:proofErr w:type="spellStart"/>
+      <w:r>
+        <w:t>Boot</w:t>
+      </w:r>
+      <w:proofErr w:type="spellEnd"/>
+      <w:r>
+        <w:t xml:space="preserve"> uygulamasının çalıştığı JVM ortamı.</w:t>
+      </w:r>
+    </w:p>
+    <w:p>
+      <w:r>
+        <w:t xml:space="preserve">- </w:t>
+      </w:r>
+      <w:proofErr w:type="spellStart"/>
+      <w:r>
+        <w:t>Veritabanı</w:t>
+      </w:r>
+      <w:proofErr w:type="spellEnd"/>
+      <w:r>
+        <w:t xml:space="preserve"> Sunucusu: Aynı sunucu üzerinde barındırılan MySQL DB.</w:t>
+      </w:r>
+    </w:p>
+    <w:p/>
+    <w:p/>
+    <w:p/>
+    <w:p/>
+    <w:p/>
+    <w:p/>
+    <w:p/>
+    <w:p/>
+    <w:p/>
     <w:p/>
     <w:p/>
     <w:tbl>
@@ -955,6 +2316,7 @@
                 <w:b/>
                 <w:bCs/>
               </w:rPr>
+              <w:lastRenderedPageBreak/>
               <w:t>Görev / Bölüm</w:t>
             </w:r>
           </w:p>
@@ -1245,7 +2607,7 @@
           </w:tcPr>
           <w:p>
             <w:r>
-              <w:t>D</w:t>
+              <w:t>S</w:t>
             </w:r>
           </w:p>
         </w:tc>
@@ -1345,8 +2707,13 @@
             <w:hideMark/>
           </w:tcPr>
           <w:p>
-            <w:r>
-              <w:t>Sequence &amp; Deployment Diyagramları</w:t>
+            <w:proofErr w:type="spellStart"/>
+            <w:r>
+              <w:t>Sequence</w:t>
+            </w:r>
+            <w:proofErr w:type="spellEnd"/>
+            <w:r>
+              <w:t xml:space="preserve"> &amp; Deployment Diyagramları</w:t>
             </w:r>
           </w:p>
         </w:tc>
@@ -1471,7 +2838,6 @@
           </w:tcPr>
           <w:p>
             <w:r>
-              <w:lastRenderedPageBreak/>
               <w:t>Arayüz ve Parametre Tanımlamaları</w:t>
             </w:r>
           </w:p>
@@ -1596,8 +2962,13 @@
             <w:hideMark/>
           </w:tcPr>
           <w:p>
-            <w:r>
-              <w:t>Döküman Formatlama ve Son Kontrol</w:t>
+            <w:proofErr w:type="spellStart"/>
+            <w:r>
+              <w:t>Döküman</w:t>
+            </w:r>
+            <w:proofErr w:type="spellEnd"/>
+            <w:r>
+              <w:t xml:space="preserve"> Formatlama ve Son Kontrol</w:t>
             </w:r>
           </w:p>
         </w:tc>
@@ -2351,7 +3722,6 @@
     <w:next w:val="Normal"/>
     <w:link w:val="Balk2Char"/>
     <w:uiPriority w:val="9"/>
-    <w:semiHidden/>
     <w:unhideWhenUsed/>
     <w:qFormat/>
     <w:rsid w:val="00AC095C"/>
@@ -2526,7 +3896,6 @@
   <w:style w:type="character" w:default="1" w:styleId="VarsaylanParagrafYazTipi">
     <w:name w:val="Default Paragraph Font"/>
     <w:uiPriority w:val="1"/>
-    <w:semiHidden/>
     <w:unhideWhenUsed/>
   </w:style>
   <w:style w:type="table" w:default="1" w:styleId="NormalTablo">
@@ -2568,7 +3937,6 @@
     <w:basedOn w:val="VarsaylanParagrafYazTipi"/>
     <w:link w:val="Balk2"/>
     <w:uiPriority w:val="9"/>
-    <w:semiHidden/>
     <w:rsid w:val="00AC095C"/>
     <w:rPr>
       <w:rFonts w:asciiTheme="majorHAnsi" w:eastAsiaTheme="majorEastAsia" w:hAnsiTheme="majorHAnsi" w:cstheme="majorBidi"/>
@@ -2873,6 +4241,19 @@
       <w:kern w:val="0"/>
       <w:lang w:eastAsia="tr-TR"/>
       <w14:ligatures w14:val="none"/>
+    </w:rPr>
+  </w:style>
+  <w:style w:type="character" w:styleId="HTMLKodu">
+    <w:name w:val="HTML Code"/>
+    <w:basedOn w:val="VarsaylanParagrafYazTipi"/>
+    <w:uiPriority w:val="99"/>
+    <w:semiHidden/>
+    <w:unhideWhenUsed/>
+    <w:rsid w:val="006F5F59"/>
+    <w:rPr>
+      <w:rFonts w:ascii="Courier New" w:eastAsia="Times New Roman" w:hAnsi="Courier New" w:cs="Courier New"/>
+      <w:sz w:val="20"/>
+      <w:szCs w:val="20"/>
     </w:rPr>
   </w:style>
 </w:styles>

</xml_diff>

<commit_message>
DOCS: Tasarım ve design dökümanları düzenlendi
</commit_message>
<xml_diff>
--- a/docs/Design Document.docx
+++ b/docs/Design Document.docx
@@ -40,27 +40,67 @@
     </w:p>
     <w:p>
       <w:r>
-        <w:t>2. ÜST SEVİYE BİLEŞEN YAPISI (COMPONENT DIAGRAM).....................2</w:t>
-      </w:r>
-    </w:p>
-    <w:p>
-      <w:r>
-        <w:t>3. BİLEŞENLER ARASI ARAYÜZLER VE PARAMETRELER (CLASS DIAGRAM).........3</w:t>
-      </w:r>
-    </w:p>
-    <w:p>
-      <w:r>
-        <w:t>4. FONKSİYONLARIN ÇALIŞMA AKIŞI (SEQUENCE DIAGRAM)...................4</w:t>
-      </w:r>
-    </w:p>
-    <w:p>
-      <w:r>
-        <w:t>5. SİSTEMİN DAĞITIMI (DEPLOYMENT DIAGRAM)............................5</w:t>
-      </w:r>
-    </w:p>
-    <w:p>
-      <w:r>
-        <w:t>6. GÖREV MATRİSİ (TASK MATRIX).......................................6</w:t>
+        <w:t xml:space="preserve">2. ÜST SEVİYE BİLEŞEN YAPISI (COMPONENT </w:t>
+      </w:r>
+      <w:proofErr w:type="gramStart"/>
+      <w:r>
+        <w:t>DIAGRAM).....................</w:t>
+      </w:r>
+      <w:proofErr w:type="gramEnd"/>
+      <w:r>
+        <w:t>2</w:t>
+      </w:r>
+    </w:p>
+    <w:p>
+      <w:r>
+        <w:t xml:space="preserve">3. BİLEŞENLER ARASI ARAYÜZLER VE PARAMETRELER (CLASS </w:t>
+      </w:r>
+      <w:proofErr w:type="gramStart"/>
+      <w:r>
+        <w:t>DIAGRAM).........</w:t>
+      </w:r>
+      <w:proofErr w:type="gramEnd"/>
+      <w:r>
+        <w:t>3</w:t>
+      </w:r>
+    </w:p>
+    <w:p>
+      <w:r>
+        <w:t xml:space="preserve">4. FONKSİYONLARIN ÇALIŞMA AKIŞI (SEQUENCE </w:t>
+      </w:r>
+      <w:proofErr w:type="gramStart"/>
+      <w:r>
+        <w:t>DIAGRAM)...................</w:t>
+      </w:r>
+      <w:proofErr w:type="gramEnd"/>
+      <w:r>
+        <w:t>4</w:t>
+      </w:r>
+    </w:p>
+    <w:p>
+      <w:r>
+        <w:t xml:space="preserve">5. SİSTEMİN DAĞITIMI (DEPLOYMENT </w:t>
+      </w:r>
+      <w:proofErr w:type="gramStart"/>
+      <w:r>
+        <w:t>DIAGRAM)............................</w:t>
+      </w:r>
+      <w:proofErr w:type="gramEnd"/>
+      <w:r>
+        <w:t>5</w:t>
+      </w:r>
+    </w:p>
+    <w:p>
+      <w:r>
+        <w:t xml:space="preserve">6. GÖREV MATRİSİ (TASK </w:t>
+      </w:r>
+      <w:proofErr w:type="gramStart"/>
+      <w:r>
+        <w:t>MATRIX).......................................</w:t>
+      </w:r>
+      <w:proofErr w:type="gramEnd"/>
+      <w:r>
+        <w:t>6</w:t>
       </w:r>
     </w:p>
     <w:p/>
@@ -85,8 +125,21 @@
       <w:pPr>
         <w:ind w:firstLine="708"/>
       </w:pPr>
-      <w:r>
-        <w:t>LibRA projesinde Katmanlı Mimari (Layered Architecture) tercih edilmiştir. Bu mimari, sistemin sürdürülebilirliğini artırmak, kodun yeniden kullanılabilirliğini sağlamak ve farklı sorumlulukları birbirinden net bir şekilde ayırmak amacıyla kullanılmıştır.</w:t>
+      <w:proofErr w:type="spellStart"/>
+      <w:r>
+        <w:t>LibRA</w:t>
+      </w:r>
+      <w:proofErr w:type="spellEnd"/>
+      <w:r>
+        <w:t xml:space="preserve"> projesinde Katmanlı Mimari (</w:t>
+      </w:r>
+      <w:proofErr w:type="spellStart"/>
+      <w:r>
+        <w:t>Layered</w:t>
+      </w:r>
+      <w:proofErr w:type="spellEnd"/>
+      <w:r>
+        <w:t xml:space="preserve"> Architecture) tercih edilmiştir. Bu mimari, sistemin sürdürülebilirliğini artırmak, kodun yeniden kullanılabilirliğini sağlamak ve farklı sorumlulukları birbirinden net bir şekilde ayırmak amacıyla kullanılmıştır.</w:t>
       </w:r>
     </w:p>
     <w:p/>
@@ -99,10 +152,42 @@
         </w:numPr>
       </w:pPr>
       <w:r>
-        <w:t>Sunum Katmanı (Presentation Layer): Kullanıcı etkileşimini yöneten katmandır. Web arayüzü (HTML/CSS/JS) bu katmanda yer alır.</w:t>
-      </w:r>
-      <w:r>
-        <w:t xml:space="preserve"> Bu dosyalar kullanıcı arayüzünü oluşturur ve API’a istek gönderir. Java Sprin Boot ve JPA ile hazırlanmış Controller sınıfları da bu katmanda yer alır. Arayüzden gelen istekleri karşılar ve ilgili Service katmanına yönlendirir.</w:t>
+        <w:t xml:space="preserve">Sunum Katmanı (Presentation </w:t>
+      </w:r>
+      <w:proofErr w:type="spellStart"/>
+      <w:r>
+        <w:t>Layer</w:t>
+      </w:r>
+      <w:proofErr w:type="spellEnd"/>
+      <w:r>
+        <w:t>): Kullanıcı etkileşimini yöneten katmandır. Web arayüzü (HTML/CSS/JS) bu katmanda yer alır.</w:t>
+      </w:r>
+      <w:r>
+        <w:t xml:space="preserve"> Bu dosyalar kullanıcı arayüzünü oluşturur ve </w:t>
+      </w:r>
+      <w:proofErr w:type="spellStart"/>
+      <w:r>
+        <w:t>API’a</w:t>
+      </w:r>
+      <w:proofErr w:type="spellEnd"/>
+      <w:r>
+        <w:t xml:space="preserve"> istek gönderir. Java </w:t>
+      </w:r>
+      <w:proofErr w:type="spellStart"/>
+      <w:r>
+        <w:t>Sprin</w:t>
+      </w:r>
+      <w:proofErr w:type="spellEnd"/>
+      <w:r>
+        <w:t xml:space="preserve"> </w:t>
+      </w:r>
+      <w:proofErr w:type="spellStart"/>
+      <w:r>
+        <w:t>Boot</w:t>
+      </w:r>
+      <w:proofErr w:type="spellEnd"/>
+      <w:r>
+        <w:t xml:space="preserve"> ve JPA ile hazırlanmış Controller sınıfları da bu katmanda yer alır. Arayüzden gelen istekleri karşılar ve ilgili Service katmanına yönlendirir.</w:t>
       </w:r>
     </w:p>
     <w:p/>
@@ -115,7 +200,31 @@
         </w:numPr>
       </w:pPr>
       <w:r>
-        <w:t>Uygulama/Servis Katmanı (Service Layer): Sistemin iş mantığının (business logic) yürütüldüğü katmandır. Ödünç alma kuralları, ceza hesaplama algoritmaları ve kullanıcı yetkilendirme süreçleri burada işlenir.</w:t>
+        <w:t xml:space="preserve">Uygulama/Servis Katmanı (Service </w:t>
+      </w:r>
+      <w:proofErr w:type="spellStart"/>
+      <w:r>
+        <w:t>Layer</w:t>
+      </w:r>
+      <w:proofErr w:type="spellEnd"/>
+      <w:r>
+        <w:t>): Sistemin iş mantığının (</w:t>
+      </w:r>
+      <w:proofErr w:type="spellStart"/>
+      <w:r>
+        <w:t>business</w:t>
+      </w:r>
+      <w:proofErr w:type="spellEnd"/>
+      <w:r>
+        <w:t xml:space="preserve"> </w:t>
+      </w:r>
+      <w:proofErr w:type="spellStart"/>
+      <w:r>
+        <w:t>logic</w:t>
+      </w:r>
+      <w:proofErr w:type="spellEnd"/>
+      <w:r>
+        <w:t>) yürütüldüğü katmandır. Ödünç alma kuralları, ceza hesaplama algoritmaları ve kullanıcı yetkilendirme süreçleri burada işlenir.</w:t>
       </w:r>
       <w:r>
         <w:t xml:space="preserve"> Java Service </w:t>
@@ -142,15 +251,62 @@
       <w:r>
         <w:t>(</w:t>
       </w:r>
-      <w:r>
-        <w:t>Repository Layer): İş mantığı ile veritabanı arasındaki köprüdür. MySQL veritabanına yönelik sorguların yürütüldüğü katmandır.</w:t>
-      </w:r>
-      <w:r>
-        <w:t xml:space="preserve"> JPA kullanarak veri tabanına SQL sorguları gönermekten sorumludur. Repository </w:t>
-      </w:r>
+      <w:proofErr w:type="spellStart"/>
+      <w:r>
+        <w:t>Repository</w:t>
+      </w:r>
+      <w:proofErr w:type="spellEnd"/>
+      <w:r>
+        <w:t xml:space="preserve"> </w:t>
+      </w:r>
+      <w:proofErr w:type="spellStart"/>
+      <w:r>
+        <w:t>Layer</w:t>
+      </w:r>
+      <w:proofErr w:type="spellEnd"/>
+      <w:r>
+        <w:t xml:space="preserve">): İş mantığı ile </w:t>
+      </w:r>
+      <w:proofErr w:type="spellStart"/>
+      <w:r>
+        <w:t>veritabanı</w:t>
+      </w:r>
+      <w:proofErr w:type="spellEnd"/>
+      <w:r>
+        <w:t xml:space="preserve"> arasındaki köprüdür. MySQL </w:t>
+      </w:r>
+      <w:proofErr w:type="spellStart"/>
+      <w:r>
+        <w:t>veritabanına</w:t>
+      </w:r>
+      <w:proofErr w:type="spellEnd"/>
+      <w:r>
+        <w:t xml:space="preserve"> yönelik sorguların yürütüldüğü katmandır.</w:t>
+      </w:r>
+      <w:r>
+        <w:t xml:space="preserve"> JPA kullanarak veri tabanına SQL sorguları </w:t>
+      </w:r>
+      <w:proofErr w:type="spellStart"/>
+      <w:r>
+        <w:t>gönermekten</w:t>
+      </w:r>
+      <w:proofErr w:type="spellEnd"/>
+      <w:r>
+        <w:t xml:space="preserve"> sorumludur. </w:t>
+      </w:r>
+      <w:proofErr w:type="spellStart"/>
+      <w:r>
+        <w:t>Repository</w:t>
+      </w:r>
+      <w:proofErr w:type="spellEnd"/>
+      <w:r>
+        <w:t xml:space="preserve"> </w:t>
+      </w:r>
+      <w:proofErr w:type="spellStart"/>
       <w:r>
         <w:t>interface’lerinden</w:t>
       </w:r>
+      <w:proofErr w:type="spellEnd"/>
       <w:r>
         <w:t xml:space="preserve"> oluşur.</w:t>
       </w:r>
@@ -181,8 +337,21 @@
           <w:numId w:val="2"/>
         </w:numPr>
       </w:pPr>
-      <w:r>
-        <w:t>Entity Katmanı: Veri tabanındaki tabloları Java sınıflarının tanımasını sağlayan Entity sınıfları, Book.java User.java gibi dosyalardan oluşur.</w:t>
+      <w:proofErr w:type="spellStart"/>
+      <w:r>
+        <w:t>Entity</w:t>
+      </w:r>
+      <w:proofErr w:type="spellEnd"/>
+      <w:r>
+        <w:t xml:space="preserve"> Katmanı: Veri tabanındaki tabloları Java sınıflarının tanımasını sağlayan </w:t>
+      </w:r>
+      <w:proofErr w:type="spellStart"/>
+      <w:r>
+        <w:t>Entity</w:t>
+      </w:r>
+      <w:proofErr w:type="spellEnd"/>
+      <w:r>
+        <w:t xml:space="preserve"> sınıfları, Book.java User.java gibi dosyalardan oluşur.</w:t>
       </w:r>
     </w:p>
     <w:p/>
@@ -249,7 +418,15 @@
         <w:ind w:firstLine="708"/>
       </w:pPr>
       <w:r>
-        <w:t>Sistem, modüler bir yapıda tasarlanmış olup bileşenler birbirleriyle API/Interface düzeyinde haberleşir.</w:t>
+        <w:t>Sistem, modüler bir yapıda tasarlanmış olup bileşenler birbirleriyle API/</w:t>
+      </w:r>
+      <w:proofErr w:type="spellStart"/>
+      <w:r>
+        <w:t>Interface</w:t>
+      </w:r>
+      <w:proofErr w:type="spellEnd"/>
+      <w:r>
+        <w:t xml:space="preserve"> düzeyinde haberleşir.</w:t>
       </w:r>
     </w:p>
     <w:p/>
@@ -265,29 +442,71 @@
     </w:p>
     <w:p>
       <w:r>
-        <w:t>- REST API:</w:t>
-      </w:r>
-      <w:r>
-        <w:t xml:space="preserve"> UI ile backend modülleri arasındaki yönlendirmeyi sağlayan arayüz</w:t>
-      </w:r>
-      <w:r>
-        <w:t>.</w:t>
-      </w:r>
-    </w:p>
-    <w:p>
-      <w:r>
-        <w:t>- Auth Module: Kullanıcı kayıt, giriş ve yetkilendirme (Admin/User) işlemlerinden sorumludur.</w:t>
-      </w:r>
-    </w:p>
-    <w:p>
-      <w:r>
-        <w:t>- Search Engine</w:t>
-      </w:r>
-      <w:r>
-        <w:t xml:space="preserve"> (Book Service)</w:t>
-      </w:r>
-      <w:r>
-        <w:t>: MySQL veritabanı üzerinde kompleks arama ve filtreleme işlemlerini yönetir.</w:t>
+        <w:t xml:space="preserve">- REST API: UI ile </w:t>
+      </w:r>
+      <w:proofErr w:type="spellStart"/>
+      <w:r>
+        <w:t>backend</w:t>
+      </w:r>
+      <w:proofErr w:type="spellEnd"/>
+      <w:r>
+        <w:t xml:space="preserve"> modülleri arasındaki yönlendirmeyi sağlayan arayüz.</w:t>
+      </w:r>
+    </w:p>
+    <w:p>
+      <w:r>
+        <w:t xml:space="preserve">- </w:t>
+      </w:r>
+      <w:proofErr w:type="spellStart"/>
+      <w:r>
+        <w:t>Auth</w:t>
+      </w:r>
+      <w:proofErr w:type="spellEnd"/>
+      <w:r>
+        <w:t xml:space="preserve"> </w:t>
+      </w:r>
+      <w:proofErr w:type="spellStart"/>
+      <w:r>
+        <w:t>Module</w:t>
+      </w:r>
+      <w:proofErr w:type="spellEnd"/>
+      <w:r>
+        <w:t>: Kullanıcı kayıt, giriş ve yetkilendirme (Admin/User) işlemlerinden sorumludur.</w:t>
+      </w:r>
+    </w:p>
+    <w:p>
+      <w:r>
+        <w:t xml:space="preserve">- </w:t>
+      </w:r>
+      <w:proofErr w:type="spellStart"/>
+      <w:r>
+        <w:t>Search</w:t>
+      </w:r>
+      <w:proofErr w:type="spellEnd"/>
+      <w:r>
+        <w:t xml:space="preserve"> Engine</w:t>
+      </w:r>
+      <w:r>
+        <w:t xml:space="preserve"> (</w:t>
+      </w:r>
+      <w:proofErr w:type="spellStart"/>
+      <w:r>
+        <w:t>Book</w:t>
+      </w:r>
+      <w:proofErr w:type="spellEnd"/>
+      <w:r>
+        <w:t xml:space="preserve"> Service)</w:t>
+      </w:r>
+      <w:r>
+        <w:t xml:space="preserve">: MySQL </w:t>
+      </w:r>
+      <w:proofErr w:type="spellStart"/>
+      <w:r>
+        <w:t>veritabanı</w:t>
+      </w:r>
+      <w:proofErr w:type="spellEnd"/>
+      <w:r>
+        <w:t xml:space="preserve"> üzerinde kompleks arama ve filtreleme işlemlerini yönetir.</w:t>
       </w:r>
     </w:p>
     <w:p>
@@ -297,12 +516,28 @@
     </w:p>
     <w:p>
       <w:r>
-        <w:t>- Borrowing Service: Kitap ödünç alma ve iade işlemlerinin kontrolünü sağlar.</w:t>
-      </w:r>
-    </w:p>
-    <w:p>
-      <w:r>
-        <w:t>- Penalty Service: Geciken iadeler için sistem tarihine göre otomatik ceza hesaplaması yapar.</w:t>
+        <w:t xml:space="preserve">- </w:t>
+      </w:r>
+      <w:proofErr w:type="spellStart"/>
+      <w:r>
+        <w:t>Borrowing</w:t>
+      </w:r>
+      <w:proofErr w:type="spellEnd"/>
+      <w:r>
+        <w:t xml:space="preserve"> Service: Kitap ödünç alma ve iade işlemlerinin kontrolünü sağlar.</w:t>
+      </w:r>
+    </w:p>
+    <w:p>
+      <w:r>
+        <w:t xml:space="preserve">- </w:t>
+      </w:r>
+      <w:proofErr w:type="spellStart"/>
+      <w:r>
+        <w:t>Penalty</w:t>
+      </w:r>
+      <w:proofErr w:type="spellEnd"/>
+      <w:r>
+        <w:t xml:space="preserve"> Service: Geciken iadeler için sistem tarihine göre otomatik ceza hesaplaması yapar.</w:t>
       </w:r>
     </w:p>
     <w:p/>
@@ -361,63 +596,113 @@
                 <w:b/>
                 <w:bCs/>
               </w:rPr>
-              <w:t>Arayüz (Interface/Method)</w:t>
-            </w:r>
-          </w:p>
-        </w:tc>
-        <w:tc>
-          <w:tcPr>
-            <w:tcW w:w="0" w:type="auto"/>
-            <w:tcBorders>
-              <w:top w:val="single" w:sz="6" w:space="0" w:color="auto"/>
-              <w:left w:val="single" w:sz="6" w:space="0" w:color="auto"/>
-              <w:bottom w:val="single" w:sz="6" w:space="0" w:color="auto"/>
-              <w:right w:val="single" w:sz="6" w:space="0" w:color="auto"/>
-            </w:tcBorders>
-            <w:tcMar>
-              <w:top w:w="240" w:type="dxa"/>
-              <w:left w:w="0" w:type="dxa"/>
-              <w:bottom w:w="240" w:type="dxa"/>
-              <w:right w:w="180" w:type="dxa"/>
-            </w:tcMar>
-            <w:vAlign w:val="center"/>
-            <w:hideMark/>
-          </w:tcPr>
-          <w:p>
+              <w:t>Arayüz (</w:t>
+            </w:r>
+            <w:proofErr w:type="spellStart"/>
             <w:r>
               <w:rPr>
                 <w:b/>
                 <w:bCs/>
               </w:rPr>
-              <w:t>Input Parametreleri</w:t>
-            </w:r>
-          </w:p>
-        </w:tc>
-        <w:tc>
-          <w:tcPr>
-            <w:tcW w:w="0" w:type="auto"/>
-            <w:tcBorders>
-              <w:top w:val="single" w:sz="6" w:space="0" w:color="auto"/>
-              <w:left w:val="single" w:sz="6" w:space="0" w:color="auto"/>
-              <w:bottom w:val="single" w:sz="6" w:space="0" w:color="auto"/>
-              <w:right w:val="single" w:sz="6" w:space="0" w:color="auto"/>
-            </w:tcBorders>
-            <w:tcMar>
-              <w:top w:w="240" w:type="dxa"/>
-              <w:left w:w="0" w:type="dxa"/>
-              <w:bottom w:w="240" w:type="dxa"/>
-              <w:right w:w="0" w:type="dxa"/>
-            </w:tcMar>
-            <w:vAlign w:val="center"/>
-            <w:hideMark/>
-          </w:tcPr>
-          <w:p>
+              <w:t>Interface</w:t>
+            </w:r>
+            <w:proofErr w:type="spellEnd"/>
             <w:r>
               <w:rPr>
                 <w:b/>
                 <w:bCs/>
               </w:rPr>
-              <w:t>Output / Return</w:t>
+              <w:t>/</w:t>
+            </w:r>
+            <w:proofErr w:type="spellStart"/>
+            <w:r>
+              <w:rPr>
+                <w:b/>
+                <w:bCs/>
+              </w:rPr>
+              <w:t>Method</w:t>
+            </w:r>
+            <w:proofErr w:type="spellEnd"/>
+            <w:r>
+              <w:rPr>
+                <w:b/>
+                <w:bCs/>
+              </w:rPr>
+              <w:t>)</w:t>
+            </w:r>
+          </w:p>
+        </w:tc>
+        <w:tc>
+          <w:tcPr>
+            <w:tcW w:w="0" w:type="auto"/>
+            <w:tcBorders>
+              <w:top w:val="single" w:sz="6" w:space="0" w:color="auto"/>
+              <w:left w:val="single" w:sz="6" w:space="0" w:color="auto"/>
+              <w:bottom w:val="single" w:sz="6" w:space="0" w:color="auto"/>
+              <w:right w:val="single" w:sz="6" w:space="0" w:color="auto"/>
+            </w:tcBorders>
+            <w:tcMar>
+              <w:top w:w="240" w:type="dxa"/>
+              <w:left w:w="0" w:type="dxa"/>
+              <w:bottom w:w="240" w:type="dxa"/>
+              <w:right w:w="180" w:type="dxa"/>
+            </w:tcMar>
+            <w:vAlign w:val="center"/>
+            <w:hideMark/>
+          </w:tcPr>
+          <w:p>
+            <w:proofErr w:type="spellStart"/>
+            <w:r>
+              <w:rPr>
+                <w:b/>
+                <w:bCs/>
+              </w:rPr>
+              <w:t>Input</w:t>
+            </w:r>
+            <w:proofErr w:type="spellEnd"/>
+            <w:r>
+              <w:rPr>
+                <w:b/>
+                <w:bCs/>
+              </w:rPr>
+              <w:t xml:space="preserve"> Parametreleri</w:t>
+            </w:r>
+          </w:p>
+        </w:tc>
+        <w:tc>
+          <w:tcPr>
+            <w:tcW w:w="0" w:type="auto"/>
+            <w:tcBorders>
+              <w:top w:val="single" w:sz="6" w:space="0" w:color="auto"/>
+              <w:left w:val="single" w:sz="6" w:space="0" w:color="auto"/>
+              <w:bottom w:val="single" w:sz="6" w:space="0" w:color="auto"/>
+              <w:right w:val="single" w:sz="6" w:space="0" w:color="auto"/>
+            </w:tcBorders>
+            <w:tcMar>
+              <w:top w:w="240" w:type="dxa"/>
+              <w:left w:w="0" w:type="dxa"/>
+              <w:bottom w:w="240" w:type="dxa"/>
+              <w:right w:w="0" w:type="dxa"/>
+            </w:tcMar>
+            <w:vAlign w:val="center"/>
+            <w:hideMark/>
+          </w:tcPr>
+          <w:p>
+            <w:proofErr w:type="spellStart"/>
+            <w:r>
+              <w:rPr>
+                <w:b/>
+                <w:bCs/>
+              </w:rPr>
+              <w:t>Output</w:t>
+            </w:r>
+            <w:proofErr w:type="spellEnd"/>
+            <w:r>
+              <w:rPr>
+                <w:b/>
+                <w:bCs/>
+              </w:rPr>
+              <w:t xml:space="preserve"> / Return</w:t>
             </w:r>
           </w:p>
         </w:tc>
@@ -445,12 +730,37 @@
             <w:hideMark/>
           </w:tcPr>
           <w:p>
+            <w:proofErr w:type="gramStart"/>
             <w:r>
               <w:rPr>
                 <w:b/>
                 <w:bCs/>
               </w:rPr>
-              <w:t>login(credentials)</w:t>
+              <w:t>login</w:t>
+            </w:r>
+            <w:proofErr w:type="gramEnd"/>
+            <w:r>
+              <w:rPr>
+                <w:b/>
+                <w:bCs/>
+              </w:rPr>
+              <w:t>(</w:t>
+            </w:r>
+            <w:proofErr w:type="spellStart"/>
+            <w:r>
+              <w:rPr>
+                <w:b/>
+                <w:bCs/>
+              </w:rPr>
+              <w:t>credentials</w:t>
+            </w:r>
+            <w:proofErr w:type="spellEnd"/>
+            <w:r>
+              <w:rPr>
+                <w:b/>
+                <w:bCs/>
+              </w:rPr>
+              <w:t>)</w:t>
             </w:r>
           </w:p>
         </w:tc>
@@ -473,8 +783,39 @@
             <w:hideMark/>
           </w:tcPr>
           <w:p>
-            <w:r>
-              <w:t xml:space="preserve">username (String), password (String) </w:t>
+            <w:proofErr w:type="spellStart"/>
+            <w:proofErr w:type="gramStart"/>
+            <w:r>
+              <w:t>username</w:t>
+            </w:r>
+            <w:proofErr w:type="spellEnd"/>
+            <w:proofErr w:type="gramEnd"/>
+            <w:r>
+              <w:t xml:space="preserve"> (</w:t>
+            </w:r>
+            <w:proofErr w:type="spellStart"/>
+            <w:r>
+              <w:t>String</w:t>
+            </w:r>
+            <w:proofErr w:type="spellEnd"/>
+            <w:r>
+              <w:t xml:space="preserve">), </w:t>
+            </w:r>
+            <w:proofErr w:type="spellStart"/>
+            <w:r>
+              <w:t>password</w:t>
+            </w:r>
+            <w:proofErr w:type="spellEnd"/>
+            <w:r>
+              <w:t xml:space="preserve"> (</w:t>
+            </w:r>
+            <w:proofErr w:type="spellStart"/>
+            <w:r>
+              <w:t>String</w:t>
+            </w:r>
+            <w:proofErr w:type="spellEnd"/>
+            <w:r>
+              <w:t xml:space="preserve">) </w:t>
             </w:r>
           </w:p>
         </w:tc>
@@ -497,9 +838,19 @@
             <w:hideMark/>
           </w:tcPr>
           <w:p>
-            <w:r>
-              <w:t>AuthToken veya ErrorMessage</w:t>
-            </w:r>
+            <w:proofErr w:type="spellStart"/>
+            <w:r>
+              <w:t>AuthToken</w:t>
+            </w:r>
+            <w:proofErr w:type="spellEnd"/>
+            <w:r>
+              <w:t xml:space="preserve"> veya </w:t>
+            </w:r>
+            <w:proofErr w:type="spellStart"/>
+            <w:r>
+              <w:t>ErrorMessage</w:t>
+            </w:r>
+            <w:proofErr w:type="spellEnd"/>
           </w:p>
         </w:tc>
       </w:tr>
@@ -526,12 +877,39 @@
             <w:hideMark/>
           </w:tcPr>
           <w:p>
+            <w:proofErr w:type="spellStart"/>
+            <w:proofErr w:type="gramStart"/>
             <w:r>
               <w:rPr>
                 <w:b/>
                 <w:bCs/>
               </w:rPr>
-              <w:t>searchBooks(query)</w:t>
+              <w:t>searchBooks</w:t>
+            </w:r>
+            <w:proofErr w:type="spellEnd"/>
+            <w:proofErr w:type="gramEnd"/>
+            <w:r>
+              <w:rPr>
+                <w:b/>
+                <w:bCs/>
+              </w:rPr>
+              <w:t>(</w:t>
+            </w:r>
+            <w:proofErr w:type="spellStart"/>
+            <w:r>
+              <w:rPr>
+                <w:b/>
+                <w:bCs/>
+              </w:rPr>
+              <w:t>query</w:t>
+            </w:r>
+            <w:proofErr w:type="spellEnd"/>
+            <w:r>
+              <w:rPr>
+                <w:b/>
+                <w:bCs/>
+              </w:rPr>
+              <w:t>)</w:t>
             </w:r>
           </w:p>
         </w:tc>
@@ -554,8 +932,39 @@
             <w:hideMark/>
           </w:tcPr>
           <w:p>
-            <w:r>
-              <w:t xml:space="preserve">keyword (String), category (String) </w:t>
+            <w:proofErr w:type="spellStart"/>
+            <w:proofErr w:type="gramStart"/>
+            <w:r>
+              <w:t>keyword</w:t>
+            </w:r>
+            <w:proofErr w:type="spellEnd"/>
+            <w:proofErr w:type="gramEnd"/>
+            <w:r>
+              <w:t xml:space="preserve"> (</w:t>
+            </w:r>
+            <w:proofErr w:type="spellStart"/>
+            <w:r>
+              <w:t>String</w:t>
+            </w:r>
+            <w:proofErr w:type="spellEnd"/>
+            <w:r>
+              <w:t xml:space="preserve">), </w:t>
+            </w:r>
+            <w:proofErr w:type="spellStart"/>
+            <w:r>
+              <w:t>category</w:t>
+            </w:r>
+            <w:proofErr w:type="spellEnd"/>
+            <w:r>
+              <w:t xml:space="preserve"> (</w:t>
+            </w:r>
+            <w:proofErr w:type="spellStart"/>
+            <w:r>
+              <w:t>String</w:t>
+            </w:r>
+            <w:proofErr w:type="spellEnd"/>
+            <w:r>
+              <w:t xml:space="preserve">) </w:t>
             </w:r>
           </w:p>
         </w:tc>
@@ -578,8 +987,21 @@
             <w:hideMark/>
           </w:tcPr>
           <w:p>
-            <w:r>
-              <w:t xml:space="preserve">List&lt;BookObject&gt; </w:t>
+            <w:proofErr w:type="spellStart"/>
+            <w:r>
+              <w:t>List</w:t>
+            </w:r>
+            <w:proofErr w:type="spellEnd"/>
+            <w:r>
+              <w:t>&lt;</w:t>
+            </w:r>
+            <w:proofErr w:type="spellStart"/>
+            <w:r>
+              <w:t>BookObject</w:t>
+            </w:r>
+            <w:proofErr w:type="spellEnd"/>
+            <w:r>
+              <w:t xml:space="preserve">&gt; </w:t>
             </w:r>
           </w:p>
         </w:tc>
@@ -607,13 +1029,24 @@
             <w:hideMark/>
           </w:tcPr>
           <w:p>
+            <w:proofErr w:type="spellStart"/>
+            <w:proofErr w:type="gramStart"/>
             <w:r>
               <w:rPr>
                 <w:b/>
                 <w:bCs/>
               </w:rPr>
               <w:lastRenderedPageBreak/>
-              <w:t>borrowBook(id)</w:t>
+              <w:t>borrowBook</w:t>
+            </w:r>
+            <w:proofErr w:type="spellEnd"/>
+            <w:proofErr w:type="gramEnd"/>
+            <w:r>
+              <w:rPr>
+                <w:b/>
+                <w:bCs/>
+              </w:rPr>
+              <w:t>(id)</w:t>
             </w:r>
           </w:p>
         </w:tc>
@@ -636,8 +1069,39 @@
             <w:hideMark/>
           </w:tcPr>
           <w:p>
-            <w:r>
-              <w:t xml:space="preserve">userId (Int), bookId (Int) </w:t>
+            <w:proofErr w:type="spellStart"/>
+            <w:proofErr w:type="gramStart"/>
+            <w:r>
+              <w:t>userId</w:t>
+            </w:r>
+            <w:proofErr w:type="spellEnd"/>
+            <w:proofErr w:type="gramEnd"/>
+            <w:r>
+              <w:t xml:space="preserve"> (</w:t>
+            </w:r>
+            <w:proofErr w:type="spellStart"/>
+            <w:r>
+              <w:t>Int</w:t>
+            </w:r>
+            <w:proofErr w:type="spellEnd"/>
+            <w:r>
+              <w:t xml:space="preserve">), </w:t>
+            </w:r>
+            <w:proofErr w:type="spellStart"/>
+            <w:r>
+              <w:t>bookId</w:t>
+            </w:r>
+            <w:proofErr w:type="spellEnd"/>
+            <w:r>
+              <w:t xml:space="preserve"> (</w:t>
+            </w:r>
+            <w:proofErr w:type="spellStart"/>
+            <w:r>
+              <w:t>Int</w:t>
+            </w:r>
+            <w:proofErr w:type="spellEnd"/>
+            <w:r>
+              <w:t xml:space="preserve">) </w:t>
             </w:r>
           </w:p>
         </w:tc>
@@ -660,8 +1124,13 @@
             <w:hideMark/>
           </w:tcPr>
           <w:p>
-            <w:r>
-              <w:t xml:space="preserve">Status </w:t>
+            <w:proofErr w:type="spellStart"/>
+            <w:r>
+              <w:t>Status</w:t>
+            </w:r>
+            <w:proofErr w:type="spellEnd"/>
+            <w:r>
+              <w:t xml:space="preserve"> </w:t>
             </w:r>
           </w:p>
         </w:tc>
@@ -689,12 +1158,23 @@
             <w:hideMark/>
           </w:tcPr>
           <w:p>
+            <w:proofErr w:type="spellStart"/>
+            <w:proofErr w:type="gramStart"/>
             <w:r>
               <w:rPr>
                 <w:b/>
                 <w:bCs/>
               </w:rPr>
-              <w:t>calculatePenalty(id)</w:t>
+              <w:t>calculatePenalty</w:t>
+            </w:r>
+            <w:proofErr w:type="spellEnd"/>
+            <w:proofErr w:type="gramEnd"/>
+            <w:r>
+              <w:rPr>
+                <w:b/>
+                <w:bCs/>
+              </w:rPr>
+              <w:t>(id)</w:t>
             </w:r>
           </w:p>
         </w:tc>
@@ -717,8 +1197,39 @@
             <w:hideMark/>
           </w:tcPr>
           <w:p>
-            <w:r>
-              <w:t xml:space="preserve">transactionId (Int), currentDate (Date) </w:t>
+            <w:proofErr w:type="spellStart"/>
+            <w:proofErr w:type="gramStart"/>
+            <w:r>
+              <w:t>transactionId</w:t>
+            </w:r>
+            <w:proofErr w:type="spellEnd"/>
+            <w:proofErr w:type="gramEnd"/>
+            <w:r>
+              <w:t xml:space="preserve"> (</w:t>
+            </w:r>
+            <w:proofErr w:type="spellStart"/>
+            <w:r>
+              <w:t>Int</w:t>
+            </w:r>
+            <w:proofErr w:type="spellEnd"/>
+            <w:r>
+              <w:t xml:space="preserve">), </w:t>
+            </w:r>
+            <w:proofErr w:type="spellStart"/>
+            <w:r>
+              <w:t>currentDate</w:t>
+            </w:r>
+            <w:proofErr w:type="spellEnd"/>
+            <w:r>
+              <w:t xml:space="preserve"> (</w:t>
+            </w:r>
+            <w:proofErr w:type="spellStart"/>
+            <w:r>
+              <w:t>Date</w:t>
+            </w:r>
+            <w:proofErr w:type="spellEnd"/>
+            <w:r>
+              <w:t xml:space="preserve">) </w:t>
             </w:r>
           </w:p>
         </w:tc>
@@ -741,8 +1252,23 @@
             <w:hideMark/>
           </w:tcPr>
           <w:p>
-            <w:r>
-              <w:t xml:space="preserve">penaltyAmount (Double) </w:t>
+            <w:proofErr w:type="spellStart"/>
+            <w:proofErr w:type="gramStart"/>
+            <w:r>
+              <w:t>penaltyAmount</w:t>
+            </w:r>
+            <w:proofErr w:type="spellEnd"/>
+            <w:proofErr w:type="gramEnd"/>
+            <w:r>
+              <w:t xml:space="preserve"> (</w:t>
+            </w:r>
+            <w:proofErr w:type="spellStart"/>
+            <w:r>
+              <w:t>Double</w:t>
+            </w:r>
+            <w:proofErr w:type="spellEnd"/>
+            <w:r>
+              <w:t xml:space="preserve">) </w:t>
             </w:r>
           </w:p>
         </w:tc>
@@ -758,7 +1284,71 @@
         <w:t>Veri Yapıları:</w:t>
       </w:r>
       <w:r>
-        <w:t xml:space="preserve"> User (id, name, role), Book (id, title, author, stock), Transaction (id, userId, bookId, dueDate) sınıflarını içerir.</w:t>
+        <w:t xml:space="preserve"> User (id, name, role), </w:t>
+      </w:r>
+      <w:proofErr w:type="spellStart"/>
+      <w:r>
+        <w:t>Book</w:t>
+      </w:r>
+      <w:proofErr w:type="spellEnd"/>
+      <w:r>
+        <w:t xml:space="preserve"> (id, </w:t>
+      </w:r>
+      <w:proofErr w:type="spellStart"/>
+      <w:r>
+        <w:t>title</w:t>
+      </w:r>
+      <w:proofErr w:type="spellEnd"/>
+      <w:r>
+        <w:t xml:space="preserve">, </w:t>
+      </w:r>
+      <w:proofErr w:type="spellStart"/>
+      <w:r>
+        <w:t>author</w:t>
+      </w:r>
+      <w:proofErr w:type="spellEnd"/>
+      <w:r>
+        <w:t xml:space="preserve">, </w:t>
+      </w:r>
+      <w:proofErr w:type="spellStart"/>
+      <w:r>
+        <w:t>stock</w:t>
+      </w:r>
+      <w:proofErr w:type="spellEnd"/>
+      <w:r>
+        <w:t xml:space="preserve">), </w:t>
+      </w:r>
+      <w:proofErr w:type="spellStart"/>
+      <w:r>
+        <w:t>Transaction</w:t>
+      </w:r>
+      <w:proofErr w:type="spellEnd"/>
+      <w:r>
+        <w:t xml:space="preserve"> (id, </w:t>
+      </w:r>
+      <w:proofErr w:type="spellStart"/>
+      <w:r>
+        <w:t>userId</w:t>
+      </w:r>
+      <w:proofErr w:type="spellEnd"/>
+      <w:r>
+        <w:t xml:space="preserve">, </w:t>
+      </w:r>
+      <w:proofErr w:type="spellStart"/>
+      <w:r>
+        <w:t>bookId</w:t>
+      </w:r>
+      <w:proofErr w:type="spellEnd"/>
+      <w:r>
+        <w:t xml:space="preserve">, </w:t>
+      </w:r>
+      <w:proofErr w:type="spellStart"/>
+      <w:r>
+        <w:t>dueDate</w:t>
+      </w:r>
+      <w:proofErr w:type="spellEnd"/>
+      <w:r>
+        <w:t>) sınıflarını içerir.</w:t>
       </w:r>
     </w:p>
     <w:p>
@@ -773,14 +1363,55 @@
           <w:b/>
           <w:bCs/>
         </w:rPr>
-        <w:t>Projenin çalışır hale gelmesi için tasarlanması gereken minimun classlar</w:t>
-      </w:r>
+        <w:t xml:space="preserve">Projenin çalışır hale gelmesi için tasarlanması gereken </w:t>
+      </w:r>
+      <w:proofErr w:type="spellStart"/>
       <w:r>
         <w:rPr>
           <w:b/>
           <w:bCs/>
         </w:rPr>
-        <w:t>. İlk sprintte implement edilecekler.</w:t>
+        <w:t>minimun</w:t>
+      </w:r>
+      <w:proofErr w:type="spellEnd"/>
+      <w:r>
+        <w:rPr>
+          <w:b/>
+          <w:bCs/>
+        </w:rPr>
+        <w:t xml:space="preserve"> </w:t>
+      </w:r>
+      <w:proofErr w:type="spellStart"/>
+      <w:r>
+        <w:rPr>
+          <w:b/>
+          <w:bCs/>
+        </w:rPr>
+        <w:t>classlar</w:t>
+      </w:r>
+      <w:proofErr w:type="spellEnd"/>
+      <w:r>
+        <w:rPr>
+          <w:b/>
+          <w:bCs/>
+        </w:rPr>
+        <w:t xml:space="preserve">. İlk sprintte </w:t>
+      </w:r>
+      <w:proofErr w:type="spellStart"/>
+      <w:r>
+        <w:rPr>
+          <w:b/>
+          <w:bCs/>
+        </w:rPr>
+        <w:t>implement</w:t>
+      </w:r>
+      <w:proofErr w:type="spellEnd"/>
+      <w:r>
+        <w:rPr>
+          <w:b/>
+          <w:bCs/>
+        </w:rPr>
+        <w:t xml:space="preserve"> edilecekler.</w:t>
       </w:r>
     </w:p>
     <w:p>
@@ -843,8 +1474,199 @@
     </w:p>
     <w:p>
       <w:pPr>
-        <w:pStyle w:val="NormalWeb"/>
+        <w:rPr>
+          <w:b/>
+          <w:bCs/>
+        </w:rPr>
       </w:pPr>
+      <w:r>
+        <w:rPr>
+          <w:b/>
+          <w:bCs/>
+        </w:rPr>
+        <w:lastRenderedPageBreak/>
+        <w:t>Farklı arama stratejilerinin sisteme eklenebilmesi için gereken sınıf yapısı</w:t>
+      </w:r>
+    </w:p>
+    <w:p>
+      <w:pPr>
+        <w:rPr>
+          <w:b/>
+          <w:bCs/>
+        </w:rPr>
+      </w:pPr>
+      <w:r>
+        <w:rPr>
+          <w:b/>
+          <w:bCs/>
+        </w:rPr>
+        <w:drawing>
+          <wp:inline distT="0" distB="0" distL="0" distR="0" wp14:anchorId="1F45D97C" wp14:editId="132C8479">
+            <wp:extent cx="5760720" cy="1050290"/>
+            <wp:effectExtent l="0" t="0" r="0" b="0"/>
+            <wp:docPr id="3" name="Resim 3"/>
+            <wp:cNvGraphicFramePr>
+              <a:graphicFrameLocks xmlns:a="http://schemas.openxmlformats.org/drawingml/2006/main" noChangeAspect="1"/>
+            </wp:cNvGraphicFramePr>
+            <a:graphic xmlns:a="http://schemas.openxmlformats.org/drawingml/2006/main">
+              <a:graphicData uri="http://schemas.openxmlformats.org/drawingml/2006/picture">
+                <pic:pic xmlns:pic="http://schemas.openxmlformats.org/drawingml/2006/picture">
+                  <pic:nvPicPr>
+                    <pic:cNvPr id="0" name="Picture 3"/>
+                    <pic:cNvPicPr>
+                      <a:picLocks noChangeAspect="1" noChangeArrowheads="1"/>
+                    </pic:cNvPicPr>
+                  </pic:nvPicPr>
+                  <pic:blipFill>
+                    <a:blip r:embed="rId7" cstate="print">
+                      <a:extLst>
+                        <a:ext uri="{28A0092B-C50C-407E-A947-70E740481C1C}">
+                          <a14:useLocalDpi xmlns:a14="http://schemas.microsoft.com/office/drawing/2010/main" val="0"/>
+                        </a:ext>
+                      </a:extLst>
+                    </a:blip>
+                    <a:srcRect/>
+                    <a:stretch>
+                      <a:fillRect/>
+                    </a:stretch>
+                  </pic:blipFill>
+                  <pic:spPr bwMode="auto">
+                    <a:xfrm>
+                      <a:off x="0" y="0"/>
+                      <a:ext cx="5760720" cy="1050290"/>
+                    </a:xfrm>
+                    <a:prstGeom prst="rect">
+                      <a:avLst/>
+                    </a:prstGeom>
+                    <a:noFill/>
+                    <a:ln>
+                      <a:noFill/>
+                    </a:ln>
+                  </pic:spPr>
+                </pic:pic>
+              </a:graphicData>
+            </a:graphic>
+          </wp:inline>
+        </w:drawing>
+      </w:r>
+    </w:p>
+    <w:p>
+      <w:pPr>
+        <w:rPr>
+          <w:b/>
+          <w:bCs/>
+        </w:rPr>
+      </w:pPr>
+    </w:p>
+    <w:p>
+      <w:pPr>
+        <w:rPr>
+          <w:b/>
+          <w:bCs/>
+        </w:rPr>
+      </w:pPr>
+      <w:r>
+        <w:rPr>
+          <w:b/>
+          <w:bCs/>
+        </w:rPr>
+        <w:t xml:space="preserve">Projenin süresince </w:t>
+      </w:r>
+      <w:proofErr w:type="spellStart"/>
+      <w:r>
+        <w:rPr>
+          <w:b/>
+          <w:bCs/>
+        </w:rPr>
+        <w:t>implement</w:t>
+      </w:r>
+      <w:proofErr w:type="spellEnd"/>
+      <w:r>
+        <w:rPr>
+          <w:b/>
+          <w:bCs/>
+        </w:rPr>
+        <w:t xml:space="preserve"> edilmesi hedeflenen Class </w:t>
+      </w:r>
+      <w:proofErr w:type="spellStart"/>
+      <w:r>
+        <w:rPr>
+          <w:b/>
+          <w:bCs/>
+        </w:rPr>
+        <w:t>Diagramı</w:t>
+      </w:r>
+      <w:proofErr w:type="spellEnd"/>
+    </w:p>
+    <w:p>
+      <w:pPr>
+        <w:rPr>
+          <w:b/>
+          <w:bCs/>
+        </w:rPr>
+      </w:pPr>
+      <w:r>
+        <w:rPr>
+          <w:b/>
+          <w:bCs/>
+        </w:rPr>
+        <w:drawing>
+          <wp:inline distT="0" distB="0" distL="0" distR="0" wp14:anchorId="64649F7A" wp14:editId="33CC779E">
+            <wp:extent cx="5760720" cy="2842260"/>
+            <wp:effectExtent l="0" t="0" r="0" b="0"/>
+            <wp:docPr id="1" name="Resim 1"/>
+            <wp:cNvGraphicFramePr>
+              <a:graphicFrameLocks xmlns:a="http://schemas.openxmlformats.org/drawingml/2006/main" noChangeAspect="1"/>
+            </wp:cNvGraphicFramePr>
+            <a:graphic xmlns:a="http://schemas.openxmlformats.org/drawingml/2006/main">
+              <a:graphicData uri="http://schemas.openxmlformats.org/drawingml/2006/picture">
+                <pic:pic xmlns:pic="http://schemas.openxmlformats.org/drawingml/2006/picture">
+                  <pic:nvPicPr>
+                    <pic:cNvPr id="0" name="Picture 1"/>
+                    <pic:cNvPicPr>
+                      <a:picLocks noChangeAspect="1" noChangeArrowheads="1"/>
+                    </pic:cNvPicPr>
+                  </pic:nvPicPr>
+                  <pic:blipFill>
+                    <a:blip r:embed="rId8" cstate="print">
+                      <a:extLst>
+                        <a:ext uri="{28A0092B-C50C-407E-A947-70E740481C1C}">
+                          <a14:useLocalDpi xmlns:a14="http://schemas.microsoft.com/office/drawing/2010/main" val="0"/>
+                        </a:ext>
+                      </a:extLst>
+                    </a:blip>
+                    <a:srcRect/>
+                    <a:stretch>
+                      <a:fillRect/>
+                    </a:stretch>
+                  </pic:blipFill>
+                  <pic:spPr bwMode="auto">
+                    <a:xfrm>
+                      <a:off x="0" y="0"/>
+                      <a:ext cx="5760720" cy="2842260"/>
+                    </a:xfrm>
+                    <a:prstGeom prst="rect">
+                      <a:avLst/>
+                    </a:prstGeom>
+                    <a:noFill/>
+                    <a:ln>
+                      <a:noFill/>
+                    </a:ln>
+                  </pic:spPr>
+                </pic:pic>
+              </a:graphicData>
+            </a:graphic>
+          </wp:inline>
+        </w:drawing>
+      </w:r>
+    </w:p>
+    <w:p>
+      <w:pPr>
+        <w:rPr>
+          <w:b/>
+          <w:bCs/>
+        </w:rPr>
+      </w:pPr>
     </w:p>
     <w:p>
       <w:r>
@@ -863,17 +1685,65 @@
     </w:p>
     <w:p>
       <w:r>
-        <w:t>2. UI, BorrowService bileşenine bookId ve userId bilgilerini gönderir.</w:t>
-      </w:r>
-    </w:p>
-    <w:p>
-      <w:r>
-        <w:t>3. Service, BookRepository aracılığıyla MySQL'den kitabın stok durumunu kontrol eder.</w:t>
-      </w:r>
-    </w:p>
-    <w:p>
-      <w:r>
-        <w:t>4. Stok mevcutsa, veritabanında stok 1 azaltılır ve yeni bir Transaction kaydı oluşturulur.</w:t>
+        <w:t xml:space="preserve">2. UI, </w:t>
+      </w:r>
+      <w:proofErr w:type="spellStart"/>
+      <w:r>
+        <w:t>BorrowService</w:t>
+      </w:r>
+      <w:proofErr w:type="spellEnd"/>
+      <w:r>
+        <w:t xml:space="preserve"> bileşenine </w:t>
+      </w:r>
+      <w:proofErr w:type="spellStart"/>
+      <w:r>
+        <w:t>bookId</w:t>
+      </w:r>
+      <w:proofErr w:type="spellEnd"/>
+      <w:r>
+        <w:t xml:space="preserve"> ve </w:t>
+      </w:r>
+      <w:proofErr w:type="spellStart"/>
+      <w:r>
+        <w:t>userId</w:t>
+      </w:r>
+      <w:proofErr w:type="spellEnd"/>
+      <w:r>
+        <w:t xml:space="preserve"> bilgilerini gönderir.</w:t>
+      </w:r>
+    </w:p>
+    <w:p>
+      <w:r>
+        <w:t xml:space="preserve">3. Service, </w:t>
+      </w:r>
+      <w:proofErr w:type="spellStart"/>
+      <w:r>
+        <w:t>BookRepository</w:t>
+      </w:r>
+      <w:proofErr w:type="spellEnd"/>
+      <w:r>
+        <w:t xml:space="preserve"> aracılığıyla MySQL'den kitabın stok durumunu kontrol eder.</w:t>
+      </w:r>
+    </w:p>
+    <w:p>
+      <w:r>
+        <w:t xml:space="preserve">4. Stok mevcutsa, </w:t>
+      </w:r>
+      <w:proofErr w:type="spellStart"/>
+      <w:r>
+        <w:t>veritabanında</w:t>
+      </w:r>
+      <w:proofErr w:type="spellEnd"/>
+      <w:r>
+        <w:t xml:space="preserve"> stok 1 azaltılır ve yeni bir </w:t>
+      </w:r>
+      <w:proofErr w:type="spellStart"/>
+      <w:r>
+        <w:t>Transaction</w:t>
+      </w:r>
+      <w:proofErr w:type="spellEnd"/>
+      <w:r>
+        <w:t xml:space="preserve"> kaydı oluşturulur.</w:t>
       </w:r>
     </w:p>
     <w:p>
@@ -889,7 +1759,23 @@
     </w:p>
     <w:p>
       <w:r>
-        <w:t>Proje, başlangıç aşamasında Tek Makine (Single Node) mimarisiyle dağıtılacaktır.</w:t>
+        <w:t>Proje, başlangıç aşamasında Tek Makine (</w:t>
+      </w:r>
+      <w:proofErr w:type="spellStart"/>
+      <w:r>
+        <w:t>Single</w:t>
+      </w:r>
+      <w:proofErr w:type="spellEnd"/>
+      <w:r>
+        <w:t xml:space="preserve"> </w:t>
+      </w:r>
+      <w:proofErr w:type="spellStart"/>
+      <w:r>
+        <w:t>Node</w:t>
+      </w:r>
+      <w:proofErr w:type="spellEnd"/>
+      <w:r>
+        <w:t>) mimarisiyle dağıtılacaktır.</w:t>
       </w:r>
     </w:p>
     <w:p>
@@ -899,12 +1785,29 @@
     </w:p>
     <w:p>
       <w:r>
-        <w:t>- Uygulama Sunucusu: Java Spring Boot uygulamasının çalıştığı JVM ortamı.</w:t>
-      </w:r>
-    </w:p>
-    <w:p>
-      <w:r>
-        <w:t>- Veritabanı Sunucusu: Aynı sunucu üzerinde barındırılan MySQL DB.</w:t>
+        <w:lastRenderedPageBreak/>
+        <w:t xml:space="preserve">- Uygulama Sunucusu: Java Spring </w:t>
+      </w:r>
+      <w:proofErr w:type="spellStart"/>
+      <w:r>
+        <w:t>Boot</w:t>
+      </w:r>
+      <w:proofErr w:type="spellEnd"/>
+      <w:r>
+        <w:t xml:space="preserve"> uygulamasının çalıştığı JVM ortamı.</w:t>
+      </w:r>
+    </w:p>
+    <w:p>
+      <w:r>
+        <w:t xml:space="preserve">- </w:t>
+      </w:r>
+      <w:proofErr w:type="spellStart"/>
+      <w:r>
+        <w:t>Veritabanı</w:t>
+      </w:r>
+      <w:proofErr w:type="spellEnd"/>
+      <w:r>
+        <w:t xml:space="preserve"> Sunucusu: Aynı sunucu üzerinde barındırılan MySQL DB.</w:t>
       </w:r>
     </w:p>
     <w:p/>
@@ -1345,8 +2248,13 @@
             <w:hideMark/>
           </w:tcPr>
           <w:p>
-            <w:r>
-              <w:t>Sequence &amp; Deployment Diyagramları</w:t>
+            <w:proofErr w:type="spellStart"/>
+            <w:r>
+              <w:t>Sequence</w:t>
+            </w:r>
+            <w:proofErr w:type="spellEnd"/>
+            <w:r>
+              <w:t xml:space="preserve"> &amp; Deployment Diyagramları</w:t>
             </w:r>
           </w:p>
         </w:tc>
@@ -1471,7 +2379,6 @@
           </w:tcPr>
           <w:p>
             <w:r>
-              <w:lastRenderedPageBreak/>
               <w:t>Arayüz ve Parametre Tanımlamaları</w:t>
             </w:r>
           </w:p>
@@ -1596,8 +2503,13 @@
             <w:hideMark/>
           </w:tcPr>
           <w:p>
-            <w:r>
-              <w:t>Döküman Formatlama ve Son Kontrol</w:t>
+            <w:proofErr w:type="spellStart"/>
+            <w:r>
+              <w:t>Döküman</w:t>
+            </w:r>
+            <w:proofErr w:type="spellEnd"/>
+            <w:r>
+              <w:t xml:space="preserve"> Formatlama ve Son Kontrol</w:t>
             </w:r>
           </w:p>
         </w:tc>
@@ -2526,7 +3438,6 @@
   <w:style w:type="character" w:default="1" w:styleId="VarsaylanParagrafYazTipi">
     <w:name w:val="Default Paragraph Font"/>
     <w:uiPriority w:val="1"/>
-    <w:semiHidden/>
     <w:unhideWhenUsed/>
   </w:style>
   <w:style w:type="table" w:default="1" w:styleId="NormalTablo">

</xml_diff>

<commit_message>
DOCS: Tasarım dökümanına Observer Class eklendi
</commit_message>
<xml_diff>
--- a/docs/Design Document.docx
+++ b/docs/Design Document.docx
@@ -40,67 +40,33 @@
     </w:p>
     <w:p>
       <w:r>
-        <w:t xml:space="preserve">2. ÜST SEVİYE BİLEŞEN YAPISI (COMPONENT </w:t>
-      </w:r>
-      <w:proofErr w:type="gramStart"/>
-      <w:r>
-        <w:t>DIAGRAM).....................</w:t>
-      </w:r>
-      <w:proofErr w:type="gramEnd"/>
-      <w:r>
-        <w:t>2</w:t>
-      </w:r>
-    </w:p>
-    <w:p>
-      <w:r>
-        <w:t xml:space="preserve">3. BİLEŞENLER ARASI ARAYÜZLER VE PARAMETRELER (CLASS </w:t>
-      </w:r>
-      <w:proofErr w:type="gramStart"/>
-      <w:r>
-        <w:t>DIAGRAM).........</w:t>
-      </w:r>
-      <w:proofErr w:type="gramEnd"/>
-      <w:r>
-        <w:t>3</w:t>
-      </w:r>
-    </w:p>
-    <w:p>
-      <w:r>
-        <w:t xml:space="preserve">4. FONKSİYONLARIN ÇALIŞMA AKIŞI (SEQUENCE </w:t>
-      </w:r>
-      <w:proofErr w:type="gramStart"/>
-      <w:r>
-        <w:t>DIAGRAM)...................</w:t>
-      </w:r>
-      <w:proofErr w:type="gramEnd"/>
-      <w:r>
-        <w:t>4</w:t>
-      </w:r>
-    </w:p>
-    <w:p>
-      <w:r>
-        <w:t xml:space="preserve">5. SİSTEMİN DAĞITIMI (DEPLOYMENT </w:t>
-      </w:r>
-      <w:proofErr w:type="gramStart"/>
-      <w:r>
-        <w:t>DIAGRAM)............................</w:t>
-      </w:r>
-      <w:proofErr w:type="gramEnd"/>
-      <w:r>
-        <w:t>5</w:t>
-      </w:r>
-    </w:p>
-    <w:p>
-      <w:r>
-        <w:t xml:space="preserve">6. GÖREV MATRİSİ (TASK </w:t>
-      </w:r>
-      <w:proofErr w:type="gramStart"/>
-      <w:r>
-        <w:t>MATRIX).......................................</w:t>
-      </w:r>
-      <w:proofErr w:type="gramEnd"/>
-      <w:r>
-        <w:t>6</w:t>
+        <w:t>2. ÜST SEVİYE BİLEŞEN YAPISI (COMPONENT DIAGRAM).....................2</w:t>
+      </w:r>
+    </w:p>
+    <w:p>
+      <w:r>
+        <w:t>3. BİLEŞENLER ARASI ARAYÜZLER VE PARAMETRELER (CLASS DIAGRAM).........3</w:t>
+      </w:r>
+    </w:p>
+    <w:p>
+      <w:r>
+        <w:t>4. FONKSİYONLARIN ÇALIŞMA AKIŞI (SEQUENCE DIAGRAM)...................4</w:t>
+      </w:r>
+    </w:p>
+    <w:p>
+      <w:r>
+        <w:t>5. SİSTEMİN DAĞITIMI (DEPLOYMENT DIAGRAM)............................</w:t>
+      </w:r>
+      <w:r>
+        <w:t>7</w:t>
+      </w:r>
+    </w:p>
+    <w:p>
+      <w:r>
+        <w:t>6. GÖREV MATRİSİ (TASK MATRIX).......................................</w:t>
+      </w:r>
+      <w:r>
+        <w:t>8</w:t>
       </w:r>
     </w:p>
     <w:p/>
@@ -125,21 +91,8 @@
       <w:pPr>
         <w:ind w:firstLine="708"/>
       </w:pPr>
-      <w:proofErr w:type="spellStart"/>
-      <w:r>
-        <w:t>LibRA</w:t>
-      </w:r>
-      <w:proofErr w:type="spellEnd"/>
-      <w:r>
-        <w:t xml:space="preserve"> projesinde Katmanlı Mimari (</w:t>
-      </w:r>
-      <w:proofErr w:type="spellStart"/>
-      <w:r>
-        <w:t>Layered</w:t>
-      </w:r>
-      <w:proofErr w:type="spellEnd"/>
-      <w:r>
-        <w:t xml:space="preserve"> Architecture) tercih edilmiştir. Bu mimari, sistemin sürdürülebilirliğini artırmak, kodun yeniden kullanılabilirliğini sağlamak ve farklı sorumlulukları birbirinden net bir şekilde ayırmak amacıyla kullanılmıştır.</w:t>
+      <w:r>
+        <w:t>LibRA projesinde Katmanlı Mimari (Layered Architecture) tercih edilmiştir. Bu mimari, sistemin sürdürülebilirliğini artırmak, kodun yeniden kullanılabilirliğini sağlamak ve farklı sorumlulukları birbirinden net bir şekilde ayırmak amacıyla kullanılmıştır.</w:t>
       </w:r>
     </w:p>
     <w:p/>
@@ -152,42 +105,10 @@
         </w:numPr>
       </w:pPr>
       <w:r>
-        <w:t xml:space="preserve">Sunum Katmanı (Presentation </w:t>
-      </w:r>
-      <w:proofErr w:type="spellStart"/>
-      <w:r>
-        <w:t>Layer</w:t>
-      </w:r>
-      <w:proofErr w:type="spellEnd"/>
-      <w:r>
-        <w:t>): Kullanıcı etkileşimini yöneten katmandır. Web arayüzü (HTML/CSS/JS) bu katmanda yer alır.</w:t>
-      </w:r>
-      <w:r>
-        <w:t xml:space="preserve"> Bu dosyalar kullanıcı arayüzünü oluşturur ve </w:t>
-      </w:r>
-      <w:proofErr w:type="spellStart"/>
-      <w:r>
-        <w:t>API’a</w:t>
-      </w:r>
-      <w:proofErr w:type="spellEnd"/>
-      <w:r>
-        <w:t xml:space="preserve"> istek gönderir. Java </w:t>
-      </w:r>
-      <w:proofErr w:type="spellStart"/>
-      <w:r>
-        <w:t>Sprin</w:t>
-      </w:r>
-      <w:proofErr w:type="spellEnd"/>
-      <w:r>
-        <w:t xml:space="preserve"> </w:t>
-      </w:r>
-      <w:proofErr w:type="spellStart"/>
-      <w:r>
-        <w:t>Boot</w:t>
-      </w:r>
-      <w:proofErr w:type="spellEnd"/>
-      <w:r>
-        <w:t xml:space="preserve"> ve JPA ile hazırlanmış Controller sınıfları da bu katmanda yer alır. Arayüzden gelen istekleri karşılar ve ilgili Service katmanına yönlendirir.</w:t>
+        <w:t>Sunum Katmanı (Presentation Layer): Kullanıcı etkileşimini yöneten katmandır. Web arayüzü (HTML/CSS/JS) bu katmanda yer alır.</w:t>
+      </w:r>
+      <w:r>
+        <w:t xml:space="preserve"> Bu dosyalar kullanıcı arayüzünü oluşturur ve API’a istek gönderir. Java Sprin Boot ve JPA ile hazırlanmış Controller sınıfları da bu katmanda yer alır. Arayüzden gelen istekleri karşılar ve ilgili Service katmanına yönlendirir.</w:t>
       </w:r>
     </w:p>
     <w:p/>
@@ -200,31 +121,7 @@
         </w:numPr>
       </w:pPr>
       <w:r>
-        <w:t xml:space="preserve">Uygulama/Servis Katmanı (Service </w:t>
-      </w:r>
-      <w:proofErr w:type="spellStart"/>
-      <w:r>
-        <w:t>Layer</w:t>
-      </w:r>
-      <w:proofErr w:type="spellEnd"/>
-      <w:r>
-        <w:t>): Sistemin iş mantığının (</w:t>
-      </w:r>
-      <w:proofErr w:type="spellStart"/>
-      <w:r>
-        <w:t>business</w:t>
-      </w:r>
-      <w:proofErr w:type="spellEnd"/>
-      <w:r>
-        <w:t xml:space="preserve"> </w:t>
-      </w:r>
-      <w:proofErr w:type="spellStart"/>
-      <w:r>
-        <w:t>logic</w:t>
-      </w:r>
-      <w:proofErr w:type="spellEnd"/>
-      <w:r>
-        <w:t>) yürütüldüğü katmandır. Ödünç alma kuralları, ceza hesaplama algoritmaları ve kullanıcı yetkilendirme süreçleri burada işlenir.</w:t>
+        <w:t>Uygulama/Servis Katmanı (Service Layer): Sistemin iş mantığının (business logic) yürütüldüğü katmandır. Ödünç alma kuralları, ceza hesaplama algoritmaları ve kullanıcı yetkilendirme süreçleri burada işlenir.</w:t>
       </w:r>
       <w:r>
         <w:t xml:space="preserve"> Java Service </w:t>
@@ -251,62 +148,15 @@
       <w:r>
         <w:t>(</w:t>
       </w:r>
-      <w:proofErr w:type="spellStart"/>
-      <w:r>
-        <w:t>Repository</w:t>
-      </w:r>
-      <w:proofErr w:type="spellEnd"/>
-      <w:r>
-        <w:t xml:space="preserve"> </w:t>
-      </w:r>
-      <w:proofErr w:type="spellStart"/>
-      <w:r>
-        <w:t>Layer</w:t>
-      </w:r>
-      <w:proofErr w:type="spellEnd"/>
-      <w:r>
-        <w:t xml:space="preserve">): İş mantığı ile </w:t>
-      </w:r>
-      <w:proofErr w:type="spellStart"/>
-      <w:r>
-        <w:t>veritabanı</w:t>
-      </w:r>
-      <w:proofErr w:type="spellEnd"/>
-      <w:r>
-        <w:t xml:space="preserve"> arasındaki köprüdür. MySQL </w:t>
-      </w:r>
-      <w:proofErr w:type="spellStart"/>
-      <w:r>
-        <w:t>veritabanına</w:t>
-      </w:r>
-      <w:proofErr w:type="spellEnd"/>
-      <w:r>
-        <w:t xml:space="preserve"> yönelik sorguların yürütüldüğü katmandır.</w:t>
-      </w:r>
-      <w:r>
-        <w:t xml:space="preserve"> JPA kullanarak veri tabanına SQL sorguları </w:t>
-      </w:r>
-      <w:proofErr w:type="spellStart"/>
-      <w:r>
-        <w:t>gönermekten</w:t>
-      </w:r>
-      <w:proofErr w:type="spellEnd"/>
-      <w:r>
-        <w:t xml:space="preserve"> sorumludur. </w:t>
-      </w:r>
-      <w:proofErr w:type="spellStart"/>
-      <w:r>
-        <w:t>Repository</w:t>
-      </w:r>
-      <w:proofErr w:type="spellEnd"/>
-      <w:r>
-        <w:t xml:space="preserve"> </w:t>
-      </w:r>
-      <w:proofErr w:type="spellStart"/>
+      <w:r>
+        <w:t>Repository Layer): İş mantığı ile veritabanı arasındaki köprüdür. MySQL veritabanına yönelik sorguların yürütüldüğü katmandır.</w:t>
+      </w:r>
+      <w:r>
+        <w:t xml:space="preserve"> JPA kullanarak veri tabanına SQL sorguları gönermekten sorumludur. Repository </w:t>
+      </w:r>
       <w:r>
         <w:t>interface’lerinden</w:t>
       </w:r>
-      <w:proofErr w:type="spellEnd"/>
       <w:r>
         <w:t xml:space="preserve"> oluşur.</w:t>
       </w:r>
@@ -337,21 +187,8 @@
           <w:numId w:val="2"/>
         </w:numPr>
       </w:pPr>
-      <w:proofErr w:type="spellStart"/>
-      <w:r>
-        <w:t>Entity</w:t>
-      </w:r>
-      <w:proofErr w:type="spellEnd"/>
-      <w:r>
-        <w:t xml:space="preserve"> Katmanı: Veri tabanındaki tabloları Java sınıflarının tanımasını sağlayan </w:t>
-      </w:r>
-      <w:proofErr w:type="spellStart"/>
-      <w:r>
-        <w:t>Entity</w:t>
-      </w:r>
-      <w:proofErr w:type="spellEnd"/>
-      <w:r>
-        <w:t xml:space="preserve"> sınıfları, Book.java User.java gibi dosyalardan oluşur.</w:t>
+      <w:r>
+        <w:t>Entity Katmanı: Veri tabanındaki tabloları Java sınıflarının tanımasını sağlayan Entity sınıfları, Book.java User.java gibi dosyalardan oluşur.</w:t>
       </w:r>
     </w:p>
     <w:p/>
@@ -418,15 +255,7 @@
         <w:ind w:firstLine="708"/>
       </w:pPr>
       <w:r>
-        <w:t>Sistem, modüler bir yapıda tasarlanmış olup bileşenler birbirleriyle API/</w:t>
-      </w:r>
-      <w:proofErr w:type="spellStart"/>
-      <w:r>
-        <w:t>Interface</w:t>
-      </w:r>
-      <w:proofErr w:type="spellEnd"/>
-      <w:r>
-        <w:t xml:space="preserve"> düzeyinde haberleşir.</w:t>
+        <w:t>Sistem, modüler bir yapıda tasarlanmış olup bileşenler birbirleriyle API/Interface düzeyinde haberleşir.</w:t>
       </w:r>
     </w:p>
     <w:p/>
@@ -442,71 +271,23 @@
     </w:p>
     <w:p>
       <w:r>
-        <w:t xml:space="preserve">- REST API: UI ile </w:t>
-      </w:r>
-      <w:proofErr w:type="spellStart"/>
-      <w:r>
-        <w:t>backend</w:t>
-      </w:r>
-      <w:proofErr w:type="spellEnd"/>
-      <w:r>
-        <w:t xml:space="preserve"> modülleri arasındaki yönlendirmeyi sağlayan arayüz.</w:t>
-      </w:r>
-    </w:p>
-    <w:p>
-      <w:r>
-        <w:t xml:space="preserve">- </w:t>
-      </w:r>
-      <w:proofErr w:type="spellStart"/>
-      <w:r>
-        <w:t>Auth</w:t>
-      </w:r>
-      <w:proofErr w:type="spellEnd"/>
-      <w:r>
-        <w:t xml:space="preserve"> </w:t>
-      </w:r>
-      <w:proofErr w:type="spellStart"/>
-      <w:r>
-        <w:t>Module</w:t>
-      </w:r>
-      <w:proofErr w:type="spellEnd"/>
-      <w:r>
-        <w:t>: Kullanıcı kayıt, giriş ve yetkilendirme (Admin/User) işlemlerinden sorumludur.</w:t>
-      </w:r>
-    </w:p>
-    <w:p>
-      <w:r>
-        <w:t xml:space="preserve">- </w:t>
-      </w:r>
-      <w:proofErr w:type="spellStart"/>
-      <w:r>
-        <w:t>Search</w:t>
-      </w:r>
-      <w:proofErr w:type="spellEnd"/>
-      <w:r>
-        <w:t xml:space="preserve"> Engine</w:t>
-      </w:r>
-      <w:r>
-        <w:t xml:space="preserve"> (</w:t>
-      </w:r>
-      <w:proofErr w:type="spellStart"/>
-      <w:r>
-        <w:t>Book</w:t>
-      </w:r>
-      <w:proofErr w:type="spellEnd"/>
-      <w:r>
-        <w:t xml:space="preserve"> Service)</w:t>
-      </w:r>
-      <w:r>
-        <w:t xml:space="preserve">: MySQL </w:t>
-      </w:r>
-      <w:proofErr w:type="spellStart"/>
-      <w:r>
-        <w:t>veritabanı</w:t>
-      </w:r>
-      <w:proofErr w:type="spellEnd"/>
-      <w:r>
-        <w:t xml:space="preserve"> üzerinde kompleks arama ve filtreleme işlemlerini yönetir.</w:t>
+        <w:t>- REST API: UI ile backend modülleri arasındaki yönlendirmeyi sağlayan arayüz.</w:t>
+      </w:r>
+    </w:p>
+    <w:p>
+      <w:r>
+        <w:t>- Auth Module: Kullanıcı kayıt, giriş ve yetkilendirme (Admin/User) işlemlerinden sorumludur.</w:t>
+      </w:r>
+    </w:p>
+    <w:p>
+      <w:r>
+        <w:t>- Search Engine</w:t>
+      </w:r>
+      <w:r>
+        <w:t xml:space="preserve"> (Book Service)</w:t>
+      </w:r>
+      <w:r>
+        <w:t>: MySQL veritabanı üzerinde kompleks arama ve filtreleme işlemlerini yönetir.</w:t>
       </w:r>
     </w:p>
     <w:p>
@@ -516,28 +297,12 @@
     </w:p>
     <w:p>
       <w:r>
-        <w:t xml:space="preserve">- </w:t>
-      </w:r>
-      <w:proofErr w:type="spellStart"/>
-      <w:r>
-        <w:t>Borrowing</w:t>
-      </w:r>
-      <w:proofErr w:type="spellEnd"/>
-      <w:r>
-        <w:t xml:space="preserve"> Service: Kitap ödünç alma ve iade işlemlerinin kontrolünü sağlar.</w:t>
-      </w:r>
-    </w:p>
-    <w:p>
-      <w:r>
-        <w:t xml:space="preserve">- </w:t>
-      </w:r>
-      <w:proofErr w:type="spellStart"/>
-      <w:r>
-        <w:t>Penalty</w:t>
-      </w:r>
-      <w:proofErr w:type="spellEnd"/>
-      <w:r>
-        <w:t xml:space="preserve"> Service: Geciken iadeler için sistem tarihine göre otomatik ceza hesaplaması yapar.</w:t>
+        <w:t>- Borrowing Service: Kitap ödünç alma ve iade işlemlerinin kontrolünü sağlar.</w:t>
+      </w:r>
+    </w:p>
+    <w:p>
+      <w:r>
+        <w:t>- Penalty Service: Geciken iadeler için sistem tarihine göre otomatik ceza hesaplaması yapar.</w:t>
       </w:r>
     </w:p>
     <w:p/>
@@ -596,39 +361,7 @@
                 <w:b/>
                 <w:bCs/>
               </w:rPr>
-              <w:t>Arayüz (</w:t>
-            </w:r>
-            <w:proofErr w:type="spellStart"/>
-            <w:r>
-              <w:rPr>
-                <w:b/>
-                <w:bCs/>
-              </w:rPr>
-              <w:t>Interface</w:t>
-            </w:r>
-            <w:proofErr w:type="spellEnd"/>
-            <w:r>
-              <w:rPr>
-                <w:b/>
-                <w:bCs/>
-              </w:rPr>
-              <w:t>/</w:t>
-            </w:r>
-            <w:proofErr w:type="spellStart"/>
-            <w:r>
-              <w:rPr>
-                <w:b/>
-                <w:bCs/>
-              </w:rPr>
-              <w:t>Method</w:t>
-            </w:r>
-            <w:proofErr w:type="spellEnd"/>
-            <w:r>
-              <w:rPr>
-                <w:b/>
-                <w:bCs/>
-              </w:rPr>
-              <w:t>)</w:t>
+              <w:t>Arayüz (Interface/Method)</w:t>
             </w:r>
           </w:p>
         </w:tc>
@@ -651,21 +384,12 @@
             <w:hideMark/>
           </w:tcPr>
           <w:p>
-            <w:proofErr w:type="spellStart"/>
             <w:r>
               <w:rPr>
                 <w:b/>
                 <w:bCs/>
               </w:rPr>
-              <w:t>Input</w:t>
-            </w:r>
-            <w:proofErr w:type="spellEnd"/>
-            <w:r>
-              <w:rPr>
-                <w:b/>
-                <w:bCs/>
-              </w:rPr>
-              <w:t xml:space="preserve"> Parametreleri</w:t>
+              <w:t>Input Parametreleri</w:t>
             </w:r>
           </w:p>
         </w:tc>
@@ -688,21 +412,12 @@
             <w:hideMark/>
           </w:tcPr>
           <w:p>
-            <w:proofErr w:type="spellStart"/>
             <w:r>
               <w:rPr>
                 <w:b/>
                 <w:bCs/>
               </w:rPr>
-              <w:t>Output</w:t>
-            </w:r>
-            <w:proofErr w:type="spellEnd"/>
-            <w:r>
-              <w:rPr>
-                <w:b/>
-                <w:bCs/>
-              </w:rPr>
-              <w:t xml:space="preserve"> / Return</w:t>
+              <w:t>Output / Return</w:t>
             </w:r>
           </w:p>
         </w:tc>
@@ -730,37 +445,12 @@
             <w:hideMark/>
           </w:tcPr>
           <w:p>
-            <w:proofErr w:type="gramStart"/>
             <w:r>
               <w:rPr>
                 <w:b/>
                 <w:bCs/>
               </w:rPr>
-              <w:t>login</w:t>
-            </w:r>
-            <w:proofErr w:type="gramEnd"/>
-            <w:r>
-              <w:rPr>
-                <w:b/>
-                <w:bCs/>
-              </w:rPr>
-              <w:t>(</w:t>
-            </w:r>
-            <w:proofErr w:type="spellStart"/>
-            <w:r>
-              <w:rPr>
-                <w:b/>
-                <w:bCs/>
-              </w:rPr>
-              <w:t>credentials</w:t>
-            </w:r>
-            <w:proofErr w:type="spellEnd"/>
-            <w:r>
-              <w:rPr>
-                <w:b/>
-                <w:bCs/>
-              </w:rPr>
-              <w:t>)</w:t>
+              <w:t>login(credentials)</w:t>
             </w:r>
           </w:p>
         </w:tc>
@@ -783,39 +473,8 @@
             <w:hideMark/>
           </w:tcPr>
           <w:p>
-            <w:proofErr w:type="spellStart"/>
-            <w:proofErr w:type="gramStart"/>
             <w:r>
-              <w:t>username</w:t>
-            </w:r>
-            <w:proofErr w:type="spellEnd"/>
-            <w:proofErr w:type="gramEnd"/>
-            <w:r>
-              <w:t xml:space="preserve"> (</w:t>
-            </w:r>
-            <w:proofErr w:type="spellStart"/>
-            <w:r>
-              <w:t>String</w:t>
-            </w:r>
-            <w:proofErr w:type="spellEnd"/>
-            <w:r>
-              <w:t xml:space="preserve">), </w:t>
-            </w:r>
-            <w:proofErr w:type="spellStart"/>
-            <w:r>
-              <w:t>password</w:t>
-            </w:r>
-            <w:proofErr w:type="spellEnd"/>
-            <w:r>
-              <w:t xml:space="preserve"> (</w:t>
-            </w:r>
-            <w:proofErr w:type="spellStart"/>
-            <w:r>
-              <w:t>String</w:t>
-            </w:r>
-            <w:proofErr w:type="spellEnd"/>
-            <w:r>
-              <w:t xml:space="preserve">) </w:t>
+              <w:t xml:space="preserve">username (String), password (String) </w:t>
             </w:r>
           </w:p>
         </w:tc>
@@ -838,170 +497,8 @@
             <w:hideMark/>
           </w:tcPr>
           <w:p>
-            <w:proofErr w:type="spellStart"/>
             <w:r>
-              <w:t>AuthToken</w:t>
-            </w:r>
-            <w:proofErr w:type="spellEnd"/>
-            <w:r>
-              <w:t xml:space="preserve"> veya </w:t>
-            </w:r>
-            <w:proofErr w:type="spellStart"/>
-            <w:r>
-              <w:t>ErrorMessage</w:t>
-            </w:r>
-            <w:proofErr w:type="spellEnd"/>
-          </w:p>
-        </w:tc>
-      </w:tr>
-      <w:tr>
-        <w:trPr>
-          <w:tblCellSpacing w:w="15" w:type="dxa"/>
-        </w:trPr>
-        <w:tc>
-          <w:tcPr>
-            <w:tcW w:w="0" w:type="auto"/>
-            <w:tcBorders>
-              <w:top w:val="single" w:sz="6" w:space="0" w:color="auto"/>
-              <w:left w:val="single" w:sz="6" w:space="0" w:color="auto"/>
-              <w:bottom w:val="single" w:sz="6" w:space="0" w:color="auto"/>
-              <w:right w:val="single" w:sz="6" w:space="0" w:color="auto"/>
-            </w:tcBorders>
-            <w:tcMar>
-              <w:top w:w="240" w:type="dxa"/>
-              <w:left w:w="0" w:type="dxa"/>
-              <w:bottom w:w="240" w:type="dxa"/>
-              <w:right w:w="180" w:type="dxa"/>
-            </w:tcMar>
-            <w:vAlign w:val="center"/>
-            <w:hideMark/>
-          </w:tcPr>
-          <w:p>
-            <w:proofErr w:type="spellStart"/>
-            <w:proofErr w:type="gramStart"/>
-            <w:r>
-              <w:rPr>
-                <w:b/>
-                <w:bCs/>
-              </w:rPr>
-              <w:t>searchBooks</w:t>
-            </w:r>
-            <w:proofErr w:type="spellEnd"/>
-            <w:proofErr w:type="gramEnd"/>
-            <w:r>
-              <w:rPr>
-                <w:b/>
-                <w:bCs/>
-              </w:rPr>
-              <w:t>(</w:t>
-            </w:r>
-            <w:proofErr w:type="spellStart"/>
-            <w:r>
-              <w:rPr>
-                <w:b/>
-                <w:bCs/>
-              </w:rPr>
-              <w:t>query</w:t>
-            </w:r>
-            <w:proofErr w:type="spellEnd"/>
-            <w:r>
-              <w:rPr>
-                <w:b/>
-                <w:bCs/>
-              </w:rPr>
-              <w:t>)</w:t>
-            </w:r>
-          </w:p>
-        </w:tc>
-        <w:tc>
-          <w:tcPr>
-            <w:tcW w:w="0" w:type="auto"/>
-            <w:tcBorders>
-              <w:top w:val="single" w:sz="6" w:space="0" w:color="auto"/>
-              <w:left w:val="single" w:sz="6" w:space="0" w:color="auto"/>
-              <w:bottom w:val="single" w:sz="6" w:space="0" w:color="auto"/>
-              <w:right w:val="single" w:sz="6" w:space="0" w:color="auto"/>
-            </w:tcBorders>
-            <w:tcMar>
-              <w:top w:w="240" w:type="dxa"/>
-              <w:left w:w="0" w:type="dxa"/>
-              <w:bottom w:w="240" w:type="dxa"/>
-              <w:right w:w="180" w:type="dxa"/>
-            </w:tcMar>
-            <w:vAlign w:val="center"/>
-            <w:hideMark/>
-          </w:tcPr>
-          <w:p>
-            <w:proofErr w:type="spellStart"/>
-            <w:proofErr w:type="gramStart"/>
-            <w:r>
-              <w:t>keyword</w:t>
-            </w:r>
-            <w:proofErr w:type="spellEnd"/>
-            <w:proofErr w:type="gramEnd"/>
-            <w:r>
-              <w:t xml:space="preserve"> (</w:t>
-            </w:r>
-            <w:proofErr w:type="spellStart"/>
-            <w:r>
-              <w:t>String</w:t>
-            </w:r>
-            <w:proofErr w:type="spellEnd"/>
-            <w:r>
-              <w:t xml:space="preserve">), </w:t>
-            </w:r>
-            <w:proofErr w:type="spellStart"/>
-            <w:r>
-              <w:t>category</w:t>
-            </w:r>
-            <w:proofErr w:type="spellEnd"/>
-            <w:r>
-              <w:t xml:space="preserve"> (</w:t>
-            </w:r>
-            <w:proofErr w:type="spellStart"/>
-            <w:r>
-              <w:t>String</w:t>
-            </w:r>
-            <w:proofErr w:type="spellEnd"/>
-            <w:r>
-              <w:t xml:space="preserve">) </w:t>
-            </w:r>
-          </w:p>
-        </w:tc>
-        <w:tc>
-          <w:tcPr>
-            <w:tcW w:w="0" w:type="auto"/>
-            <w:tcBorders>
-              <w:top w:val="single" w:sz="6" w:space="0" w:color="auto"/>
-              <w:left w:val="single" w:sz="6" w:space="0" w:color="auto"/>
-              <w:bottom w:val="single" w:sz="6" w:space="0" w:color="auto"/>
-              <w:right w:val="single" w:sz="6" w:space="0" w:color="auto"/>
-            </w:tcBorders>
-            <w:tcMar>
-              <w:top w:w="240" w:type="dxa"/>
-              <w:left w:w="0" w:type="dxa"/>
-              <w:bottom w:w="240" w:type="dxa"/>
-              <w:right w:w="0" w:type="dxa"/>
-            </w:tcMar>
-            <w:vAlign w:val="center"/>
-            <w:hideMark/>
-          </w:tcPr>
-          <w:p>
-            <w:proofErr w:type="spellStart"/>
-            <w:r>
-              <w:t>List</w:t>
-            </w:r>
-            <w:proofErr w:type="spellEnd"/>
-            <w:r>
-              <w:t>&lt;</w:t>
-            </w:r>
-            <w:proofErr w:type="spellStart"/>
-            <w:r>
-              <w:t>BookObject</w:t>
-            </w:r>
-            <w:proofErr w:type="spellEnd"/>
-            <w:r>
-              <w:t xml:space="preserve">&gt; </w:t>
+              <w:t>AuthToken veya ErrorMessage</w:t>
             </w:r>
           </w:p>
         </w:tc>
@@ -1029,24 +526,12 @@
             <w:hideMark/>
           </w:tcPr>
           <w:p>
-            <w:proofErr w:type="spellStart"/>
-            <w:proofErr w:type="gramStart"/>
             <w:r>
               <w:rPr>
                 <w:b/>
                 <w:bCs/>
               </w:rPr>
-              <w:lastRenderedPageBreak/>
-              <w:t>borrowBook</w:t>
-            </w:r>
-            <w:proofErr w:type="spellEnd"/>
-            <w:proofErr w:type="gramEnd"/>
-            <w:r>
-              <w:rPr>
-                <w:b/>
-                <w:bCs/>
-              </w:rPr>
-              <w:t>(id)</w:t>
+              <w:t>searchBooks(query)</w:t>
             </w:r>
           </w:p>
         </w:tc>
@@ -1069,39 +554,8 @@
             <w:hideMark/>
           </w:tcPr>
           <w:p>
-            <w:proofErr w:type="spellStart"/>
-            <w:proofErr w:type="gramStart"/>
             <w:r>
-              <w:t>userId</w:t>
-            </w:r>
-            <w:proofErr w:type="spellEnd"/>
-            <w:proofErr w:type="gramEnd"/>
-            <w:r>
-              <w:t xml:space="preserve"> (</w:t>
-            </w:r>
-            <w:proofErr w:type="spellStart"/>
-            <w:r>
-              <w:t>Int</w:t>
-            </w:r>
-            <w:proofErr w:type="spellEnd"/>
-            <w:r>
-              <w:t xml:space="preserve">), </w:t>
-            </w:r>
-            <w:proofErr w:type="spellStart"/>
-            <w:r>
-              <w:t>bookId</w:t>
-            </w:r>
-            <w:proofErr w:type="spellEnd"/>
-            <w:r>
-              <w:t xml:space="preserve"> (</w:t>
-            </w:r>
-            <w:proofErr w:type="spellStart"/>
-            <w:r>
-              <w:t>Int</w:t>
-            </w:r>
-            <w:proofErr w:type="spellEnd"/>
-            <w:r>
-              <w:t xml:space="preserve">) </w:t>
+              <w:t xml:space="preserve">keyword (String), category (String) </w:t>
             </w:r>
           </w:p>
         </w:tc>
@@ -1124,13 +578,8 @@
             <w:hideMark/>
           </w:tcPr>
           <w:p>
-            <w:proofErr w:type="spellStart"/>
             <w:r>
-              <w:t>Status</w:t>
-            </w:r>
-            <w:proofErr w:type="spellEnd"/>
-            <w:r>
-              <w:t xml:space="preserve"> </w:t>
+              <w:t xml:space="preserve">List&lt;BookObject&gt; </w:t>
             </w:r>
           </w:p>
         </w:tc>
@@ -1158,23 +607,13 @@
             <w:hideMark/>
           </w:tcPr>
           <w:p>
-            <w:proofErr w:type="spellStart"/>
-            <w:proofErr w:type="gramStart"/>
             <w:r>
               <w:rPr>
                 <w:b/>
                 <w:bCs/>
               </w:rPr>
-              <w:t>calculatePenalty</w:t>
-            </w:r>
-            <w:proofErr w:type="spellEnd"/>
-            <w:proofErr w:type="gramEnd"/>
-            <w:r>
-              <w:rPr>
-                <w:b/>
-                <w:bCs/>
-              </w:rPr>
-              <w:t>(id)</w:t>
+              <w:lastRenderedPageBreak/>
+              <w:t>borrowBook(id)</w:t>
             </w:r>
           </w:p>
         </w:tc>
@@ -1197,39 +636,8 @@
             <w:hideMark/>
           </w:tcPr>
           <w:p>
-            <w:proofErr w:type="spellStart"/>
-            <w:proofErr w:type="gramStart"/>
             <w:r>
-              <w:t>transactionId</w:t>
-            </w:r>
-            <w:proofErr w:type="spellEnd"/>
-            <w:proofErr w:type="gramEnd"/>
-            <w:r>
-              <w:t xml:space="preserve"> (</w:t>
-            </w:r>
-            <w:proofErr w:type="spellStart"/>
-            <w:r>
-              <w:t>Int</w:t>
-            </w:r>
-            <w:proofErr w:type="spellEnd"/>
-            <w:r>
-              <w:t xml:space="preserve">), </w:t>
-            </w:r>
-            <w:proofErr w:type="spellStart"/>
-            <w:r>
-              <w:t>currentDate</w:t>
-            </w:r>
-            <w:proofErr w:type="spellEnd"/>
-            <w:r>
-              <w:t xml:space="preserve"> (</w:t>
-            </w:r>
-            <w:proofErr w:type="spellStart"/>
-            <w:r>
-              <w:t>Date</w:t>
-            </w:r>
-            <w:proofErr w:type="spellEnd"/>
-            <w:r>
-              <w:t xml:space="preserve">) </w:t>
+              <w:t xml:space="preserve">userId (Int), bookId (Int) </w:t>
             </w:r>
           </w:p>
         </w:tc>
@@ -1252,23 +660,89 @@
             <w:hideMark/>
           </w:tcPr>
           <w:p>
-            <w:proofErr w:type="spellStart"/>
-            <w:proofErr w:type="gramStart"/>
             <w:r>
-              <w:t>penaltyAmount</w:t>
+              <w:t xml:space="preserve">Status </w:t>
             </w:r>
-            <w:proofErr w:type="spellEnd"/>
-            <w:proofErr w:type="gramEnd"/>
+          </w:p>
+        </w:tc>
+      </w:tr>
+      <w:tr>
+        <w:trPr>
+          <w:tblCellSpacing w:w="15" w:type="dxa"/>
+        </w:trPr>
+        <w:tc>
+          <w:tcPr>
+            <w:tcW w:w="0" w:type="auto"/>
+            <w:tcBorders>
+              <w:top w:val="single" w:sz="6" w:space="0" w:color="auto"/>
+              <w:left w:val="single" w:sz="6" w:space="0" w:color="auto"/>
+              <w:bottom w:val="single" w:sz="6" w:space="0" w:color="auto"/>
+              <w:right w:val="single" w:sz="6" w:space="0" w:color="auto"/>
+            </w:tcBorders>
+            <w:tcMar>
+              <w:top w:w="240" w:type="dxa"/>
+              <w:left w:w="0" w:type="dxa"/>
+              <w:bottom w:w="240" w:type="dxa"/>
+              <w:right w:w="180" w:type="dxa"/>
+            </w:tcMar>
+            <w:vAlign w:val="center"/>
+            <w:hideMark/>
+          </w:tcPr>
+          <w:p>
             <w:r>
-              <w:t xml:space="preserve"> (</w:t>
+              <w:rPr>
+                <w:b/>
+                <w:bCs/>
+              </w:rPr>
+              <w:t>calculatePenalty(id)</w:t>
             </w:r>
-            <w:proofErr w:type="spellStart"/>
+          </w:p>
+        </w:tc>
+        <w:tc>
+          <w:tcPr>
+            <w:tcW w:w="0" w:type="auto"/>
+            <w:tcBorders>
+              <w:top w:val="single" w:sz="6" w:space="0" w:color="auto"/>
+              <w:left w:val="single" w:sz="6" w:space="0" w:color="auto"/>
+              <w:bottom w:val="single" w:sz="6" w:space="0" w:color="auto"/>
+              <w:right w:val="single" w:sz="6" w:space="0" w:color="auto"/>
+            </w:tcBorders>
+            <w:tcMar>
+              <w:top w:w="240" w:type="dxa"/>
+              <w:left w:w="0" w:type="dxa"/>
+              <w:bottom w:w="240" w:type="dxa"/>
+              <w:right w:w="180" w:type="dxa"/>
+            </w:tcMar>
+            <w:vAlign w:val="center"/>
+            <w:hideMark/>
+          </w:tcPr>
+          <w:p>
             <w:r>
-              <w:t>Double</w:t>
+              <w:t xml:space="preserve">transactionId (Int), currentDate (Date) </w:t>
             </w:r>
-            <w:proofErr w:type="spellEnd"/>
+          </w:p>
+        </w:tc>
+        <w:tc>
+          <w:tcPr>
+            <w:tcW w:w="0" w:type="auto"/>
+            <w:tcBorders>
+              <w:top w:val="single" w:sz="6" w:space="0" w:color="auto"/>
+              <w:left w:val="single" w:sz="6" w:space="0" w:color="auto"/>
+              <w:bottom w:val="single" w:sz="6" w:space="0" w:color="auto"/>
+              <w:right w:val="single" w:sz="6" w:space="0" w:color="auto"/>
+            </w:tcBorders>
+            <w:tcMar>
+              <w:top w:w="240" w:type="dxa"/>
+              <w:left w:w="0" w:type="dxa"/>
+              <w:bottom w:w="240" w:type="dxa"/>
+              <w:right w:w="0" w:type="dxa"/>
+            </w:tcMar>
+            <w:vAlign w:val="center"/>
+            <w:hideMark/>
+          </w:tcPr>
+          <w:p>
             <w:r>
-              <w:t xml:space="preserve">) </w:t>
+              <w:t xml:space="preserve">penaltyAmount (Double) </w:t>
             </w:r>
           </w:p>
         </w:tc>
@@ -1284,134 +758,37 @@
         <w:t>Veri Yapıları:</w:t>
       </w:r>
       <w:r>
-        <w:t xml:space="preserve"> User (id, name, role), </w:t>
-      </w:r>
-      <w:proofErr w:type="spellStart"/>
-      <w:r>
-        <w:t>Book</w:t>
-      </w:r>
-      <w:proofErr w:type="spellEnd"/>
-      <w:r>
-        <w:t xml:space="preserve"> (id, </w:t>
-      </w:r>
-      <w:proofErr w:type="spellStart"/>
-      <w:r>
-        <w:t>title</w:t>
-      </w:r>
-      <w:proofErr w:type="spellEnd"/>
-      <w:r>
-        <w:t xml:space="preserve">, </w:t>
-      </w:r>
-      <w:proofErr w:type="spellStart"/>
-      <w:r>
-        <w:t>author</w:t>
-      </w:r>
-      <w:proofErr w:type="spellEnd"/>
-      <w:r>
-        <w:t xml:space="preserve">, </w:t>
-      </w:r>
-      <w:proofErr w:type="spellStart"/>
-      <w:r>
-        <w:t>stock</w:t>
-      </w:r>
-      <w:proofErr w:type="spellEnd"/>
-      <w:r>
-        <w:t xml:space="preserve">), </w:t>
-      </w:r>
-      <w:proofErr w:type="spellStart"/>
-      <w:r>
-        <w:t>Transaction</w:t>
-      </w:r>
-      <w:proofErr w:type="spellEnd"/>
-      <w:r>
-        <w:t xml:space="preserve"> (id, </w:t>
-      </w:r>
-      <w:proofErr w:type="spellStart"/>
-      <w:r>
-        <w:t>userId</w:t>
-      </w:r>
-      <w:proofErr w:type="spellEnd"/>
-      <w:r>
-        <w:t xml:space="preserve">, </w:t>
-      </w:r>
-      <w:proofErr w:type="spellStart"/>
-      <w:r>
-        <w:t>bookId</w:t>
-      </w:r>
-      <w:proofErr w:type="spellEnd"/>
-      <w:r>
-        <w:t xml:space="preserve">, </w:t>
-      </w:r>
-      <w:proofErr w:type="spellStart"/>
-      <w:r>
-        <w:t>dueDate</w:t>
-      </w:r>
-      <w:proofErr w:type="spellEnd"/>
-      <w:r>
-        <w:t>) sınıflarını içerir.</w:t>
-      </w:r>
-    </w:p>
-    <w:p>
-      <w:pPr>
-        <w:rPr>
-          <w:b/>
-          <w:bCs/>
-        </w:rPr>
-      </w:pPr>
-      <w:r>
-        <w:rPr>
-          <w:b/>
-          <w:bCs/>
-        </w:rPr>
-        <w:t xml:space="preserve">Projenin çalışır hale gelmesi için tasarlanması gereken </w:t>
-      </w:r>
-      <w:proofErr w:type="spellStart"/>
-      <w:r>
-        <w:rPr>
-          <w:b/>
-          <w:bCs/>
-        </w:rPr>
-        <w:t>minimun</w:t>
-      </w:r>
-      <w:proofErr w:type="spellEnd"/>
-      <w:r>
-        <w:rPr>
-          <w:b/>
-          <w:bCs/>
-        </w:rPr>
-        <w:t xml:space="preserve"> </w:t>
-      </w:r>
-      <w:proofErr w:type="spellStart"/>
-      <w:r>
-        <w:rPr>
-          <w:b/>
-          <w:bCs/>
-        </w:rPr>
-        <w:t>classlar</w:t>
-      </w:r>
-      <w:proofErr w:type="spellEnd"/>
-      <w:r>
-        <w:rPr>
-          <w:b/>
-          <w:bCs/>
-        </w:rPr>
-        <w:t xml:space="preserve">. İlk sprintte </w:t>
-      </w:r>
-      <w:proofErr w:type="spellStart"/>
-      <w:r>
-        <w:rPr>
-          <w:b/>
-          <w:bCs/>
-        </w:rPr>
-        <w:t>implement</w:t>
-      </w:r>
-      <w:proofErr w:type="spellEnd"/>
-      <w:r>
-        <w:rPr>
-          <w:b/>
-          <w:bCs/>
-        </w:rPr>
-        <w:t xml:space="preserve"> edilecekler.</w:t>
+        <w:t xml:space="preserve"> User (id, name, role), Book (id, title, author, stock), Transaction (id, userId, bookId, dueDate) sınıflarını içerir.</w:t>
+      </w:r>
+    </w:p>
+    <w:p>
+      <w:pPr>
+        <w:pStyle w:val="Balk2"/>
+      </w:pPr>
+      <w:r>
+        <w:t>UML Diagramları</w:t>
+      </w:r>
+    </w:p>
+    <w:p>
+      <w:pPr>
+        <w:rPr>
+          <w:b/>
+          <w:bCs/>
+        </w:rPr>
+      </w:pPr>
+      <w:r>
+        <w:rPr>
+          <w:b/>
+          <w:bCs/>
+        </w:rPr>
+        <w:t>Projenin çalışır hale gelmesi için tasarlanması gereken minimun classlar</w:t>
+      </w:r>
+      <w:r>
+        <w:rPr>
+          <w:b/>
+          <w:bCs/>
+        </w:rPr>
+        <w:t>. İlk sprintte implement edilecekler.</w:t>
       </w:r>
     </w:p>
     <w:p>
@@ -1423,9 +800,9 @@
           <w:noProof/>
         </w:rPr>
         <w:drawing>
-          <wp:inline distT="0" distB="0" distL="0" distR="0" wp14:anchorId="2893D354" wp14:editId="3B330927">
-            <wp:extent cx="6301984" cy="4667250"/>
-            <wp:effectExtent l="0" t="0" r="3810" b="0"/>
+          <wp:inline distT="0" distB="0" distL="0" distR="0" wp14:anchorId="2893D354" wp14:editId="031B5A43">
+            <wp:extent cx="5808338" cy="4301656"/>
+            <wp:effectExtent l="0" t="0" r="2540" b="3810"/>
             <wp:docPr id="2" name="Resim 2"/>
             <wp:cNvGraphicFramePr>
               <a:graphicFrameLocks xmlns:a="http://schemas.openxmlformats.org/drawingml/2006/main" noChangeAspect="1"/>
@@ -1455,7 +832,7 @@
                   <pic:spPr bwMode="auto">
                     <a:xfrm>
                       <a:off x="0" y="0"/>
-                      <a:ext cx="6341036" cy="4696172"/>
+                      <a:ext cx="5848569" cy="4331451"/>
                     </a:xfrm>
                     <a:prstGeom prst="rect">
                       <a:avLst/>
@@ -1499,6 +876,7 @@
         <w:rPr>
           <w:b/>
           <w:bCs/>
+          <w:noProof/>
         </w:rPr>
         <w:drawing>
           <wp:inline distT="0" distB="0" distL="0" distR="0" wp14:anchorId="1F45D97C" wp14:editId="132C8479">
@@ -1557,64 +935,32 @@
           <w:bCs/>
         </w:rPr>
       </w:pPr>
-    </w:p>
-    <w:p>
-      <w:pPr>
-        <w:rPr>
-          <w:b/>
-          <w:bCs/>
-        </w:rPr>
-      </w:pPr>
-      <w:r>
-        <w:rPr>
-          <w:b/>
-          <w:bCs/>
-        </w:rPr>
-        <w:t xml:space="preserve">Projenin süresince </w:t>
-      </w:r>
-      <w:proofErr w:type="spellStart"/>
-      <w:r>
-        <w:rPr>
-          <w:b/>
-          <w:bCs/>
-        </w:rPr>
-        <w:t>implement</w:t>
-      </w:r>
-      <w:proofErr w:type="spellEnd"/>
-      <w:r>
-        <w:rPr>
-          <w:b/>
-          <w:bCs/>
-        </w:rPr>
-        <w:t xml:space="preserve"> edilmesi hedeflenen Class </w:t>
-      </w:r>
-      <w:proofErr w:type="spellStart"/>
-      <w:r>
-        <w:rPr>
-          <w:b/>
-          <w:bCs/>
-        </w:rPr>
-        <w:t>Diagramı</w:t>
-      </w:r>
-      <w:proofErr w:type="spellEnd"/>
-    </w:p>
-    <w:p>
-      <w:pPr>
-        <w:rPr>
-          <w:b/>
-          <w:bCs/>
-        </w:rPr>
-      </w:pPr>
-      <w:r>
-        <w:rPr>
-          <w:b/>
-          <w:bCs/>
+      <w:r>
+        <w:rPr>
+          <w:b/>
+          <w:bCs/>
+        </w:rPr>
+        <w:t>Bir kitap ödünç alındığında stok sayısının diğer kullanıcılarda da güncellenmesi için eklenen sınıf yapısı</w:t>
+      </w:r>
+    </w:p>
+    <w:p>
+      <w:pPr>
+        <w:rPr>
+          <w:b/>
+          <w:bCs/>
+        </w:rPr>
+      </w:pPr>
+      <w:r>
+        <w:rPr>
+          <w:b/>
+          <w:bCs/>
+          <w:noProof/>
         </w:rPr>
         <w:drawing>
-          <wp:inline distT="0" distB="0" distL="0" distR="0" wp14:anchorId="64649F7A" wp14:editId="33CC779E">
-            <wp:extent cx="5760720" cy="2842260"/>
+          <wp:inline distT="0" distB="0" distL="0" distR="0" wp14:anchorId="5310EBB8" wp14:editId="731BEBE9">
+            <wp:extent cx="5760720" cy="2254885"/>
             <wp:effectExtent l="0" t="0" r="0" b="0"/>
-            <wp:docPr id="1" name="Resim 1"/>
+            <wp:docPr id="4" name="Resim 4"/>
             <wp:cNvGraphicFramePr>
               <a:graphicFrameLocks xmlns:a="http://schemas.openxmlformats.org/drawingml/2006/main" noChangeAspect="1"/>
             </wp:cNvGraphicFramePr>
@@ -1628,7 +974,7 @@
                     </pic:cNvPicPr>
                   </pic:nvPicPr>
                   <pic:blipFill>
-                    <a:blip r:embed="rId8" cstate="print">
+                    <a:blip r:embed="rId8">
                       <a:extLst>
                         <a:ext uri="{28A0092B-C50C-407E-A947-70E740481C1C}">
                           <a14:useLocalDpi xmlns:a14="http://schemas.microsoft.com/office/drawing/2010/main" val="0"/>
@@ -1643,7 +989,7 @@
                   <pic:spPr bwMode="auto">
                     <a:xfrm>
                       <a:off x="0" y="0"/>
-                      <a:ext cx="5760720" cy="2842260"/>
+                      <a:ext cx="5760720" cy="2254885"/>
                     </a:xfrm>
                     <a:prstGeom prst="rect">
                       <a:avLst/>
@@ -1669,7 +1015,516 @@
       </w:pPr>
     </w:p>
     <w:p>
-      <w:r>
+      <w:pPr>
+        <w:rPr>
+          <w:b/>
+          <w:bCs/>
+        </w:rPr>
+      </w:pPr>
+      <w:r>
+        <w:rPr>
+          <w:b/>
+          <w:bCs/>
+        </w:rPr>
+        <w:t>Projenin süresince implement edilmesi hedeflenen Class Diagramı</w:t>
+      </w:r>
+    </w:p>
+    <w:p>
+      <w:pPr>
+        <w:rPr>
+          <w:b/>
+          <w:bCs/>
+        </w:rPr>
+      </w:pPr>
+      <w:r>
+        <w:rPr>
+          <w:b/>
+          <w:bCs/>
+          <w:noProof/>
+        </w:rPr>
+        <w:drawing>
+          <wp:inline distT="0" distB="0" distL="0" distR="0" wp14:anchorId="1DB936E8" wp14:editId="466C8DA1">
+            <wp:extent cx="5760720" cy="3277870"/>
+            <wp:effectExtent l="0" t="0" r="0" b="0"/>
+            <wp:docPr id="5" name="Resim 5"/>
+            <wp:cNvGraphicFramePr>
+              <a:graphicFrameLocks xmlns:a="http://schemas.openxmlformats.org/drawingml/2006/main" noChangeAspect="1"/>
+            </wp:cNvGraphicFramePr>
+            <a:graphic xmlns:a="http://schemas.openxmlformats.org/drawingml/2006/main">
+              <a:graphicData uri="http://schemas.openxmlformats.org/drawingml/2006/picture">
+                <pic:pic xmlns:pic="http://schemas.openxmlformats.org/drawingml/2006/picture">
+                  <pic:nvPicPr>
+                    <pic:cNvPr id="0" name="Picture 3"/>
+                    <pic:cNvPicPr>
+                      <a:picLocks noChangeAspect="1" noChangeArrowheads="1"/>
+                    </pic:cNvPicPr>
+                  </pic:nvPicPr>
+                  <pic:blipFill>
+                    <a:blip r:embed="rId9" cstate="print">
+                      <a:extLst>
+                        <a:ext uri="{28A0092B-C50C-407E-A947-70E740481C1C}">
+                          <a14:useLocalDpi xmlns:a14="http://schemas.microsoft.com/office/drawing/2010/main" val="0"/>
+                        </a:ext>
+                      </a:extLst>
+                    </a:blip>
+                    <a:srcRect/>
+                    <a:stretch>
+                      <a:fillRect/>
+                    </a:stretch>
+                  </pic:blipFill>
+                  <pic:spPr bwMode="auto">
+                    <a:xfrm>
+                      <a:off x="0" y="0"/>
+                      <a:ext cx="5760720" cy="3277870"/>
+                    </a:xfrm>
+                    <a:prstGeom prst="rect">
+                      <a:avLst/>
+                    </a:prstGeom>
+                    <a:noFill/>
+                    <a:ln>
+                      <a:noFill/>
+                    </a:ln>
+                  </pic:spPr>
+                </pic:pic>
+              </a:graphicData>
+            </a:graphic>
+          </wp:inline>
+        </w:drawing>
+      </w:r>
+    </w:p>
+    <w:p>
+      <w:pPr>
+        <w:rPr>
+          <w:b/>
+          <w:bCs/>
+        </w:rPr>
+      </w:pPr>
+    </w:p>
+    <w:p>
+      <w:pPr>
+        <w:pStyle w:val="Balk2"/>
+      </w:pPr>
+      <w:r>
+        <w:lastRenderedPageBreak/>
+        <w:t>2 Problem ve Çözümleri</w:t>
+      </w:r>
+    </w:p>
+    <w:p>
+      <w:pPr>
+        <w:rPr>
+          <w:b/>
+          <w:bCs/>
+        </w:rPr>
+      </w:pPr>
+      <w:r>
+        <w:rPr>
+          <w:b/>
+          <w:bCs/>
+        </w:rPr>
+        <w:t>1. Çoklu ve Esnek Arama Altyapısı (Strategy Pattern)</w:t>
+      </w:r>
+    </w:p>
+    <w:p>
+      <w:r>
+        <w:rPr>
+          <w:b/>
+          <w:bCs/>
+        </w:rPr>
+        <w:t>Sorun:</w:t>
+      </w:r>
+      <w:r>
+        <w:t xml:space="preserve"> Sistemin ilk tasarımında, kitap arama işlevi doğrudan BookService sınıfının içine sıkı sıkıya bağl</w:t>
+      </w:r>
+      <w:r>
+        <w:t>ı</w:t>
+      </w:r>
+      <w:r>
+        <w:t xml:space="preserve"> bir şekilde kodlanmıştı. Kullanıcıların kitap adı, yazar adı veya kategori gibi farklı kriterlere göre arama yapma ihtiyacı doğduğunda, mevcut servisin içine sürekli yeni if</w:t>
+      </w:r>
+      <w:r>
+        <w:t xml:space="preserve"> </w:t>
+      </w:r>
+      <w:r>
+        <w:t>else blokları eklenmesi gerekiyordu. Bu durum, kod karmaşasına yol açarak sistemin bakımını ve yeni özellik eklenmesini zorlaştırıyordu.</w:t>
+      </w:r>
+    </w:p>
+    <w:p>
+      <w:r>
+        <w:rPr>
+          <w:b/>
+          <w:bCs/>
+        </w:rPr>
+        <w:t>Çözüm:</w:t>
+      </w:r>
+      <w:r>
+        <w:t xml:space="preserve"> Arama algoritmalarını birbirinden izole etmek ve ana iş mantığını kirletmemek amacıyla Strategy Pattern</w:t>
+      </w:r>
+      <w:r>
+        <w:t xml:space="preserve"> örüntüsü</w:t>
+      </w:r>
+      <w:r>
+        <w:t xml:space="preserve"> kullanılmıştır. Arama işlemi soyutlanarak bir arayüze bağlanmış, her bir arama türü bu arayüzü uygulayan bağımsız sınıflara bölünmüştür.</w:t>
+      </w:r>
+    </w:p>
+    <w:p>
+      <w:r>
+        <w:rPr>
+          <w:b/>
+          <w:bCs/>
+        </w:rPr>
+        <w:t>Mimarideki Yeri:</w:t>
+      </w:r>
+      <w:r>
+        <w:t xml:space="preserve"> Bu örüntü, İş Mantığı Katmanında (Service Layer) yer alır. Ana servis arama işleminin nasıl yapılacağıyla ilgilenmez, sadece doğru stratejiyi seçerek işi ilgili strateji sınıfına devreder.</w:t>
+      </w:r>
+    </w:p>
+    <w:p>
+      <w:r>
+        <w:rPr>
+          <w:b/>
+          <w:bCs/>
+        </w:rPr>
+        <w:t>UML Diyagramlarına Yansıması:</w:t>
+      </w:r>
+      <w:r>
+        <w:t xml:space="preserve">  Sınıf diyagramına ISearchStrategy adında yeni bir </w:t>
+      </w:r>
+      <w:r>
+        <w:t>i</w:t>
+      </w:r>
+      <w:r>
+        <w:t>nterface eklenmiştir.</w:t>
+      </w:r>
+    </w:p>
+    <w:p>
+      <w:pPr>
+        <w:numPr>
+          <w:ilvl w:val="0"/>
+          <w:numId w:val="3"/>
+        </w:numPr>
+      </w:pPr>
+      <w:r>
+        <w:t xml:space="preserve">TitleSearchStrategy, AuthorSearchStrategy gibi somut sınıfların bu arayüzü </w:t>
+      </w:r>
+      <w:r>
+        <w:t xml:space="preserve">implement ettiği </w:t>
+      </w:r>
+      <w:r>
+        <w:t>gösterilmiştir.</w:t>
+      </w:r>
+    </w:p>
+    <w:p>
+      <w:pPr>
+        <w:numPr>
+          <w:ilvl w:val="0"/>
+          <w:numId w:val="3"/>
+        </w:numPr>
+      </w:pPr>
+      <w:r>
+        <w:t>BookService sınıfı ile ISearchStrategy arasında bir Aggregation (Birleştirme/İçerme) ilişkisi kurularak, servisin stratejileri bir koleksiyon olarak içinde barındırdığı diyagrama işlenmiştir.</w:t>
+      </w:r>
+    </w:p>
+    <w:p>
+      <w:r>
+        <w:rPr>
+          <w:b/>
+          <w:bCs/>
+        </w:rPr>
+        <w:t>Tasarım Kararının Alınma Süreci:</w:t>
+      </w:r>
+      <w:r>
+        <w:t xml:space="preserve"> Yeni bir arama kriteri eklendiğinde, sistemde çalışan ve test edilmiş mevcut kodların bozulma riski yüksekti. Yazılım mühendisliğindeki Open/Closed Principle doğrultusunda, sistemin değişime kapalı ancak gelişime açık olması gerektiğine karar verilmiş ve Strategy örüntüsü bu ihtiyaca en uygun çözüm olarak seçilmiştir.</w:t>
+      </w:r>
+    </w:p>
+    <w:p>
+      <w:r>
+        <w:rPr>
+          <w:b/>
+          <w:bCs/>
+        </w:rPr>
+        <w:t>İlgili Kalite Faktörü ve Kriterleri:</w:t>
+      </w:r>
+    </w:p>
+    <w:p>
+      <w:pPr>
+        <w:numPr>
+          <w:ilvl w:val="0"/>
+          <w:numId w:val="4"/>
+        </w:numPr>
+      </w:pPr>
+      <w:r>
+        <w:rPr>
+          <w:b/>
+          <w:bCs/>
+        </w:rPr>
+        <w:t>Kalite Faktörü:</w:t>
+      </w:r>
+      <w:r>
+        <w:t xml:space="preserve"> Bakım Yapılabilirlik (Maintainability) ve Esneklik (Flexibility).</w:t>
+      </w:r>
+    </w:p>
+    <w:p>
+      <w:pPr>
+        <w:numPr>
+          <w:ilvl w:val="0"/>
+          <w:numId w:val="4"/>
+        </w:numPr>
+      </w:pPr>
+      <w:r>
+        <w:rPr>
+          <w:b/>
+          <w:bCs/>
+        </w:rPr>
+        <w:t>Kalite Kriteri:</w:t>
+      </w:r>
+      <w:r>
+        <w:t xml:space="preserve"> Genişletilebilirlik (Extensibility). Sisteme yeni arama algoritmalarının, mevcut kod tabanında (BookService) hiçbir değişiklik yapılmadan sadece yeni bir sınıf eklenerek entegre edilebilmesi hedeflenmiştir.</w:t>
+      </w:r>
+    </w:p>
+    <w:p>
+      <w:pPr>
+        <w:rPr>
+          <w:b/>
+          <w:bCs/>
+        </w:rPr>
+      </w:pPr>
+    </w:p>
+    <w:p>
+      <w:pPr>
+        <w:rPr>
+          <w:b/>
+          <w:bCs/>
+        </w:rPr>
+      </w:pPr>
+    </w:p>
+    <w:p>
+      <w:pPr>
+        <w:rPr>
+          <w:b/>
+          <w:bCs/>
+        </w:rPr>
+      </w:pPr>
+    </w:p>
+    <w:p>
+      <w:pPr>
+        <w:rPr>
+          <w:b/>
+          <w:bCs/>
+        </w:rPr>
+      </w:pPr>
+    </w:p>
+    <w:p>
+      <w:pPr>
+        <w:rPr>
+          <w:b/>
+          <w:bCs/>
+        </w:rPr>
+      </w:pPr>
+      <w:r>
+        <w:rPr>
+          <w:b/>
+          <w:bCs/>
+        </w:rPr>
+        <w:lastRenderedPageBreak/>
+        <w:t>2. Gerçek Zamanlı Arayüz Senkronizasyonu (Observer Pattern)</w:t>
+      </w:r>
+    </w:p>
+    <w:p>
+      <w:r>
+        <w:rPr>
+          <w:b/>
+          <w:bCs/>
+        </w:rPr>
+        <w:t>Sorun:</w:t>
+      </w:r>
+      <w:r>
+        <w:t xml:space="preserve"> Standart HTTP istek-cevap döngüsünde, bir kullanıcı bir kitabı ödünç aldığında stok azalmakta, ancak sistemi o an kullanan diğer kullanıcıların ekranlarındaki stok bilgisi sayfayı yenileyene kadar güncellenmemekteydi. Bu durum, tükenmiş bir kitabın diğer kullanıcılara hala alınabilir görünmesi sebebiyle veri tutarsızlığı</w:t>
+      </w:r>
+      <w:r>
+        <w:t xml:space="preserve"> sorunlarına neden oluyordu</w:t>
+      </w:r>
+      <w:r>
+        <w:t>.</w:t>
+      </w:r>
+    </w:p>
+    <w:p>
+      <w:r>
+        <w:rPr>
+          <w:b/>
+          <w:bCs/>
+        </w:rPr>
+        <w:t>Çözüm:</w:t>
+      </w:r>
+      <w:r>
+        <w:t xml:space="preserve"> Sisteme asenkron ve çift yönlü bir iletişim kanalı olan </w:t>
+      </w:r>
+      <w:r>
+        <w:rPr>
+          <w:b/>
+          <w:bCs/>
+        </w:rPr>
+        <w:t>WebSocket</w:t>
+      </w:r>
+      <w:r>
+        <w:t xml:space="preserve"> entegre edilmiştir. Mimari olarak </w:t>
+      </w:r>
+      <w:r>
+        <w:rPr>
+          <w:b/>
+          <w:bCs/>
+        </w:rPr>
+        <w:t>Observer</w:t>
+      </w:r>
+      <w:r>
+        <w:t xml:space="preserve"> tasarım örüntüsü kullanılmıştır. Kitap stoğu değiştiğinde sunucu bu olayı yayınlar</w:t>
+      </w:r>
+      <w:r>
+        <w:t xml:space="preserve">, </w:t>
+      </w:r>
+      <w:r>
+        <w:t>sayfada aktif olan tüm istemciler bu kanala abone oldukları için anında haberdar olup ekranlarını günceller.</w:t>
+      </w:r>
+    </w:p>
+    <w:p>
+      <w:r>
+        <w:rPr>
+          <w:b/>
+          <w:bCs/>
+        </w:rPr>
+        <w:t>Mimarideki Yeri:</w:t>
+      </w:r>
+      <w:r>
+        <w:t xml:space="preserve"> Bu yapı, Sunucu-İstemci iletişimi (Client-Server Communication) ile Konfigürasyon Katmanında (Configuration Layer) konumlandırılmıştır. İş mantığı katmanı (BorrowingService), Spring Framework'ün sunduğu aracı (Message Broker) mekanizmasını kullanarak yayıncı görevini üstlenir.</w:t>
+      </w:r>
+    </w:p>
+    <w:p>
+      <w:r>
+        <w:rPr>
+          <w:b/>
+          <w:bCs/>
+        </w:rPr>
+        <w:t>UML Diyagramlarına Yansıması:</w:t>
+      </w:r>
+      <w:r>
+        <w:t xml:space="preserve">  Sınıf diyagramına yapılandırma katmanı olarak WebSocketConfig sınıfı eklenmiştir.</w:t>
+      </w:r>
+    </w:p>
+    <w:p>
+      <w:pPr>
+        <w:numPr>
+          <w:ilvl w:val="0"/>
+          <w:numId w:val="5"/>
+        </w:numPr>
+      </w:pPr>
+      <w:r>
+        <w:t>Spring Boot'un anlık mesajlaşma aracı olan SimpMessagingTemplate bileşeni diyagrama dahil edilmiş ve BorrowingService ile arasında bağımlılık ilişkisi kurulmuştur.</w:t>
+      </w:r>
+    </w:p>
+    <w:p>
+      <w:r>
+        <w:rPr>
+          <w:b/>
+          <w:bCs/>
+        </w:rPr>
+        <w:t>Tasarım Kararının Alınma Süreci:</w:t>
+      </w:r>
+      <w:r>
+        <w:t xml:space="preserve"> Sorunu çözmek için istemcilerin belirli aralıklarla sunucuya </w:t>
+      </w:r>
+      <w:r>
+        <w:t xml:space="preserve">mesaj gönderdiği </w:t>
+      </w:r>
+      <w:r>
+        <w:t xml:space="preserve">Polling yöntemi değerlendirilmiş, ancak bu yöntemin sunucuyu gereksiz yoracağı ve ağ trafiğini artıracağı öngörülmüştür. Bunun yerine, olaya dayalı </w:t>
+      </w:r>
+      <w:r>
+        <w:t>E</w:t>
+      </w:r>
+      <w:r>
+        <w:t>vent-Driven mimarinin bir parçası olan Server-Push (Sunucudan itme) modeli olan WebSocket altyapısının kurulmasına karar verilmiştir.</w:t>
+      </w:r>
+    </w:p>
+    <w:p>
+      <w:r>
+        <w:rPr>
+          <w:b/>
+          <w:bCs/>
+        </w:rPr>
+        <w:t>İlgili Kalite Faktörü ve Kriterleri:</w:t>
+      </w:r>
+    </w:p>
+    <w:p>
+      <w:pPr>
+        <w:numPr>
+          <w:ilvl w:val="0"/>
+          <w:numId w:val="6"/>
+        </w:numPr>
+      </w:pPr>
+      <w:r>
+        <w:rPr>
+          <w:b/>
+          <w:bCs/>
+        </w:rPr>
+        <w:t>Kalite Faktörü:</w:t>
+      </w:r>
+      <w:r>
+        <w:t xml:space="preserve"> Performans ve Kullanıcı Deneyimi.</w:t>
+      </w:r>
+    </w:p>
+    <w:p>
+      <w:pPr>
+        <w:numPr>
+          <w:ilvl w:val="0"/>
+          <w:numId w:val="6"/>
+        </w:numPr>
+      </w:pPr>
+      <w:r>
+        <w:rPr>
+          <w:b/>
+          <w:bCs/>
+        </w:rPr>
+        <w:t>Kalite Kriteri:</w:t>
+      </w:r>
+      <w:r>
+        <w:t xml:space="preserve"> Duyarlılık (Responsiveness) ve Veri Tutarlılığı. Uygulamanın, sunucudaki bir durum değişikliğini gerçek zamanlı olarak tüm dağıtık istemcilere yansıtarak, tüm kullanıcıların aynı anda aynı doğru veriyi görmesi hedeflenmiştir.</w:t>
+      </w:r>
+    </w:p>
+    <w:p/>
+    <w:p>
+      <w:pPr>
+        <w:rPr>
+          <w:b/>
+          <w:bCs/>
+        </w:rPr>
+      </w:pPr>
+    </w:p>
+    <w:p>
+      <w:pPr>
+        <w:rPr>
+          <w:b/>
+          <w:bCs/>
+        </w:rPr>
+      </w:pPr>
+    </w:p>
+    <w:p>
+      <w:pPr>
+        <w:rPr>
+          <w:b/>
+          <w:bCs/>
+        </w:rPr>
+      </w:pPr>
+    </w:p>
+    <w:p>
+      <w:pPr>
+        <w:rPr>
+          <w:b/>
+          <w:bCs/>
+        </w:rPr>
+      </w:pPr>
+    </w:p>
+    <w:p>
+      <w:r>
+        <w:lastRenderedPageBreak/>
         <w:t>4. FONKSİYONLARIN ÇALIŞMA AKIŞI (SEQUENCE DIAGRAM)</w:t>
       </w:r>
     </w:p>
@@ -1685,65 +1540,17 @@
     </w:p>
     <w:p>
       <w:r>
-        <w:t xml:space="preserve">2. UI, </w:t>
-      </w:r>
-      <w:proofErr w:type="spellStart"/>
-      <w:r>
-        <w:t>BorrowService</w:t>
-      </w:r>
-      <w:proofErr w:type="spellEnd"/>
-      <w:r>
-        <w:t xml:space="preserve"> bileşenine </w:t>
-      </w:r>
-      <w:proofErr w:type="spellStart"/>
-      <w:r>
-        <w:t>bookId</w:t>
-      </w:r>
-      <w:proofErr w:type="spellEnd"/>
-      <w:r>
-        <w:t xml:space="preserve"> ve </w:t>
-      </w:r>
-      <w:proofErr w:type="spellStart"/>
-      <w:r>
-        <w:t>userId</w:t>
-      </w:r>
-      <w:proofErr w:type="spellEnd"/>
-      <w:r>
-        <w:t xml:space="preserve"> bilgilerini gönderir.</w:t>
-      </w:r>
-    </w:p>
-    <w:p>
-      <w:r>
-        <w:t xml:space="preserve">3. Service, </w:t>
-      </w:r>
-      <w:proofErr w:type="spellStart"/>
-      <w:r>
-        <w:t>BookRepository</w:t>
-      </w:r>
-      <w:proofErr w:type="spellEnd"/>
-      <w:r>
-        <w:t xml:space="preserve"> aracılığıyla MySQL'den kitabın stok durumunu kontrol eder.</w:t>
-      </w:r>
-    </w:p>
-    <w:p>
-      <w:r>
-        <w:t xml:space="preserve">4. Stok mevcutsa, </w:t>
-      </w:r>
-      <w:proofErr w:type="spellStart"/>
-      <w:r>
-        <w:t>veritabanında</w:t>
-      </w:r>
-      <w:proofErr w:type="spellEnd"/>
-      <w:r>
-        <w:t xml:space="preserve"> stok 1 azaltılır ve yeni bir </w:t>
-      </w:r>
-      <w:proofErr w:type="spellStart"/>
-      <w:r>
-        <w:t>Transaction</w:t>
-      </w:r>
-      <w:proofErr w:type="spellEnd"/>
-      <w:r>
-        <w:t xml:space="preserve"> kaydı oluşturulur.</w:t>
+        <w:t>2. UI, BorrowService bileşenine bookId ve userId bilgilerini gönderir.</w:t>
+      </w:r>
+    </w:p>
+    <w:p>
+      <w:r>
+        <w:t>3. Service, BookRepository aracılığıyla MySQL'den kitabın stok durumunu kontrol eder.</w:t>
+      </w:r>
+    </w:p>
+    <w:p>
+      <w:r>
+        <w:t>4. Stok mevcutsa, veritabanında stok 1 azaltılır ve yeni bir Transaction kaydı oluşturulur.</w:t>
       </w:r>
     </w:p>
     <w:p>
@@ -1759,23 +1566,7 @@
     </w:p>
     <w:p>
       <w:r>
-        <w:t>Proje, başlangıç aşamasında Tek Makine (</w:t>
-      </w:r>
-      <w:proofErr w:type="spellStart"/>
-      <w:r>
-        <w:t>Single</w:t>
-      </w:r>
-      <w:proofErr w:type="spellEnd"/>
-      <w:r>
-        <w:t xml:space="preserve"> </w:t>
-      </w:r>
-      <w:proofErr w:type="spellStart"/>
-      <w:r>
-        <w:t>Node</w:t>
-      </w:r>
-      <w:proofErr w:type="spellEnd"/>
-      <w:r>
-        <w:t>) mimarisiyle dağıtılacaktır.</w:t>
+        <w:t>Proje, başlangıç aşamasında Tek Makine (Single Node) mimarisiyle dağıtılacaktır.</w:t>
       </w:r>
     </w:p>
     <w:p>
@@ -1785,29 +1576,12 @@
     </w:p>
     <w:p>
       <w:r>
-        <w:lastRenderedPageBreak/>
-        <w:t xml:space="preserve">- Uygulama Sunucusu: Java Spring </w:t>
-      </w:r>
-      <w:proofErr w:type="spellStart"/>
-      <w:r>
-        <w:t>Boot</w:t>
-      </w:r>
-      <w:proofErr w:type="spellEnd"/>
-      <w:r>
-        <w:t xml:space="preserve"> uygulamasının çalıştığı JVM ortamı.</w:t>
-      </w:r>
-    </w:p>
-    <w:p>
-      <w:r>
-        <w:t xml:space="preserve">- </w:t>
-      </w:r>
-      <w:proofErr w:type="spellStart"/>
-      <w:r>
-        <w:t>Veritabanı</w:t>
-      </w:r>
-      <w:proofErr w:type="spellEnd"/>
-      <w:r>
-        <w:t xml:space="preserve"> Sunucusu: Aynı sunucu üzerinde barındırılan MySQL DB.</w:t>
+        <w:t>- Uygulama Sunucusu: Java Spring Boot uygulamasının çalıştığı JVM ortamı.</w:t>
+      </w:r>
+    </w:p>
+    <w:p>
+      <w:r>
+        <w:t>- Veritabanı Sunucusu: Aynı sunucu üzerinde barındırılan MySQL DB.</w:t>
       </w:r>
     </w:p>
     <w:p/>
@@ -2248,13 +2022,8 @@
             <w:hideMark/>
           </w:tcPr>
           <w:p>
-            <w:proofErr w:type="spellStart"/>
             <w:r>
-              <w:t>Sequence</w:t>
-            </w:r>
-            <w:proofErr w:type="spellEnd"/>
-            <w:r>
-              <w:t xml:space="preserve"> &amp; Deployment Diyagramları</w:t>
+              <w:t>Sequence &amp; Deployment Diyagramları</w:t>
             </w:r>
           </w:p>
         </w:tc>
@@ -2379,6 +2148,7 @@
           </w:tcPr>
           <w:p>
             <w:r>
+              <w:lastRenderedPageBreak/>
               <w:t>Arayüz ve Parametre Tanımlamaları</w:t>
             </w:r>
           </w:p>
@@ -2503,13 +2273,8 @@
             <w:hideMark/>
           </w:tcPr>
           <w:p>
-            <w:proofErr w:type="spellStart"/>
             <w:r>
-              <w:t>Döküman</w:t>
-            </w:r>
-            <w:proofErr w:type="spellEnd"/>
-            <w:r>
-              <w:t xml:space="preserve"> Formatlama ve Son Kontrol</w:t>
+              <w:t>Döküman Formatlama ve Son Kontrol</w:t>
             </w:r>
           </w:p>
         </w:tc>
@@ -2625,6 +2390,155 @@
 <file path=word/numbering.xml><?xml version="1.0" encoding="utf-8"?>
 <w:numbering xmlns:wpc="http://schemas.microsoft.com/office/word/2010/wordprocessingCanvas" xmlns:cx="http://schemas.microsoft.com/office/drawing/2014/chartex" xmlns:cx1="http://schemas.microsoft.com/office/drawing/2015/9/8/chartex" xmlns:cx2="http://schemas.microsoft.com/office/drawing/2015/10/21/chartex" xmlns:cx3="http://schemas.microsoft.com/office/drawing/2016/5/9/chartex" xmlns:cx4="http://schemas.microsoft.com/office/drawing/2016/5/10/chartex" xmlns:cx5="http://schemas.microsoft.com/office/drawing/2016/5/11/chartex" xmlns:cx6="http://schemas.microsoft.com/office/drawing/2016/5/12/chartex" xmlns:cx7="http://schemas.microsoft.com/office/drawing/2016/5/13/chartex" xmlns:cx8="http://schemas.microsoft.com/office/drawing/2016/5/14/chartex" xmlns:mc="http://schemas.openxmlformats.org/markup-compatibility/2006" xmlns:aink="http://schemas.microsoft.com/office/drawing/2016/ink" xmlns:am3d="http://schemas.microsoft.com/office/drawing/2017/model3d" xmlns:o="urn:schemas-microsoft-com:office:office" xmlns:oel="http://schemas.microsoft.com/office/2019/extlst" xmlns:r="http://schemas.openxmlformats.org/officeDocument/2006/relationships" xmlns:m="http://schemas.openxmlformats.org/officeDocument/2006/math" xmlns:v="urn:schemas-microsoft-com:vml" xmlns:wp14="http://schemas.microsoft.com/office/word/2010/wordprocessingDrawing" xmlns:wp="http://schemas.openxmlformats.org/drawingml/2006/wordprocessingDrawing" xmlns:w10="urn:schemas-microsoft-com:office:word" xmlns:w="http://schemas.openxmlformats.org/wordprocessingml/2006/main" xmlns:w14="http://schemas.microsoft.com/office/word/2010/wordml" xmlns:w15="http://schemas.microsoft.com/office/word/2012/wordml" xmlns:w16cex="http://schemas.microsoft.com/office/word/2018/wordml/cex" xmlns:w16cid="http://schemas.microsoft.com/office/word/2016/wordml/cid" xmlns:w16="http://schemas.microsoft.com/office/word/2018/wordml" xmlns:w16sdtdh="http://schemas.microsoft.com/office/word/2020/wordml/sdtdatahash" xmlns:w16se="http://schemas.microsoft.com/office/word/2015/wordml/symex" xmlns:wpg="http://schemas.microsoft.com/office/word/2010/wordprocessingGroup" xmlns:wpi="http://schemas.microsoft.com/office/word/2010/wordprocessingInk" xmlns:wne="http://schemas.microsoft.com/office/word/2006/wordml" xmlns:wps="http://schemas.microsoft.com/office/word/2010/wordprocessingShape" mc:Ignorable="w14 w15 w16se w16cid w16 w16cex w16sdtdh wp14">
   <w:abstractNum w:abstractNumId="0" w15:restartNumberingAfterBreak="0">
+    <w:nsid w:val="29B96624"/>
+    <w:multiLevelType w:val="multilevel"/>
+    <w:tmpl w:val="85242AE0"/>
+    <w:lvl w:ilvl="0">
+      <w:start w:val="1"/>
+      <w:numFmt w:val="bullet"/>
+      <w:lvlText w:val=""/>
+      <w:lvlJc w:val="left"/>
+      <w:pPr>
+        <w:tabs>
+          <w:tab w:val="num" w:pos="720"/>
+        </w:tabs>
+        <w:ind w:left="720" w:hanging="360"/>
+      </w:pPr>
+      <w:rPr>
+        <w:rFonts w:ascii="Symbol" w:hAnsi="Symbol" w:hint="default"/>
+        <w:sz w:val="20"/>
+      </w:rPr>
+    </w:lvl>
+    <w:lvl w:ilvl="1" w:tentative="1">
+      <w:start w:val="1"/>
+      <w:numFmt w:val="bullet"/>
+      <w:lvlText w:val="o"/>
+      <w:lvlJc w:val="left"/>
+      <w:pPr>
+        <w:tabs>
+          <w:tab w:val="num" w:pos="1440"/>
+        </w:tabs>
+        <w:ind w:left="1440" w:hanging="360"/>
+      </w:pPr>
+      <w:rPr>
+        <w:rFonts w:ascii="Courier New" w:hAnsi="Courier New" w:hint="default"/>
+        <w:sz w:val="20"/>
+      </w:rPr>
+    </w:lvl>
+    <w:lvl w:ilvl="2" w:tentative="1">
+      <w:start w:val="1"/>
+      <w:numFmt w:val="bullet"/>
+      <w:lvlText w:val=""/>
+      <w:lvlJc w:val="left"/>
+      <w:pPr>
+        <w:tabs>
+          <w:tab w:val="num" w:pos="2160"/>
+        </w:tabs>
+        <w:ind w:left="2160" w:hanging="360"/>
+      </w:pPr>
+      <w:rPr>
+        <w:rFonts w:ascii="Wingdings" w:hAnsi="Wingdings" w:hint="default"/>
+        <w:sz w:val="20"/>
+      </w:rPr>
+    </w:lvl>
+    <w:lvl w:ilvl="3" w:tentative="1">
+      <w:start w:val="1"/>
+      <w:numFmt w:val="bullet"/>
+      <w:lvlText w:val=""/>
+      <w:lvlJc w:val="left"/>
+      <w:pPr>
+        <w:tabs>
+          <w:tab w:val="num" w:pos="2880"/>
+        </w:tabs>
+        <w:ind w:left="2880" w:hanging="360"/>
+      </w:pPr>
+      <w:rPr>
+        <w:rFonts w:ascii="Wingdings" w:hAnsi="Wingdings" w:hint="default"/>
+        <w:sz w:val="20"/>
+      </w:rPr>
+    </w:lvl>
+    <w:lvl w:ilvl="4" w:tentative="1">
+      <w:start w:val="1"/>
+      <w:numFmt w:val="bullet"/>
+      <w:lvlText w:val=""/>
+      <w:lvlJc w:val="left"/>
+      <w:pPr>
+        <w:tabs>
+          <w:tab w:val="num" w:pos="3600"/>
+        </w:tabs>
+        <w:ind w:left="3600" w:hanging="360"/>
+      </w:pPr>
+      <w:rPr>
+        <w:rFonts w:ascii="Wingdings" w:hAnsi="Wingdings" w:hint="default"/>
+        <w:sz w:val="20"/>
+      </w:rPr>
+    </w:lvl>
+    <w:lvl w:ilvl="5" w:tentative="1">
+      <w:start w:val="1"/>
+      <w:numFmt w:val="bullet"/>
+      <w:lvlText w:val=""/>
+      <w:lvlJc w:val="left"/>
+      <w:pPr>
+        <w:tabs>
+          <w:tab w:val="num" w:pos="4320"/>
+        </w:tabs>
+        <w:ind w:left="4320" w:hanging="360"/>
+      </w:pPr>
+      <w:rPr>
+        <w:rFonts w:ascii="Wingdings" w:hAnsi="Wingdings" w:hint="default"/>
+        <w:sz w:val="20"/>
+      </w:rPr>
+    </w:lvl>
+    <w:lvl w:ilvl="6" w:tentative="1">
+      <w:start w:val="1"/>
+      <w:numFmt w:val="bullet"/>
+      <w:lvlText w:val=""/>
+      <w:lvlJc w:val="left"/>
+      <w:pPr>
+        <w:tabs>
+          <w:tab w:val="num" w:pos="5040"/>
+        </w:tabs>
+        <w:ind w:left="5040" w:hanging="360"/>
+      </w:pPr>
+      <w:rPr>
+        <w:rFonts w:ascii="Wingdings" w:hAnsi="Wingdings" w:hint="default"/>
+        <w:sz w:val="20"/>
+      </w:rPr>
+    </w:lvl>
+    <w:lvl w:ilvl="7" w:tentative="1">
+      <w:start w:val="1"/>
+      <w:numFmt w:val="bullet"/>
+      <w:lvlText w:val=""/>
+      <w:lvlJc w:val="left"/>
+      <w:pPr>
+        <w:tabs>
+          <w:tab w:val="num" w:pos="5760"/>
+        </w:tabs>
+        <w:ind w:left="5760" w:hanging="360"/>
+      </w:pPr>
+      <w:rPr>
+        <w:rFonts w:ascii="Wingdings" w:hAnsi="Wingdings" w:hint="default"/>
+        <w:sz w:val="20"/>
+      </w:rPr>
+    </w:lvl>
+    <w:lvl w:ilvl="8" w:tentative="1">
+      <w:start w:val="1"/>
+      <w:numFmt w:val="bullet"/>
+      <w:lvlText w:val=""/>
+      <w:lvlJc w:val="left"/>
+      <w:pPr>
+        <w:tabs>
+          <w:tab w:val="num" w:pos="6480"/>
+        </w:tabs>
+        <w:ind w:left="6480" w:hanging="360"/>
+      </w:pPr>
+      <w:rPr>
+        <w:rFonts w:ascii="Wingdings" w:hAnsi="Wingdings" w:hint="default"/>
+        <w:sz w:val="20"/>
+      </w:rPr>
+    </w:lvl>
+  </w:abstractNum>
+  <w:abstractNum w:abstractNumId="1" w15:restartNumberingAfterBreak="0">
     <w:nsid w:val="2BBA4CD2"/>
     <w:multiLevelType w:val="hybridMultilevel"/>
     <w:tmpl w:val="A6F0BF60"/>
@@ -2713,7 +2627,454 @@
       </w:pPr>
     </w:lvl>
   </w:abstractNum>
-  <w:abstractNum w:abstractNumId="1" w15:restartNumberingAfterBreak="0">
+  <w:abstractNum w:abstractNumId="2" w15:restartNumberingAfterBreak="0">
+    <w:nsid w:val="2FD53555"/>
+    <w:multiLevelType w:val="multilevel"/>
+    <w:tmpl w:val="7A602A0A"/>
+    <w:lvl w:ilvl="0">
+      <w:start w:val="1"/>
+      <w:numFmt w:val="bullet"/>
+      <w:lvlText w:val=""/>
+      <w:lvlJc w:val="left"/>
+      <w:pPr>
+        <w:tabs>
+          <w:tab w:val="num" w:pos="720"/>
+        </w:tabs>
+        <w:ind w:left="720" w:hanging="360"/>
+      </w:pPr>
+      <w:rPr>
+        <w:rFonts w:ascii="Symbol" w:hAnsi="Symbol" w:hint="default"/>
+        <w:sz w:val="20"/>
+      </w:rPr>
+    </w:lvl>
+    <w:lvl w:ilvl="1" w:tentative="1">
+      <w:start w:val="1"/>
+      <w:numFmt w:val="bullet"/>
+      <w:lvlText w:val="o"/>
+      <w:lvlJc w:val="left"/>
+      <w:pPr>
+        <w:tabs>
+          <w:tab w:val="num" w:pos="1440"/>
+        </w:tabs>
+        <w:ind w:left="1440" w:hanging="360"/>
+      </w:pPr>
+      <w:rPr>
+        <w:rFonts w:ascii="Courier New" w:hAnsi="Courier New" w:hint="default"/>
+        <w:sz w:val="20"/>
+      </w:rPr>
+    </w:lvl>
+    <w:lvl w:ilvl="2" w:tentative="1">
+      <w:start w:val="1"/>
+      <w:numFmt w:val="bullet"/>
+      <w:lvlText w:val=""/>
+      <w:lvlJc w:val="left"/>
+      <w:pPr>
+        <w:tabs>
+          <w:tab w:val="num" w:pos="2160"/>
+        </w:tabs>
+        <w:ind w:left="2160" w:hanging="360"/>
+      </w:pPr>
+      <w:rPr>
+        <w:rFonts w:ascii="Wingdings" w:hAnsi="Wingdings" w:hint="default"/>
+        <w:sz w:val="20"/>
+      </w:rPr>
+    </w:lvl>
+    <w:lvl w:ilvl="3" w:tentative="1">
+      <w:start w:val="1"/>
+      <w:numFmt w:val="bullet"/>
+      <w:lvlText w:val=""/>
+      <w:lvlJc w:val="left"/>
+      <w:pPr>
+        <w:tabs>
+          <w:tab w:val="num" w:pos="2880"/>
+        </w:tabs>
+        <w:ind w:left="2880" w:hanging="360"/>
+      </w:pPr>
+      <w:rPr>
+        <w:rFonts w:ascii="Wingdings" w:hAnsi="Wingdings" w:hint="default"/>
+        <w:sz w:val="20"/>
+      </w:rPr>
+    </w:lvl>
+    <w:lvl w:ilvl="4" w:tentative="1">
+      <w:start w:val="1"/>
+      <w:numFmt w:val="bullet"/>
+      <w:lvlText w:val=""/>
+      <w:lvlJc w:val="left"/>
+      <w:pPr>
+        <w:tabs>
+          <w:tab w:val="num" w:pos="3600"/>
+        </w:tabs>
+        <w:ind w:left="3600" w:hanging="360"/>
+      </w:pPr>
+      <w:rPr>
+        <w:rFonts w:ascii="Wingdings" w:hAnsi="Wingdings" w:hint="default"/>
+        <w:sz w:val="20"/>
+      </w:rPr>
+    </w:lvl>
+    <w:lvl w:ilvl="5" w:tentative="1">
+      <w:start w:val="1"/>
+      <w:numFmt w:val="bullet"/>
+      <w:lvlText w:val=""/>
+      <w:lvlJc w:val="left"/>
+      <w:pPr>
+        <w:tabs>
+          <w:tab w:val="num" w:pos="4320"/>
+        </w:tabs>
+        <w:ind w:left="4320" w:hanging="360"/>
+      </w:pPr>
+      <w:rPr>
+        <w:rFonts w:ascii="Wingdings" w:hAnsi="Wingdings" w:hint="default"/>
+        <w:sz w:val="20"/>
+      </w:rPr>
+    </w:lvl>
+    <w:lvl w:ilvl="6" w:tentative="1">
+      <w:start w:val="1"/>
+      <w:numFmt w:val="bullet"/>
+      <w:lvlText w:val=""/>
+      <w:lvlJc w:val="left"/>
+      <w:pPr>
+        <w:tabs>
+          <w:tab w:val="num" w:pos="5040"/>
+        </w:tabs>
+        <w:ind w:left="5040" w:hanging="360"/>
+      </w:pPr>
+      <w:rPr>
+        <w:rFonts w:ascii="Wingdings" w:hAnsi="Wingdings" w:hint="default"/>
+        <w:sz w:val="20"/>
+      </w:rPr>
+    </w:lvl>
+    <w:lvl w:ilvl="7" w:tentative="1">
+      <w:start w:val="1"/>
+      <w:numFmt w:val="bullet"/>
+      <w:lvlText w:val=""/>
+      <w:lvlJc w:val="left"/>
+      <w:pPr>
+        <w:tabs>
+          <w:tab w:val="num" w:pos="5760"/>
+        </w:tabs>
+        <w:ind w:left="5760" w:hanging="360"/>
+      </w:pPr>
+      <w:rPr>
+        <w:rFonts w:ascii="Wingdings" w:hAnsi="Wingdings" w:hint="default"/>
+        <w:sz w:val="20"/>
+      </w:rPr>
+    </w:lvl>
+    <w:lvl w:ilvl="8" w:tentative="1">
+      <w:start w:val="1"/>
+      <w:numFmt w:val="bullet"/>
+      <w:lvlText w:val=""/>
+      <w:lvlJc w:val="left"/>
+      <w:pPr>
+        <w:tabs>
+          <w:tab w:val="num" w:pos="6480"/>
+        </w:tabs>
+        <w:ind w:left="6480" w:hanging="360"/>
+      </w:pPr>
+      <w:rPr>
+        <w:rFonts w:ascii="Wingdings" w:hAnsi="Wingdings" w:hint="default"/>
+        <w:sz w:val="20"/>
+      </w:rPr>
+    </w:lvl>
+  </w:abstractNum>
+  <w:abstractNum w:abstractNumId="3" w15:restartNumberingAfterBreak="0">
+    <w:nsid w:val="3612139F"/>
+    <w:multiLevelType w:val="multilevel"/>
+    <w:tmpl w:val="FADEE2BC"/>
+    <w:lvl w:ilvl="0">
+      <w:start w:val="1"/>
+      <w:numFmt w:val="bullet"/>
+      <w:lvlText w:val=""/>
+      <w:lvlJc w:val="left"/>
+      <w:pPr>
+        <w:tabs>
+          <w:tab w:val="num" w:pos="720"/>
+        </w:tabs>
+        <w:ind w:left="720" w:hanging="360"/>
+      </w:pPr>
+      <w:rPr>
+        <w:rFonts w:ascii="Symbol" w:hAnsi="Symbol" w:hint="default"/>
+        <w:sz w:val="20"/>
+      </w:rPr>
+    </w:lvl>
+    <w:lvl w:ilvl="1" w:tentative="1">
+      <w:start w:val="1"/>
+      <w:numFmt w:val="bullet"/>
+      <w:lvlText w:val="o"/>
+      <w:lvlJc w:val="left"/>
+      <w:pPr>
+        <w:tabs>
+          <w:tab w:val="num" w:pos="1440"/>
+        </w:tabs>
+        <w:ind w:left="1440" w:hanging="360"/>
+      </w:pPr>
+      <w:rPr>
+        <w:rFonts w:ascii="Courier New" w:hAnsi="Courier New" w:hint="default"/>
+        <w:sz w:val="20"/>
+      </w:rPr>
+    </w:lvl>
+    <w:lvl w:ilvl="2" w:tentative="1">
+      <w:start w:val="1"/>
+      <w:numFmt w:val="bullet"/>
+      <w:lvlText w:val=""/>
+      <w:lvlJc w:val="left"/>
+      <w:pPr>
+        <w:tabs>
+          <w:tab w:val="num" w:pos="2160"/>
+        </w:tabs>
+        <w:ind w:left="2160" w:hanging="360"/>
+      </w:pPr>
+      <w:rPr>
+        <w:rFonts w:ascii="Wingdings" w:hAnsi="Wingdings" w:hint="default"/>
+        <w:sz w:val="20"/>
+      </w:rPr>
+    </w:lvl>
+    <w:lvl w:ilvl="3" w:tentative="1">
+      <w:start w:val="1"/>
+      <w:numFmt w:val="bullet"/>
+      <w:lvlText w:val=""/>
+      <w:lvlJc w:val="left"/>
+      <w:pPr>
+        <w:tabs>
+          <w:tab w:val="num" w:pos="2880"/>
+        </w:tabs>
+        <w:ind w:left="2880" w:hanging="360"/>
+      </w:pPr>
+      <w:rPr>
+        <w:rFonts w:ascii="Wingdings" w:hAnsi="Wingdings" w:hint="default"/>
+        <w:sz w:val="20"/>
+      </w:rPr>
+    </w:lvl>
+    <w:lvl w:ilvl="4" w:tentative="1">
+      <w:start w:val="1"/>
+      <w:numFmt w:val="bullet"/>
+      <w:lvlText w:val=""/>
+      <w:lvlJc w:val="left"/>
+      <w:pPr>
+        <w:tabs>
+          <w:tab w:val="num" w:pos="3600"/>
+        </w:tabs>
+        <w:ind w:left="3600" w:hanging="360"/>
+      </w:pPr>
+      <w:rPr>
+        <w:rFonts w:ascii="Wingdings" w:hAnsi="Wingdings" w:hint="default"/>
+        <w:sz w:val="20"/>
+      </w:rPr>
+    </w:lvl>
+    <w:lvl w:ilvl="5" w:tentative="1">
+      <w:start w:val="1"/>
+      <w:numFmt w:val="bullet"/>
+      <w:lvlText w:val=""/>
+      <w:lvlJc w:val="left"/>
+      <w:pPr>
+        <w:tabs>
+          <w:tab w:val="num" w:pos="4320"/>
+        </w:tabs>
+        <w:ind w:left="4320" w:hanging="360"/>
+      </w:pPr>
+      <w:rPr>
+        <w:rFonts w:ascii="Wingdings" w:hAnsi="Wingdings" w:hint="default"/>
+        <w:sz w:val="20"/>
+      </w:rPr>
+    </w:lvl>
+    <w:lvl w:ilvl="6" w:tentative="1">
+      <w:start w:val="1"/>
+      <w:numFmt w:val="bullet"/>
+      <w:lvlText w:val=""/>
+      <w:lvlJc w:val="left"/>
+      <w:pPr>
+        <w:tabs>
+          <w:tab w:val="num" w:pos="5040"/>
+        </w:tabs>
+        <w:ind w:left="5040" w:hanging="360"/>
+      </w:pPr>
+      <w:rPr>
+        <w:rFonts w:ascii="Wingdings" w:hAnsi="Wingdings" w:hint="default"/>
+        <w:sz w:val="20"/>
+      </w:rPr>
+    </w:lvl>
+    <w:lvl w:ilvl="7" w:tentative="1">
+      <w:start w:val="1"/>
+      <w:numFmt w:val="bullet"/>
+      <w:lvlText w:val=""/>
+      <w:lvlJc w:val="left"/>
+      <w:pPr>
+        <w:tabs>
+          <w:tab w:val="num" w:pos="5760"/>
+        </w:tabs>
+        <w:ind w:left="5760" w:hanging="360"/>
+      </w:pPr>
+      <w:rPr>
+        <w:rFonts w:ascii="Wingdings" w:hAnsi="Wingdings" w:hint="default"/>
+        <w:sz w:val="20"/>
+      </w:rPr>
+    </w:lvl>
+    <w:lvl w:ilvl="8" w:tentative="1">
+      <w:start w:val="1"/>
+      <w:numFmt w:val="bullet"/>
+      <w:lvlText w:val=""/>
+      <w:lvlJc w:val="left"/>
+      <w:pPr>
+        <w:tabs>
+          <w:tab w:val="num" w:pos="6480"/>
+        </w:tabs>
+        <w:ind w:left="6480" w:hanging="360"/>
+      </w:pPr>
+      <w:rPr>
+        <w:rFonts w:ascii="Wingdings" w:hAnsi="Wingdings" w:hint="default"/>
+        <w:sz w:val="20"/>
+      </w:rPr>
+    </w:lvl>
+  </w:abstractNum>
+  <w:abstractNum w:abstractNumId="4" w15:restartNumberingAfterBreak="0">
+    <w:nsid w:val="3DC90C53"/>
+    <w:multiLevelType w:val="multilevel"/>
+    <w:tmpl w:val="20ACBB52"/>
+    <w:lvl w:ilvl="0">
+      <w:start w:val="1"/>
+      <w:numFmt w:val="bullet"/>
+      <w:lvlText w:val=""/>
+      <w:lvlJc w:val="left"/>
+      <w:pPr>
+        <w:tabs>
+          <w:tab w:val="num" w:pos="720"/>
+        </w:tabs>
+        <w:ind w:left="720" w:hanging="360"/>
+      </w:pPr>
+      <w:rPr>
+        <w:rFonts w:ascii="Symbol" w:hAnsi="Symbol" w:hint="default"/>
+        <w:sz w:val="20"/>
+      </w:rPr>
+    </w:lvl>
+    <w:lvl w:ilvl="1" w:tentative="1">
+      <w:start w:val="1"/>
+      <w:numFmt w:val="bullet"/>
+      <w:lvlText w:val="o"/>
+      <w:lvlJc w:val="left"/>
+      <w:pPr>
+        <w:tabs>
+          <w:tab w:val="num" w:pos="1440"/>
+        </w:tabs>
+        <w:ind w:left="1440" w:hanging="360"/>
+      </w:pPr>
+      <w:rPr>
+        <w:rFonts w:ascii="Courier New" w:hAnsi="Courier New" w:hint="default"/>
+        <w:sz w:val="20"/>
+      </w:rPr>
+    </w:lvl>
+    <w:lvl w:ilvl="2" w:tentative="1">
+      <w:start w:val="1"/>
+      <w:numFmt w:val="bullet"/>
+      <w:lvlText w:val=""/>
+      <w:lvlJc w:val="left"/>
+      <w:pPr>
+        <w:tabs>
+          <w:tab w:val="num" w:pos="2160"/>
+        </w:tabs>
+        <w:ind w:left="2160" w:hanging="360"/>
+      </w:pPr>
+      <w:rPr>
+        <w:rFonts w:ascii="Wingdings" w:hAnsi="Wingdings" w:hint="default"/>
+        <w:sz w:val="20"/>
+      </w:rPr>
+    </w:lvl>
+    <w:lvl w:ilvl="3" w:tentative="1">
+      <w:start w:val="1"/>
+      <w:numFmt w:val="bullet"/>
+      <w:lvlText w:val=""/>
+      <w:lvlJc w:val="left"/>
+      <w:pPr>
+        <w:tabs>
+          <w:tab w:val="num" w:pos="2880"/>
+        </w:tabs>
+        <w:ind w:left="2880" w:hanging="360"/>
+      </w:pPr>
+      <w:rPr>
+        <w:rFonts w:ascii="Wingdings" w:hAnsi="Wingdings" w:hint="default"/>
+        <w:sz w:val="20"/>
+      </w:rPr>
+    </w:lvl>
+    <w:lvl w:ilvl="4" w:tentative="1">
+      <w:start w:val="1"/>
+      <w:numFmt w:val="bullet"/>
+      <w:lvlText w:val=""/>
+      <w:lvlJc w:val="left"/>
+      <w:pPr>
+        <w:tabs>
+          <w:tab w:val="num" w:pos="3600"/>
+        </w:tabs>
+        <w:ind w:left="3600" w:hanging="360"/>
+      </w:pPr>
+      <w:rPr>
+        <w:rFonts w:ascii="Wingdings" w:hAnsi="Wingdings" w:hint="default"/>
+        <w:sz w:val="20"/>
+      </w:rPr>
+    </w:lvl>
+    <w:lvl w:ilvl="5" w:tentative="1">
+      <w:start w:val="1"/>
+      <w:numFmt w:val="bullet"/>
+      <w:lvlText w:val=""/>
+      <w:lvlJc w:val="left"/>
+      <w:pPr>
+        <w:tabs>
+          <w:tab w:val="num" w:pos="4320"/>
+        </w:tabs>
+        <w:ind w:left="4320" w:hanging="360"/>
+      </w:pPr>
+      <w:rPr>
+        <w:rFonts w:ascii="Wingdings" w:hAnsi="Wingdings" w:hint="default"/>
+        <w:sz w:val="20"/>
+      </w:rPr>
+    </w:lvl>
+    <w:lvl w:ilvl="6" w:tentative="1">
+      <w:start w:val="1"/>
+      <w:numFmt w:val="bullet"/>
+      <w:lvlText w:val=""/>
+      <w:lvlJc w:val="left"/>
+      <w:pPr>
+        <w:tabs>
+          <w:tab w:val="num" w:pos="5040"/>
+        </w:tabs>
+        <w:ind w:left="5040" w:hanging="360"/>
+      </w:pPr>
+      <w:rPr>
+        <w:rFonts w:ascii="Wingdings" w:hAnsi="Wingdings" w:hint="default"/>
+        <w:sz w:val="20"/>
+      </w:rPr>
+    </w:lvl>
+    <w:lvl w:ilvl="7" w:tentative="1">
+      <w:start w:val="1"/>
+      <w:numFmt w:val="bullet"/>
+      <w:lvlText w:val=""/>
+      <w:lvlJc w:val="left"/>
+      <w:pPr>
+        <w:tabs>
+          <w:tab w:val="num" w:pos="5760"/>
+        </w:tabs>
+        <w:ind w:left="5760" w:hanging="360"/>
+      </w:pPr>
+      <w:rPr>
+        <w:rFonts w:ascii="Wingdings" w:hAnsi="Wingdings" w:hint="default"/>
+        <w:sz w:val="20"/>
+      </w:rPr>
+    </w:lvl>
+    <w:lvl w:ilvl="8" w:tentative="1">
+      <w:start w:val="1"/>
+      <w:numFmt w:val="bullet"/>
+      <w:lvlText w:val=""/>
+      <w:lvlJc w:val="left"/>
+      <w:pPr>
+        <w:tabs>
+          <w:tab w:val="num" w:pos="6480"/>
+        </w:tabs>
+        <w:ind w:left="6480" w:hanging="360"/>
+      </w:pPr>
+      <w:rPr>
+        <w:rFonts w:ascii="Wingdings" w:hAnsi="Wingdings" w:hint="default"/>
+        <w:sz w:val="20"/>
+      </w:rPr>
+    </w:lvl>
+  </w:abstractNum>
+  <w:abstractNum w:abstractNumId="5" w15:restartNumberingAfterBreak="0">
     <w:nsid w:val="7A7D6DCD"/>
     <w:multiLevelType w:val="hybridMultilevel"/>
     <w:tmpl w:val="1F963E02"/>
@@ -2827,10 +3188,22 @@
     </w:lvl>
   </w:abstractNum>
   <w:num w:numId="1" w16cid:durableId="517352090">
+    <w:abstractNumId w:val="1"/>
+  </w:num>
+  <w:num w:numId="2" w16cid:durableId="54554240">
+    <w:abstractNumId w:val="5"/>
+  </w:num>
+  <w:num w:numId="3" w16cid:durableId="1644777828">
+    <w:abstractNumId w:val="3"/>
+  </w:num>
+  <w:num w:numId="4" w16cid:durableId="776601701">
     <w:abstractNumId w:val="0"/>
   </w:num>
-  <w:num w:numId="2" w16cid:durableId="54554240">
-    <w:abstractNumId w:val="1"/>
+  <w:num w:numId="5" w16cid:durableId="578635839">
+    <w:abstractNumId w:val="2"/>
+  </w:num>
+  <w:num w:numId="6" w16cid:durableId="1745029214">
+    <w:abstractNumId w:val="4"/>
   </w:num>
 </w:numbering>
 </file>
@@ -3263,7 +3636,6 @@
     <w:next w:val="Normal"/>
     <w:link w:val="Balk2Char"/>
     <w:uiPriority w:val="9"/>
-    <w:semiHidden/>
     <w:unhideWhenUsed/>
     <w:qFormat/>
     <w:rsid w:val="00AC095C"/>
@@ -3438,6 +3810,7 @@
   <w:style w:type="character" w:default="1" w:styleId="VarsaylanParagrafYazTipi">
     <w:name w:val="Default Paragraph Font"/>
     <w:uiPriority w:val="1"/>
+    <w:semiHidden/>
     <w:unhideWhenUsed/>
   </w:style>
   <w:style w:type="table" w:default="1" w:styleId="NormalTablo">
@@ -3479,7 +3852,6 @@
     <w:basedOn w:val="VarsaylanParagrafYazTipi"/>
     <w:link w:val="Balk2"/>
     <w:uiPriority w:val="9"/>
-    <w:semiHidden/>
     <w:rsid w:val="00AC095C"/>
     <w:rPr>
       <w:rFonts w:asciiTheme="majorHAnsi" w:eastAsiaTheme="majorEastAsia" w:hAnsiTheme="majorHAnsi" w:cstheme="majorBidi"/>

</xml_diff>